<commit_message>
User guide (phase 5): final Word build (36 pp), figures recut from final screenshots; keep full live screenshot set (thesis references it)
Co-Authored-By: Claude Fable 5.1 <noreply@anthropic.com>
Claude-Session: https://claude.ai/code/session_01Y5Ccgz17Pq2brpK5TTSYa7
</commit_message>
<xml_diff>
--- a/deliverables/05-user-guide/دليل-المستخدم-والواجهات.docx
+++ b/deliverables/05-user-guide/دليل-المستخدم-والواجهات.docx
@@ -378,7 +378,7 @@
             </w:rPr>
             <w:fldChar w:fldCharType="separate"/>
           </w:r>
-          <w:hyperlink w:anchor="__RefHeading___Toc2437_636782372">
+          <w:hyperlink w:anchor="__RefHeading___Toc2434_5898764">
             <w:r>
               <w:rPr>
                 <w:webHidden/>
@@ -424,7 +424,7 @@
             </w:tabs>
             <w:rPr/>
           </w:pPr>
-          <w:hyperlink w:anchor="__RefHeading___Toc2439_636782372">
+          <w:hyperlink w:anchor="__RefHeading___Toc2436_5898764">
             <w:r>
               <w:rPr>
                 <w:webHidden/>
@@ -470,7 +470,7 @@
             </w:tabs>
             <w:rPr/>
           </w:pPr>
-          <w:hyperlink w:anchor="__RefHeading___Toc2441_636782372">
+          <w:hyperlink w:anchor="__RefHeading___Toc2438_5898764">
             <w:r>
               <w:rPr>
                 <w:webHidden/>
@@ -516,7 +516,7 @@
             </w:tabs>
             <w:rPr/>
           </w:pPr>
-          <w:hyperlink w:anchor="__RefHeading___Toc2443_636782372">
+          <w:hyperlink w:anchor="__RefHeading___Toc2440_5898764">
             <w:r>
               <w:rPr>
                 <w:webHidden/>
@@ -562,7 +562,7 @@
             </w:tabs>
             <w:rPr/>
           </w:pPr>
-          <w:hyperlink w:anchor="__RefHeading___Toc2445_636782372">
+          <w:hyperlink w:anchor="__RefHeading___Toc2442_5898764">
             <w:r>
               <w:rPr>
                 <w:webHidden/>
@@ -623,7 +623,7 @@
             </w:tabs>
             <w:rPr/>
           </w:pPr>
-          <w:hyperlink w:anchor="__RefHeading___Toc2447_636782372">
+          <w:hyperlink w:anchor="__RefHeading___Toc2444_5898764">
             <w:r>
               <w:rPr>
                 <w:webHidden/>
@@ -669,7 +669,7 @@
             </w:tabs>
             <w:rPr/>
           </w:pPr>
-          <w:hyperlink w:anchor="__RefHeading___Toc2449_636782372">
+          <w:hyperlink w:anchor="__RefHeading___Toc2446_5898764">
             <w:r>
               <w:rPr>
                 <w:webHidden/>
@@ -715,7 +715,7 @@
             </w:tabs>
             <w:rPr/>
           </w:pPr>
-          <w:hyperlink w:anchor="__RefHeading___Toc2451_636782372">
+          <w:hyperlink w:anchor="__RefHeading___Toc2448_5898764">
             <w:r>
               <w:rPr>
                 <w:webHidden/>
@@ -761,7 +761,7 @@
             </w:tabs>
             <w:rPr/>
           </w:pPr>
-          <w:hyperlink w:anchor="__RefHeading___Toc2453_636782372">
+          <w:hyperlink w:anchor="__RefHeading___Toc2450_5898764">
             <w:r>
               <w:rPr>
                 <w:webHidden/>
@@ -822,7 +822,7 @@
             </w:tabs>
             <w:rPr/>
           </w:pPr>
-          <w:hyperlink w:anchor="__RefHeading___Toc2455_636782372">
+          <w:hyperlink w:anchor="__RefHeading___Toc2452_5898764">
             <w:r>
               <w:rPr>
                 <w:webHidden/>
@@ -868,7 +868,7 @@
             </w:tabs>
             <w:rPr/>
           </w:pPr>
-          <w:hyperlink w:anchor="__RefHeading___Toc2457_636782372">
+          <w:hyperlink w:anchor="__RefHeading___Toc2454_5898764">
             <w:r>
               <w:rPr>
                 <w:webHidden/>
@@ -914,7 +914,7 @@
             </w:tabs>
             <w:rPr/>
           </w:pPr>
-          <w:hyperlink w:anchor="__RefHeading___Toc2459_636782372">
+          <w:hyperlink w:anchor="__RefHeading___Toc2456_5898764">
             <w:r>
               <w:rPr>
                 <w:webHidden/>
@@ -960,7 +960,7 @@
             </w:tabs>
             <w:rPr/>
           </w:pPr>
-          <w:hyperlink w:anchor="__RefHeading___Toc2461_636782372">
+          <w:hyperlink w:anchor="__RefHeading___Toc2458_5898764">
             <w:r>
               <w:rPr>
                 <w:webHidden/>
@@ -1006,7 +1006,7 @@
             </w:tabs>
             <w:rPr/>
           </w:pPr>
-          <w:hyperlink w:anchor="__RefHeading___Toc2463_636782372">
+          <w:hyperlink w:anchor="__RefHeading___Toc2460_5898764">
             <w:r>
               <w:rPr>
                 <w:webHidden/>
@@ -1052,7 +1052,7 @@
             </w:tabs>
             <w:rPr/>
           </w:pPr>
-          <w:hyperlink w:anchor="__RefHeading___Toc2465_636782372">
+          <w:hyperlink w:anchor="__RefHeading___Toc2462_5898764">
             <w:r>
               <w:rPr>
                 <w:webHidden/>
@@ -1098,7 +1098,7 @@
             </w:tabs>
             <w:rPr/>
           </w:pPr>
-          <w:hyperlink w:anchor="__RefHeading___Toc2467_636782372">
+          <w:hyperlink w:anchor="__RefHeading___Toc2464_5898764">
             <w:r>
               <w:rPr>
                 <w:webHidden/>
@@ -1144,7 +1144,7 @@
             </w:tabs>
             <w:rPr/>
           </w:pPr>
-          <w:hyperlink w:anchor="__RefHeading___Toc2469_636782372">
+          <w:hyperlink w:anchor="__RefHeading___Toc2466_5898764">
             <w:r>
               <w:rPr>
                 <w:webHidden/>
@@ -1205,7 +1205,7 @@
             </w:tabs>
             <w:rPr/>
           </w:pPr>
-          <w:hyperlink w:anchor="__RefHeading___Toc2471_636782372">
+          <w:hyperlink w:anchor="__RefHeading___Toc2468_5898764">
             <w:r>
               <w:rPr>
                 <w:webHidden/>
@@ -1266,7 +1266,7 @@
             </w:tabs>
             <w:rPr/>
           </w:pPr>
-          <w:hyperlink w:anchor="__RefHeading___Toc2473_636782372">
+          <w:hyperlink w:anchor="__RefHeading___Toc2470_5898764">
             <w:r>
               <w:rPr>
                 <w:webHidden/>
@@ -1327,7 +1327,7 @@
             </w:tabs>
             <w:rPr/>
           </w:pPr>
-          <w:hyperlink w:anchor="__RefHeading___Toc2475_636782372">
+          <w:hyperlink w:anchor="__RefHeading___Toc2472_5898764">
             <w:r>
               <w:rPr>
                 <w:webHidden/>
@@ -1388,7 +1388,7 @@
             </w:tabs>
             <w:rPr/>
           </w:pPr>
-          <w:hyperlink w:anchor="__RefHeading___Toc2477_636782372">
+          <w:hyperlink w:anchor="__RefHeading___Toc2474_5898764">
             <w:r>
               <w:rPr>
                 <w:webHidden/>
@@ -1454,7 +1454,7 @@
             </w:tabs>
             <w:rPr/>
           </w:pPr>
-          <w:hyperlink w:anchor="__RefHeading___Toc2479_636782372">
+          <w:hyperlink w:anchor="__RefHeading___Toc2476_5898764">
             <w:r>
               <w:rPr>
                 <w:webHidden/>
@@ -1500,7 +1500,7 @@
             </w:tabs>
             <w:rPr/>
           </w:pPr>
-          <w:hyperlink w:anchor="__RefHeading___Toc2481_636782372">
+          <w:hyperlink w:anchor="__RefHeading___Toc2478_5898764">
             <w:r>
               <w:rPr>
                 <w:webHidden/>
@@ -1561,7 +1561,7 @@
             </w:tabs>
             <w:rPr/>
           </w:pPr>
-          <w:hyperlink w:anchor="__RefHeading___Toc2483_636782372">
+          <w:hyperlink w:anchor="__RefHeading___Toc2480_5898764">
             <w:r>
               <w:rPr>
                 <w:webHidden/>
@@ -1607,7 +1607,7 @@
             </w:tabs>
             <w:rPr/>
           </w:pPr>
-          <w:hyperlink w:anchor="__RefHeading___Toc2485_636782372">
+          <w:hyperlink w:anchor="__RefHeading___Toc2482_5898764">
             <w:r>
               <w:rPr>
                 <w:webHidden/>
@@ -1653,7 +1653,7 @@
             </w:tabs>
             <w:rPr/>
           </w:pPr>
-          <w:hyperlink w:anchor="__RefHeading___Toc2487_636782372">
+          <w:hyperlink w:anchor="__RefHeading___Toc2484_5898764">
             <w:r>
               <w:rPr>
                 <w:webHidden/>
@@ -1705,7 +1705,7 @@
             </w:tabs>
             <w:rPr/>
           </w:pPr>
-          <w:hyperlink w:anchor="__RefHeading___Toc2489_636782372">
+          <w:hyperlink w:anchor="__RefHeading___Toc2486_5898764">
             <w:r>
               <w:rPr>
                 <w:webHidden/>
@@ -1751,7 +1751,7 @@
             </w:tabs>
             <w:rPr/>
           </w:pPr>
-          <w:hyperlink w:anchor="__RefHeading___Toc2491_636782372">
+          <w:hyperlink w:anchor="__RefHeading___Toc2488_5898764">
             <w:r>
               <w:rPr>
                 <w:webHidden/>
@@ -1797,7 +1797,7 @@
             </w:tabs>
             <w:rPr/>
           </w:pPr>
-          <w:hyperlink w:anchor="__RefHeading___Toc2493_636782372">
+          <w:hyperlink w:anchor="__RefHeading___Toc2490_5898764">
             <w:r>
               <w:rPr>
                 <w:webHidden/>
@@ -1843,7 +1843,7 @@
             </w:tabs>
             <w:rPr/>
           </w:pPr>
-          <w:hyperlink w:anchor="__RefHeading___Toc2495_636782372">
+          <w:hyperlink w:anchor="__RefHeading___Toc2492_5898764">
             <w:r>
               <w:rPr>
                 <w:webHidden/>
@@ -1889,7 +1889,7 @@
             </w:tabs>
             <w:rPr/>
           </w:pPr>
-          <w:hyperlink w:anchor="__RefHeading___Toc2497_636782372">
+          <w:hyperlink w:anchor="__RefHeading___Toc2494_5898764">
             <w:r>
               <w:rPr>
                 <w:webHidden/>
@@ -1935,7 +1935,7 @@
             </w:tabs>
             <w:rPr/>
           </w:pPr>
-          <w:hyperlink w:anchor="__RefHeading___Toc2499_636782372">
+          <w:hyperlink w:anchor="__RefHeading___Toc2496_5898764">
             <w:r>
               <w:rPr>
                 <w:webHidden/>
@@ -1981,7 +1981,7 @@
             </w:tabs>
             <w:rPr/>
           </w:pPr>
-          <w:hyperlink w:anchor="__RefHeading___Toc2501_636782372">
+          <w:hyperlink w:anchor="__RefHeading___Toc2498_5898764">
             <w:r>
               <w:rPr>
                 <w:webHidden/>
@@ -2027,7 +2027,7 @@
             </w:tabs>
             <w:rPr/>
           </w:pPr>
-          <w:hyperlink w:anchor="__RefHeading___Toc2503_636782372">
+          <w:hyperlink w:anchor="__RefHeading___Toc2500_5898764">
             <w:r>
               <w:rPr>
                 <w:webHidden/>
@@ -2073,7 +2073,7 @@
             </w:tabs>
             <w:rPr/>
           </w:pPr>
-          <w:hyperlink w:anchor="__RefHeading___Toc2505_636782372">
+          <w:hyperlink w:anchor="__RefHeading___Toc2502_5898764">
             <w:r>
               <w:rPr>
                 <w:webHidden/>
@@ -2119,7 +2119,7 @@
             </w:tabs>
             <w:rPr/>
           </w:pPr>
-          <w:hyperlink w:anchor="__RefHeading___Toc2507_636782372">
+          <w:hyperlink w:anchor="__RefHeading___Toc2504_5898764">
             <w:r>
               <w:rPr>
                 <w:webHidden/>
@@ -2179,7 +2179,7 @@
             </w:tabs>
             <w:rPr/>
           </w:pPr>
-          <w:hyperlink w:anchor="__RefHeading___Toc2509_636782372">
+          <w:hyperlink w:anchor="__RefHeading___Toc2506_5898764">
             <w:r>
               <w:rPr>
                 <w:webHidden/>
@@ -2225,7 +2225,7 @@
             </w:tabs>
             <w:rPr/>
           </w:pPr>
-          <w:hyperlink w:anchor="__RefHeading___Toc2511_636782372">
+          <w:hyperlink w:anchor="__RefHeading___Toc2508_5898764">
             <w:r>
               <w:rPr>
                 <w:webHidden/>
@@ -2271,7 +2271,7 @@
             </w:tabs>
             <w:rPr/>
           </w:pPr>
-          <w:hyperlink w:anchor="__RefHeading___Toc2513_636782372">
+          <w:hyperlink w:anchor="__RefHeading___Toc2510_5898764">
             <w:r>
               <w:rPr>
                 <w:webHidden/>
@@ -2317,7 +2317,7 @@
             </w:tabs>
             <w:rPr/>
           </w:pPr>
-          <w:hyperlink w:anchor="__RefHeading___Toc2515_636782372">
+          <w:hyperlink w:anchor="__RefHeading___Toc2512_5898764">
             <w:r>
               <w:rPr>
                 <w:webHidden/>
@@ -2378,7 +2378,7 @@
             </w:tabs>
             <w:rPr/>
           </w:pPr>
-          <w:hyperlink w:anchor="__RefHeading___Toc2517_636782372">
+          <w:hyperlink w:anchor="__RefHeading___Toc2514_5898764">
             <w:r>
               <w:rPr>
                 <w:webHidden/>
@@ -2411,7 +2411,7 @@
               <w:rPr>
                 <w:rStyle w:val="IndexLink"/>
               </w:rPr>
-              <w:t>34</w:t>
+              <w:t>33</w:t>
             </w:r>
           </w:hyperlink>
         </w:p>
@@ -2424,7 +2424,7 @@
             </w:tabs>
             <w:rPr/>
           </w:pPr>
-          <w:hyperlink w:anchor="__RefHeading___Toc2519_636782372">
+          <w:hyperlink w:anchor="__RefHeading___Toc2516_5898764">
             <w:r>
               <w:rPr>
                 <w:webHidden/>
@@ -2475,7 +2475,7 @@
         <w:bidi w:val="1"/>
         <w:rPr/>
       </w:pPr>
-      <w:bookmarkStart w:id="0" w:name="__RefHeading___Toc2437_636782372"/>
+      <w:bookmarkStart w:id="0" w:name="__RefHeading___Toc2434_5898764"/>
       <w:bookmarkStart w:id="1" w:name="مقدمة"/>
       <w:bookmarkEnd w:id="0"/>
       <w:r>
@@ -2501,7 +2501,7 @@
         <w:bidi w:val="1"/>
         <w:rPr/>
       </w:pPr>
-      <w:bookmarkStart w:id="2" w:name="__RefHeading___Toc2439_636782372"/>
+      <w:bookmarkStart w:id="2" w:name="__RefHeading___Toc2436_5898764"/>
       <w:bookmarkStart w:id="3" w:name="ما-هذا-النظام"/>
       <w:bookmarkEnd w:id="2"/>
       <w:r>
@@ -2754,7 +2754,7 @@
         <w:bidi w:val="1"/>
         <w:rPr/>
       </w:pPr>
-      <w:bookmarkStart w:id="4" w:name="__RefHeading___Toc2441_636782372"/>
+      <w:bookmarkStart w:id="4" w:name="__RefHeading___Toc2438_5898764"/>
       <w:bookmarkStart w:id="5" w:name="ما-الذي-يفعله-النظام-وما-الذي-لا-يفعله"/>
       <w:bookmarkEnd w:id="4"/>
       <w:r>
@@ -3476,7 +3476,7 @@
         <w:bidi w:val="1"/>
         <w:rPr/>
       </w:pPr>
-      <w:bookmarkStart w:id="6" w:name="__RefHeading___Toc2443_636782372"/>
+      <w:bookmarkStart w:id="6" w:name="__RefHeading___Toc2440_5898764"/>
       <w:bookmarkStart w:id="7" w:name="لمن-هذا-الدليل"/>
       <w:bookmarkEnd w:id="6"/>
       <w:r>
@@ -3741,7 +3741,7 @@
         <w:bidi w:val="1"/>
         <w:rPr/>
       </w:pPr>
-      <w:bookmarkStart w:id="8" w:name="__RefHeading___Toc2445_636782372"/>
+      <w:bookmarkStart w:id="8" w:name="__RefHeading___Toc2442_5898764"/>
       <w:bookmarkStart w:id="9" w:name="شريط-عرض-توضيحي-بلا-أمان-وصول"/>
       <w:bookmarkEnd w:id="8"/>
       <w:r>
@@ -3961,7 +3961,7 @@
         <w:bidi w:val="1"/>
         <w:rPr/>
       </w:pPr>
-      <w:bookmarkStart w:id="10" w:name="__RefHeading___Toc2447_636782372"/>
+      <w:bookmarkStart w:id="10" w:name="__RefHeading___Toc2444_5898764"/>
       <w:bookmarkStart w:id="11" w:name="المتطلبات"/>
       <w:bookmarkEnd w:id="10"/>
       <w:r>
@@ -4449,7 +4449,7 @@
         <w:bidi w:val="1"/>
         <w:rPr/>
       </w:pPr>
-      <w:bookmarkStart w:id="14" w:name="__RefHeading___Toc2449_636782372"/>
+      <w:bookmarkStart w:id="14" w:name="__RefHeading___Toc2446_5898764"/>
       <w:bookmarkStart w:id="15" w:name="البدء-السريع-لمشغل-النظام"/>
       <w:bookmarkEnd w:id="14"/>
       <w:r>
@@ -4519,7 +4519,7 @@
         <w:bidi w:val="1"/>
         <w:rPr/>
       </w:pPr>
-      <w:bookmarkStart w:id="16" w:name="__RefHeading___Toc2451_636782372"/>
+      <w:bookmarkStart w:id="16" w:name="__RefHeading___Toc2448_5898764"/>
       <w:bookmarkStart w:id="17" w:name="الخطوات-الأساسية"/>
       <w:bookmarkEnd w:id="16"/>
       <w:r>
@@ -6603,7 +6603,7 @@
         <w:bidi w:val="1"/>
         <w:rPr/>
       </w:pPr>
-      <w:bookmarkStart w:id="18" w:name="__RefHeading___Toc2453_636782372"/>
+      <w:bookmarkStart w:id="18" w:name="__RefHeading___Toc2450_5898764"/>
       <w:bookmarkStart w:id="19" w:name="وضع-المحاكاة-بلا-خادم"/>
       <w:bookmarkEnd w:id="18"/>
       <w:r>
@@ -7109,7 +7109,7 @@
         <w:bidi w:val="1"/>
         <w:rPr/>
       </w:pPr>
-      <w:bookmarkStart w:id="20" w:name="__RefHeading___Toc2455_636782372"/>
+      <w:bookmarkStart w:id="20" w:name="__RefHeading___Toc2452_5898764"/>
       <w:bookmarkStart w:id="21" w:name="لقطات-الشاشة"/>
       <w:bookmarkEnd w:id="20"/>
       <w:r>
@@ -7329,7 +7329,7 @@
         <w:bidi w:val="1"/>
         <w:rPr/>
       </w:pPr>
-      <w:bookmarkStart w:id="22" w:name="__RefHeading___Toc2457_636782372"/>
+      <w:bookmarkStart w:id="22" w:name="__RefHeading___Toc2454_5898764"/>
       <w:bookmarkStart w:id="23" w:name="استكشاف-الأخطاء-الشائعة"/>
       <w:bookmarkEnd w:id="22"/>
       <w:r>
@@ -8856,7 +8856,7 @@
         <w:bidi w:val="1"/>
         <w:rPr/>
       </w:pPr>
-      <w:bookmarkStart w:id="26" w:name="__RefHeading___Toc2459_636782372"/>
+      <w:bookmarkStart w:id="26" w:name="__RefHeading___Toc2456_5898764"/>
       <w:bookmarkStart w:id="27" w:name="دليل-المتعلم"/>
       <w:bookmarkEnd w:id="26"/>
       <w:r>
@@ -8958,7 +8958,7 @@
         <w:bidi w:val="1"/>
         <w:rPr/>
       </w:pPr>
-      <w:bookmarkStart w:id="28" w:name="__RefHeading___Toc2461_636782372"/>
+      <w:bookmarkStart w:id="28" w:name="__RefHeading___Toc2458_5898764"/>
       <w:bookmarkStart w:id="29" w:name="الصفحة-الرئيسية"/>
       <w:bookmarkEnd w:id="28"/>
       <w:r>
@@ -9639,7 +9639,7 @@
         <w:bidi w:val="1"/>
         <w:rPr/>
       </w:pPr>
-      <w:bookmarkStart w:id="30" w:name="__RefHeading___Toc2463_636782372"/>
+      <w:bookmarkStart w:id="30" w:name="__RefHeading___Toc2460_5898764"/>
       <w:bookmarkStart w:id="31" w:name="شريط-الأيام-ومعنى-العلامات"/>
       <w:bookmarkEnd w:id="30"/>
       <w:r>
@@ -11075,7 +11075,7 @@
         <w:bidi w:val="1"/>
         <w:rPr/>
       </w:pPr>
-      <w:bookmarkStart w:id="32" w:name="__RefHeading___Toc2465_636782372"/>
+      <w:bookmarkStart w:id="32" w:name="__RefHeading___Toc2462_5898764"/>
       <w:bookmarkStart w:id="33" w:name="شريط-السياق"/>
       <w:bookmarkEnd w:id="32"/>
       <w:r>
@@ -11553,7 +11553,7 @@
         <w:bidi w:val="1"/>
         <w:rPr/>
       </w:pPr>
-      <w:bookmarkStart w:id="34" w:name="__RefHeading___Toc2467_636782372"/>
+      <w:bookmarkStart w:id="34" w:name="__RefHeading___Toc2464_5898764"/>
       <w:bookmarkStart w:id="35" w:name="قراءة-بطاقة-التوصية"/>
       <w:bookmarkEnd w:id="34"/>
       <w:r>
@@ -12423,7 +12423,7 @@
         <w:bidi w:val="1"/>
         <w:rPr/>
       </w:pPr>
-      <w:bookmarkStart w:id="36" w:name="__RefHeading___Toc2469_636782372"/>
+      <w:bookmarkStart w:id="36" w:name="__RefHeading___Toc2466_5898764"/>
       <w:bookmarkStart w:id="37" w:name="نافذة-لماذا"/>
       <w:bookmarkEnd w:id="36"/>
       <w:r>
@@ -13092,7 +13092,7 @@
         <w:bidi w:val="1"/>
         <w:rPr/>
       </w:pPr>
-      <w:bookmarkStart w:id="38" w:name="__RefHeading___Toc2471_636782372"/>
+      <w:bookmarkStart w:id="38" w:name="__RefHeading___Toc2468_5898764"/>
       <w:bookmarkStart w:id="39" w:name="شارة-تاريخ-النموذج"/>
       <w:bookmarkEnd w:id="38"/>
       <w:r>
@@ -13485,7 +13485,7 @@
         <w:bidi w:val="1"/>
         <w:rPr/>
       </w:pPr>
-      <w:bookmarkStart w:id="40" w:name="__RefHeading___Toc2473_636782372"/>
+      <w:bookmarkStart w:id="40" w:name="__RefHeading___Toc2470_5898764"/>
       <w:bookmarkStart w:id="41" w:name="حالة-قبل-أول-قطع"/>
       <w:bookmarkEnd w:id="40"/>
       <w:r>
@@ -13749,7 +13749,7 @@
         <w:bidi w:val="1"/>
         <w:rPr/>
       </w:pPr>
-      <w:bookmarkStart w:id="42" w:name="__RefHeading___Toc2475_636782372"/>
+      <w:bookmarkStart w:id="42" w:name="__RefHeading___Toc2472_5898764"/>
       <w:bookmarkStart w:id="43" w:name="حالة-بلا-نشاط-سابق"/>
       <w:bookmarkEnd w:id="42"/>
       <w:r>
@@ -13859,7 +13859,7 @@
         <w:bidi w:val="1"/>
         <w:rPr/>
       </w:pPr>
-      <w:bookmarkStart w:id="44" w:name="__RefHeading___Toc2477_636782372"/>
+      <w:bookmarkStart w:id="44" w:name="__RefHeading___Toc2474_5898764"/>
       <w:bookmarkStart w:id="45" w:name="نشاطي-في-آخر-28-يوما"/>
       <w:bookmarkEnd w:id="44"/>
       <w:r>
@@ -14200,7 +14200,7 @@
         <w:bidi w:val="1"/>
         <w:rPr/>
       </w:pPr>
-      <w:bookmarkStart w:id="46" w:name="__RefHeading___Toc2479_636782372"/>
+      <w:bookmarkStart w:id="46" w:name="__RefHeading___Toc2476_5898764"/>
       <w:bookmarkStart w:id="47" w:name="ما-لا-تعرضه-صفحة-المتعلم"/>
       <w:bookmarkEnd w:id="46"/>
       <w:r>
@@ -14408,7 +14408,7 @@
         <w:bidi w:val="1"/>
         <w:rPr/>
       </w:pPr>
-      <w:bookmarkStart w:id="48" w:name="__RefHeading___Toc2481_636782372"/>
+      <w:bookmarkStart w:id="48" w:name="__RefHeading___Toc2478_5898764"/>
       <w:bookmarkStart w:id="49" w:name="حالة-منسحب"/>
       <w:bookmarkEnd w:id="48"/>
       <w:r>
@@ -14589,7 +14589,7 @@
         <w:bidi w:val="1"/>
         <w:rPr/>
       </w:pPr>
-      <w:bookmarkStart w:id="52" w:name="__RefHeading___Toc2483_636782372"/>
+      <w:bookmarkStart w:id="52" w:name="__RefHeading___Toc2480_5898764"/>
       <w:bookmarkStart w:id="53" w:name="دليل-المدرس-أو-المشرف"/>
       <w:bookmarkEnd w:id="52"/>
       <w:r>
@@ -14650,7 +14650,7 @@
         <w:bidi w:val="1"/>
         <w:rPr/>
       </w:pPr>
-      <w:bookmarkStart w:id="54" w:name="__RefHeading___Toc2485_636782372"/>
+      <w:bookmarkStart w:id="54" w:name="__RefHeading___Toc2482_5898764"/>
       <w:bookmarkStart w:id="55" w:name="تنبيه-قبل-البدء"/>
       <w:bookmarkEnd w:id="54"/>
       <w:r>
@@ -14930,7 +14930,7 @@
         <w:bidi w:val="1"/>
         <w:rPr/>
       </w:pPr>
-      <w:bookmarkStart w:id="56" w:name="__RefHeading___Toc2487_636782372"/>
+      <w:bookmarkStart w:id="56" w:name="__RefHeading___Toc2484_5898764"/>
       <w:bookmarkStart w:id="57" w:name="تبدأ-اللوحة-من-اليوم-56"/>
       <w:bookmarkEnd w:id="56"/>
       <w:r>
@@ -15018,7 +15018,7 @@
         <w:bidi w:val="1"/>
         <w:rPr/>
       </w:pPr>
-      <w:bookmarkStart w:id="58" w:name="__RefHeading___Toc2489_636782372"/>
+      <w:bookmarkStart w:id="58" w:name="__RefHeading___Toc2486_5898764"/>
       <w:bookmarkStart w:id="59" w:name="لوحة-المؤشرات"/>
       <w:bookmarkEnd w:id="58"/>
       <w:r>
@@ -16281,7 +16281,7 @@
         <w:bidi w:val="1"/>
         <w:rPr/>
       </w:pPr>
-      <w:bookmarkStart w:id="60" w:name="__RefHeading___Toc2491_636782372"/>
+      <w:bookmarkStart w:id="60" w:name="__RefHeading___Toc2488_5898764"/>
       <w:bookmarkStart w:id="61" w:name="العناقيد-السلوكية"/>
       <w:bookmarkEnd w:id="60"/>
       <w:r>
@@ -17389,7 +17389,7 @@
         <w:bidi w:val="1"/>
         <w:rPr/>
       </w:pPr>
-      <w:bookmarkStart w:id="62" w:name="__RefHeading___Toc2493_636782372"/>
+      <w:bookmarkStart w:id="62" w:name="__RefHeading___Toc2490_5898764"/>
       <w:bookmarkStart w:id="63" w:name="توزيع-درجة-الخطر-النسبية"/>
       <w:bookmarkEnd w:id="62"/>
       <w:r>
@@ -18174,7 +18174,7 @@
         <w:bidi w:val="1"/>
         <w:rPr/>
       </w:pPr>
-      <w:bookmarkStart w:id="64" w:name="__RefHeading___Toc2495_636782372"/>
+      <w:bookmarkStart w:id="64" w:name="__RefHeading___Toc2492_5898764"/>
       <w:bookmarkStart w:id="65" w:name="ملامح-السلوك"/>
       <w:bookmarkEnd w:id="64"/>
       <w:r>
@@ -18707,7 +18707,7 @@
         <w:bidi w:val="1"/>
         <w:rPr/>
       </w:pPr>
-      <w:bookmarkStart w:id="66" w:name="__RefHeading___Toc2497_636782372"/>
+      <w:bookmarkStart w:id="66" w:name="__RefHeading___Toc2494_5898764"/>
       <w:bookmarkStart w:id="67" w:name="تغطية-التوصيات"/>
       <w:bookmarkEnd w:id="66"/>
       <w:r>
@@ -18873,7 +18873,7 @@
         <w:bidi w:val="1"/>
         <w:rPr/>
       </w:pPr>
-      <w:bookmarkStart w:id="68" w:name="__RefHeading___Toc2499_636782372"/>
+      <w:bookmarkStart w:id="68" w:name="__RefHeading___Toc2496_5898764"/>
       <w:bookmarkStart w:id="69" w:name="جدول-المتعلمين"/>
       <w:bookmarkEnd w:id="68"/>
       <w:r>
@@ -20380,7 +20380,7 @@
         <w:bidi w:val="1"/>
         <w:rPr/>
       </w:pPr>
-      <w:bookmarkStart w:id="70" w:name="__RefHeading___Toc2501_636782372"/>
+      <w:bookmarkStart w:id="70" w:name="__RefHeading___Toc2498_5898764"/>
       <w:bookmarkStart w:id="71" w:name="ملف-المتعلم"/>
       <w:bookmarkEnd w:id="70"/>
       <w:r>
@@ -21087,7 +21087,7 @@
         <w:bidi w:val="1"/>
         <w:rPr/>
       </w:pPr>
-      <w:bookmarkStart w:id="72" w:name="__RefHeading___Toc2503_636782372"/>
+      <w:bookmarkStart w:id="72" w:name="__RefHeading___Toc2500_5898764"/>
       <w:bookmarkStart w:id="73" w:name="القيود-الأخلاقية-والمنهجية"/>
       <w:bookmarkEnd w:id="72"/>
       <w:r>
@@ -21538,7 +21538,7 @@
         <w:bidi w:val="1"/>
         <w:rPr/>
       </w:pPr>
-      <w:bookmarkStart w:id="74" w:name="__RefHeading___Toc2505_636782372"/>
+      <w:bookmarkStart w:id="74" w:name="__RefHeading___Toc2502_5898764"/>
       <w:bookmarkStart w:id="75" w:name="ماذا-أفعل-كمدرس"/>
       <w:bookmarkEnd w:id="74"/>
       <w:r>
@@ -21657,7 +21657,7 @@
         <w:bidi w:val="1"/>
         <w:rPr/>
       </w:pPr>
-      <w:bookmarkStart w:id="76" w:name="__RefHeading___Toc2507_636782372"/>
+      <w:bookmarkStart w:id="76" w:name="__RefHeading___Toc2504_5898764"/>
       <w:bookmarkStart w:id="77" w:name="X745443570c429d909b26e3257e881b7ff04140e"/>
       <w:bookmarkEnd w:id="76"/>
       <w:r>
@@ -22131,7 +22131,7 @@
         <w:bidi w:val="1"/>
         <w:rPr/>
       </w:pPr>
-      <w:bookmarkStart w:id="80" w:name="__RefHeading___Toc2509_636782372"/>
+      <w:bookmarkStart w:id="80" w:name="__RefHeading___Toc2506_5898764"/>
       <w:bookmarkStart w:id="81" w:name="الأسئلة-الشائعة"/>
       <w:bookmarkEnd w:id="80"/>
       <w:r>
@@ -23771,7 +23771,7 @@
         <w:bidi w:val="1"/>
         <w:rPr/>
       </w:pPr>
-      <w:bookmarkStart w:id="83" w:name="__RefHeading___Toc2511_636782372"/>
+      <w:bookmarkStart w:id="83" w:name="__RefHeading___Toc2508_5898764"/>
       <w:bookmarkStart w:id="84" w:name="الملاحق"/>
       <w:bookmarkEnd w:id="83"/>
       <w:r>
@@ -23797,7 +23797,7 @@
         <w:bidi w:val="1"/>
         <w:rPr/>
       </w:pPr>
-      <w:bookmarkStart w:id="85" w:name="__RefHeading___Toc2513_636782372"/>
+      <w:bookmarkStart w:id="85" w:name="__RefHeading___Toc2510_5898764"/>
       <w:bookmarkEnd w:id="85"/>
       <w:r>
         <w:rPr/>
@@ -24966,7 +24966,7 @@
         <w:bidi w:val="1"/>
         <w:rPr/>
       </w:pPr>
-      <w:bookmarkStart w:id="87" w:name="__RefHeading___Toc2515_636782372"/>
+      <w:bookmarkStart w:id="87" w:name="__RefHeading___Toc2512_5898764"/>
       <w:bookmarkEnd w:id="87"/>
       <w:r>
         <w:rPr/>
@@ -25984,27 +25984,7 @@
         <w:rPr>
           <w:rtl w:val="true"/>
         </w:rPr>
-        <w:t xml:space="preserve">أخطاء الواجهة البرمجية تأتي بصيغة </w:t>
-      </w:r>
-      <w:r>
-        <w:rPr>
-          <w:rStyle w:val="VerbatimChar"/>
-          <w:rtl w:val="true"/>
-        </w:rPr>
-        <w:t>{"</w:t>
-      </w:r>
-      <w:r>
-        <w:rPr>
-          <w:rStyle w:val="VerbatimChar"/>
-        </w:rPr>
-        <w:t>error":{"code","message","details"}</w:t>
-      </w:r>
-      <w:r>
-        <w:rPr>
-          <w:rStyle w:val="VerbatimChar"/>
-          <w:rtl w:val="true"/>
-        </w:rPr>
-        <w:t>}</w:t>
+        <w:t>أخطاء الواجهة البرمجية تأتي في حقل خطأ يحتوي الرمز والرسالة والتفاصيل</w:t>
       </w:r>
       <w:r>
         <w:rPr>
@@ -26091,7 +26071,7 @@
         <w:bidi w:val="1"/>
         <w:rPr/>
       </w:pPr>
-      <w:bookmarkStart w:id="88" w:name="__RefHeading___Toc2517_636782372"/>
+      <w:bookmarkStart w:id="88" w:name="__RefHeading___Toc2514_5898764"/>
       <w:bookmarkEnd w:id="88"/>
       <w:r>
         <w:rPr/>
@@ -28816,7 +28796,7 @@
         <w:bidi w:val="1"/>
         <w:rPr/>
       </w:pPr>
-      <w:bookmarkStart w:id="90" w:name="__RefHeading___Toc2519_636782372"/>
+      <w:bookmarkStart w:id="90" w:name="__RefHeading___Toc2516_5898764"/>
       <w:bookmarkEnd w:id="90"/>
       <w:r>
         <w:rPr/>

</xml_diff>

<commit_message>
UI: true minus sign and isolated negative numbers/ranges; screenshots 05/06 retaken
Co-Authored-By: Claude Fable 5.1 <noreply@anthropic.com>
Claude-Session: https://claude.ai/code/session_01Y5Ccgz17Pq2brpK5TTSYa7
</commit_message>
<xml_diff>
--- a/deliverables/05-user-guide/دليل-المستخدم-والواجهات.docx
+++ b/deliverables/05-user-guide/دليل-المستخدم-والواجهات.docx
@@ -378,7 +378,7 @@
             </w:rPr>
             <w:fldChar w:fldCharType="separate"/>
           </w:r>
-          <w:hyperlink w:anchor="__RefHeading___Toc2434_5898764">
+          <w:hyperlink w:anchor="__RefHeading___Toc2429_3553792858">
             <w:r>
               <w:rPr>
                 <w:webHidden/>
@@ -424,7 +424,7 @@
             </w:tabs>
             <w:rPr/>
           </w:pPr>
-          <w:hyperlink w:anchor="__RefHeading___Toc2436_5898764">
+          <w:hyperlink w:anchor="__RefHeading___Toc2431_3553792858">
             <w:r>
               <w:rPr>
                 <w:webHidden/>
@@ -470,7 +470,7 @@
             </w:tabs>
             <w:rPr/>
           </w:pPr>
-          <w:hyperlink w:anchor="__RefHeading___Toc2438_5898764">
+          <w:hyperlink w:anchor="__RefHeading___Toc2433_3553792858">
             <w:r>
               <w:rPr>
                 <w:webHidden/>
@@ -516,7 +516,7 @@
             </w:tabs>
             <w:rPr/>
           </w:pPr>
-          <w:hyperlink w:anchor="__RefHeading___Toc2440_5898764">
+          <w:hyperlink w:anchor="__RefHeading___Toc2435_3553792858">
             <w:r>
               <w:rPr>
                 <w:webHidden/>
@@ -562,7 +562,7 @@
             </w:tabs>
             <w:rPr/>
           </w:pPr>
-          <w:hyperlink w:anchor="__RefHeading___Toc2442_5898764">
+          <w:hyperlink w:anchor="__RefHeading___Toc2437_3553792858">
             <w:r>
               <w:rPr>
                 <w:webHidden/>
@@ -623,7 +623,7 @@
             </w:tabs>
             <w:rPr/>
           </w:pPr>
-          <w:hyperlink w:anchor="__RefHeading___Toc2444_5898764">
+          <w:hyperlink w:anchor="__RefHeading___Toc2439_3553792858">
             <w:r>
               <w:rPr>
                 <w:webHidden/>
@@ -669,7 +669,7 @@
             </w:tabs>
             <w:rPr/>
           </w:pPr>
-          <w:hyperlink w:anchor="__RefHeading___Toc2446_5898764">
+          <w:hyperlink w:anchor="__RefHeading___Toc2441_3553792858">
             <w:r>
               <w:rPr>
                 <w:webHidden/>
@@ -715,7 +715,7 @@
             </w:tabs>
             <w:rPr/>
           </w:pPr>
-          <w:hyperlink w:anchor="__RefHeading___Toc2448_5898764">
+          <w:hyperlink w:anchor="__RefHeading___Toc2443_3553792858">
             <w:r>
               <w:rPr>
                 <w:webHidden/>
@@ -761,7 +761,7 @@
             </w:tabs>
             <w:rPr/>
           </w:pPr>
-          <w:hyperlink w:anchor="__RefHeading___Toc2450_5898764">
+          <w:hyperlink w:anchor="__RefHeading___Toc2445_3553792858">
             <w:r>
               <w:rPr>
                 <w:webHidden/>
@@ -822,7 +822,7 @@
             </w:tabs>
             <w:rPr/>
           </w:pPr>
-          <w:hyperlink w:anchor="__RefHeading___Toc2452_5898764">
+          <w:hyperlink w:anchor="__RefHeading___Toc2447_3553792858">
             <w:r>
               <w:rPr>
                 <w:webHidden/>
@@ -842,7 +842,7 @@
                 <w:rStyle w:val="IndexLink"/>
                 <w:rtl w:val="true"/>
               </w:rPr>
-              <w:t>لقطات الشاشة</w:t>
+              <w:t>صور الشاشة</w:t>
             </w:r>
             <w:r>
               <w:rPr>
@@ -868,7 +868,7 @@
             </w:tabs>
             <w:rPr/>
           </w:pPr>
-          <w:hyperlink w:anchor="__RefHeading___Toc2454_5898764">
+          <w:hyperlink w:anchor="__RefHeading___Toc2449_3553792858">
             <w:r>
               <w:rPr>
                 <w:webHidden/>
@@ -914,7 +914,7 @@
             </w:tabs>
             <w:rPr/>
           </w:pPr>
-          <w:hyperlink w:anchor="__RefHeading___Toc2456_5898764">
+          <w:hyperlink w:anchor="__RefHeading___Toc2451_3553792858">
             <w:r>
               <w:rPr>
                 <w:webHidden/>
@@ -960,7 +960,7 @@
             </w:tabs>
             <w:rPr/>
           </w:pPr>
-          <w:hyperlink w:anchor="__RefHeading___Toc2458_5898764">
+          <w:hyperlink w:anchor="__RefHeading___Toc2453_3553792858">
             <w:r>
               <w:rPr>
                 <w:webHidden/>
@@ -1006,7 +1006,7 @@
             </w:tabs>
             <w:rPr/>
           </w:pPr>
-          <w:hyperlink w:anchor="__RefHeading___Toc2460_5898764">
+          <w:hyperlink w:anchor="__RefHeading___Toc2455_3553792858">
             <w:r>
               <w:rPr>
                 <w:webHidden/>
@@ -1039,7 +1039,7 @@
               <w:rPr>
                 <w:rStyle w:val="IndexLink"/>
               </w:rPr>
-              <w:t>12</w:t>
+              <w:t>11</w:t>
             </w:r>
           </w:hyperlink>
         </w:p>
@@ -1052,7 +1052,7 @@
             </w:tabs>
             <w:rPr/>
           </w:pPr>
-          <w:hyperlink w:anchor="__RefHeading___Toc2462_5898764">
+          <w:hyperlink w:anchor="__RefHeading___Toc2457_3553792858">
             <w:r>
               <w:rPr>
                 <w:webHidden/>
@@ -1098,7 +1098,7 @@
             </w:tabs>
             <w:rPr/>
           </w:pPr>
-          <w:hyperlink w:anchor="__RefHeading___Toc2464_5898764">
+          <w:hyperlink w:anchor="__RefHeading___Toc2459_3553792858">
             <w:r>
               <w:rPr>
                 <w:webHidden/>
@@ -1144,7 +1144,7 @@
             </w:tabs>
             <w:rPr/>
           </w:pPr>
-          <w:hyperlink w:anchor="__RefHeading___Toc2466_5898764">
+          <w:hyperlink w:anchor="__RefHeading___Toc2461_3553792858">
             <w:r>
               <w:rPr>
                 <w:webHidden/>
@@ -1205,7 +1205,7 @@
             </w:tabs>
             <w:rPr/>
           </w:pPr>
-          <w:hyperlink w:anchor="__RefHeading___Toc2468_5898764">
+          <w:hyperlink w:anchor="__RefHeading___Toc2463_3553792858">
             <w:r>
               <w:rPr>
                 <w:webHidden/>
@@ -1266,7 +1266,7 @@
             </w:tabs>
             <w:rPr/>
           </w:pPr>
-          <w:hyperlink w:anchor="__RefHeading___Toc2470_5898764">
+          <w:hyperlink w:anchor="__RefHeading___Toc2465_3553792858">
             <w:r>
               <w:rPr>
                 <w:webHidden/>
@@ -1327,7 +1327,7 @@
             </w:tabs>
             <w:rPr/>
           </w:pPr>
-          <w:hyperlink w:anchor="__RefHeading___Toc2472_5898764">
+          <w:hyperlink w:anchor="__RefHeading___Toc2467_3553792858">
             <w:r>
               <w:rPr>
                 <w:webHidden/>
@@ -1388,7 +1388,7 @@
             </w:tabs>
             <w:rPr/>
           </w:pPr>
-          <w:hyperlink w:anchor="__RefHeading___Toc2474_5898764">
+          <w:hyperlink w:anchor="__RefHeading___Toc2469_3553792858">
             <w:r>
               <w:rPr>
                 <w:webHidden/>
@@ -1454,7 +1454,7 @@
             </w:tabs>
             <w:rPr/>
           </w:pPr>
-          <w:hyperlink w:anchor="__RefHeading___Toc2476_5898764">
+          <w:hyperlink w:anchor="__RefHeading___Toc2471_3553792858">
             <w:r>
               <w:rPr>
                 <w:webHidden/>
@@ -1500,7 +1500,7 @@
             </w:tabs>
             <w:rPr/>
           </w:pPr>
-          <w:hyperlink w:anchor="__RefHeading___Toc2478_5898764">
+          <w:hyperlink w:anchor="__RefHeading___Toc2473_3553792858">
             <w:r>
               <w:rPr>
                 <w:webHidden/>
@@ -1561,7 +1561,7 @@
             </w:tabs>
             <w:rPr/>
           </w:pPr>
-          <w:hyperlink w:anchor="__RefHeading___Toc2480_5898764">
+          <w:hyperlink w:anchor="__RefHeading___Toc2475_3553792858">
             <w:r>
               <w:rPr>
                 <w:webHidden/>
@@ -1607,7 +1607,7 @@
             </w:tabs>
             <w:rPr/>
           </w:pPr>
-          <w:hyperlink w:anchor="__RefHeading___Toc2482_5898764">
+          <w:hyperlink w:anchor="__RefHeading___Toc2477_3553792858">
             <w:r>
               <w:rPr>
                 <w:webHidden/>
@@ -1653,7 +1653,7 @@
             </w:tabs>
             <w:rPr/>
           </w:pPr>
-          <w:hyperlink w:anchor="__RefHeading___Toc2484_5898764">
+          <w:hyperlink w:anchor="__RefHeading___Toc2479_3553792858">
             <w:r>
               <w:rPr>
                 <w:webHidden/>
@@ -1705,7 +1705,7 @@
             </w:tabs>
             <w:rPr/>
           </w:pPr>
-          <w:hyperlink w:anchor="__RefHeading___Toc2486_5898764">
+          <w:hyperlink w:anchor="__RefHeading___Toc2481_3553792858">
             <w:r>
               <w:rPr>
                 <w:webHidden/>
@@ -1751,7 +1751,7 @@
             </w:tabs>
             <w:rPr/>
           </w:pPr>
-          <w:hyperlink w:anchor="__RefHeading___Toc2488_5898764">
+          <w:hyperlink w:anchor="__RefHeading___Toc2483_3553792858">
             <w:r>
               <w:rPr>
                 <w:webHidden/>
@@ -1797,7 +1797,7 @@
             </w:tabs>
             <w:rPr/>
           </w:pPr>
-          <w:hyperlink w:anchor="__RefHeading___Toc2490_5898764">
+          <w:hyperlink w:anchor="__RefHeading___Toc2485_3553792858">
             <w:r>
               <w:rPr>
                 <w:webHidden/>
@@ -1843,7 +1843,7 @@
             </w:tabs>
             <w:rPr/>
           </w:pPr>
-          <w:hyperlink w:anchor="__RefHeading___Toc2492_5898764">
+          <w:hyperlink w:anchor="__RefHeading___Toc2487_3553792858">
             <w:r>
               <w:rPr>
                 <w:webHidden/>
@@ -1889,7 +1889,7 @@
             </w:tabs>
             <w:rPr/>
           </w:pPr>
-          <w:hyperlink w:anchor="__RefHeading___Toc2494_5898764">
+          <w:hyperlink w:anchor="__RefHeading___Toc2489_3553792858">
             <w:r>
               <w:rPr>
                 <w:webHidden/>
@@ -1922,7 +1922,7 @@
               <w:rPr>
                 <w:rStyle w:val="IndexLink"/>
               </w:rPr>
-              <w:t>25</w:t>
+              <w:t>26</w:t>
             </w:r>
           </w:hyperlink>
         </w:p>
@@ -1935,7 +1935,7 @@
             </w:tabs>
             <w:rPr/>
           </w:pPr>
-          <w:hyperlink w:anchor="__RefHeading___Toc2496_5898764">
+          <w:hyperlink w:anchor="__RefHeading___Toc2491_3553792858">
             <w:r>
               <w:rPr>
                 <w:webHidden/>
@@ -1968,7 +1968,7 @@
               <w:rPr>
                 <w:rStyle w:val="IndexLink"/>
               </w:rPr>
-              <w:t>25</w:t>
+              <w:t>26</w:t>
             </w:r>
           </w:hyperlink>
         </w:p>
@@ -1981,7 +1981,7 @@
             </w:tabs>
             <w:rPr/>
           </w:pPr>
-          <w:hyperlink w:anchor="__RefHeading___Toc2498_5898764">
+          <w:hyperlink w:anchor="__RefHeading___Toc2493_3553792858">
             <w:r>
               <w:rPr>
                 <w:webHidden/>
@@ -2014,7 +2014,7 @@
               <w:rPr>
                 <w:rStyle w:val="IndexLink"/>
               </w:rPr>
-              <w:t>27</w:t>
+              <w:t>28</w:t>
             </w:r>
           </w:hyperlink>
         </w:p>
@@ -2027,7 +2027,7 @@
             </w:tabs>
             <w:rPr/>
           </w:pPr>
-          <w:hyperlink w:anchor="__RefHeading___Toc2500_5898764">
+          <w:hyperlink w:anchor="__RefHeading___Toc2495_3553792858">
             <w:r>
               <w:rPr>
                 <w:webHidden/>
@@ -2060,7 +2060,7 @@
               <w:rPr>
                 <w:rStyle w:val="IndexLink"/>
               </w:rPr>
-              <w:t>28</w:t>
+              <w:t>29</w:t>
             </w:r>
           </w:hyperlink>
         </w:p>
@@ -2073,7 +2073,7 @@
             </w:tabs>
             <w:rPr/>
           </w:pPr>
-          <w:hyperlink w:anchor="__RefHeading___Toc2502_5898764">
+          <w:hyperlink w:anchor="__RefHeading___Toc2497_3553792858">
             <w:r>
               <w:rPr>
                 <w:webHidden/>
@@ -2106,7 +2106,7 @@
               <w:rPr>
                 <w:rStyle w:val="IndexLink"/>
               </w:rPr>
-              <w:t>29</w:t>
+              <w:t>30</w:t>
             </w:r>
           </w:hyperlink>
         </w:p>
@@ -2119,7 +2119,7 @@
             </w:tabs>
             <w:rPr/>
           </w:pPr>
-          <w:hyperlink w:anchor="__RefHeading___Toc2504_5898764">
+          <w:hyperlink w:anchor="__RefHeading___Toc2499_3553792858">
             <w:r>
               <w:rPr>
                 <w:webHidden/>
@@ -2166,7 +2166,7 @@
               <w:rPr>
                 <w:rStyle w:val="IndexLink"/>
               </w:rPr>
-              <w:t>29</w:t>
+              <w:t>30</w:t>
             </w:r>
           </w:hyperlink>
         </w:p>
@@ -2179,7 +2179,7 @@
             </w:tabs>
             <w:rPr/>
           </w:pPr>
-          <w:hyperlink w:anchor="__RefHeading___Toc2506_5898764">
+          <w:hyperlink w:anchor="__RefHeading___Toc2501_3553792858">
             <w:r>
               <w:rPr>
                 <w:webHidden/>
@@ -2212,7 +2212,7 @@
               <w:rPr>
                 <w:rStyle w:val="IndexLink"/>
               </w:rPr>
-              <w:t>30</w:t>
+              <w:t>31</w:t>
             </w:r>
           </w:hyperlink>
         </w:p>
@@ -2225,7 +2225,7 @@
             </w:tabs>
             <w:rPr/>
           </w:pPr>
-          <w:hyperlink w:anchor="__RefHeading___Toc2508_5898764">
+          <w:hyperlink w:anchor="__RefHeading___Toc2503_3553792858">
             <w:r>
               <w:rPr>
                 <w:webHidden/>
@@ -2258,7 +2258,7 @@
               <w:rPr>
                 <w:rStyle w:val="IndexLink"/>
               </w:rPr>
-              <w:t>32</w:t>
+              <w:t>33</w:t>
             </w:r>
           </w:hyperlink>
         </w:p>
@@ -2271,7 +2271,7 @@
             </w:tabs>
             <w:rPr/>
           </w:pPr>
-          <w:hyperlink w:anchor="__RefHeading___Toc2510_5898764">
+          <w:hyperlink w:anchor="__RefHeading___Toc2505_3553792858">
             <w:r>
               <w:rPr>
                 <w:webHidden/>
@@ -2304,7 +2304,7 @@
               <w:rPr>
                 <w:rStyle w:val="IndexLink"/>
               </w:rPr>
-              <w:t>32</w:t>
+              <w:t>33</w:t>
             </w:r>
           </w:hyperlink>
         </w:p>
@@ -2317,7 +2317,7 @@
             </w:tabs>
             <w:rPr/>
           </w:pPr>
-          <w:hyperlink w:anchor="__RefHeading___Toc2512_5898764">
+          <w:hyperlink w:anchor="__RefHeading___Toc2507_3553792858">
             <w:r>
               <w:rPr>
                 <w:webHidden/>
@@ -2378,7 +2378,7 @@
             </w:tabs>
             <w:rPr/>
           </w:pPr>
-          <w:hyperlink w:anchor="__RefHeading___Toc2514_5898764">
+          <w:hyperlink w:anchor="__RefHeading___Toc2509_3553792858">
             <w:r>
               <w:rPr>
                 <w:webHidden/>
@@ -2411,7 +2411,7 @@
               <w:rPr>
                 <w:rStyle w:val="IndexLink"/>
               </w:rPr>
-              <w:t>33</w:t>
+              <w:t>34</w:t>
             </w:r>
           </w:hyperlink>
         </w:p>
@@ -2424,7 +2424,7 @@
             </w:tabs>
             <w:rPr/>
           </w:pPr>
-          <w:hyperlink w:anchor="__RefHeading___Toc2516_5898764">
+          <w:hyperlink w:anchor="__RefHeading___Toc2511_3553792858">
             <w:r>
               <w:rPr>
                 <w:webHidden/>
@@ -2444,7 +2444,7 @@
                 <w:rStyle w:val="IndexLink"/>
                 <w:rtl w:val="true"/>
               </w:rPr>
-              <w:t>عن اللقطات</w:t>
+              <w:t>عن صور الشاشة</w:t>
             </w:r>
             <w:r>
               <w:rPr>
@@ -2457,7 +2457,7 @@
               <w:rPr>
                 <w:rStyle w:val="IndexLink"/>
               </w:rPr>
-              <w:t>36</w:t>
+              <w:t>37</w:t>
             </w:r>
           </w:hyperlink>
           <w:r>
@@ -2475,7 +2475,7 @@
         <w:bidi w:val="1"/>
         <w:rPr/>
       </w:pPr>
-      <w:bookmarkStart w:id="0" w:name="__RefHeading___Toc2434_5898764"/>
+      <w:bookmarkStart w:id="0" w:name="__RefHeading___Toc2429_3553792858"/>
       <w:bookmarkStart w:id="1" w:name="مقدمة"/>
       <w:bookmarkEnd w:id="0"/>
       <w:r>
@@ -2501,7 +2501,7 @@
         <w:bidi w:val="1"/>
         <w:rPr/>
       </w:pPr>
-      <w:bookmarkStart w:id="2" w:name="__RefHeading___Toc2436_5898764"/>
+      <w:bookmarkStart w:id="2" w:name="__RefHeading___Toc2431_3553792858"/>
       <w:bookmarkStart w:id="3" w:name="ما-هذا-النظام"/>
       <w:bookmarkEnd w:id="2"/>
       <w:r>
@@ -2642,7 +2642,13 @@
         <w:rPr>
           <w:rStyle w:val="VerbatimChar"/>
         </w:rPr>
-        <w:t>FFF_2013J</w:t>
+        <w:t>‎</w:t>
+      </w:r>
+      <w:r>
+        <w:rPr>
+          <w:rStyle w:val="VerbatimChar"/>
+        </w:rPr>
+        <w:t>FFF_2013J‎</w:t>
       </w:r>
       <w:r>
         <w:rPr>
@@ -2754,7 +2760,7 @@
         <w:bidi w:val="1"/>
         <w:rPr/>
       </w:pPr>
-      <w:bookmarkStart w:id="4" w:name="__RefHeading___Toc2438_5898764"/>
+      <w:bookmarkStart w:id="4" w:name="__RefHeading___Toc2433_3553792858"/>
       <w:bookmarkStart w:id="5" w:name="ما-الذي-يفعله-النظام-وما-الذي-لا-يفعله"/>
       <w:bookmarkEnd w:id="4"/>
       <w:r>
@@ -3476,7 +3482,7 @@
         <w:bidi w:val="1"/>
         <w:rPr/>
       </w:pPr>
-      <w:bookmarkStart w:id="6" w:name="__RefHeading___Toc2440_5898764"/>
+      <w:bookmarkStart w:id="6" w:name="__RefHeading___Toc2435_3553792858"/>
       <w:bookmarkStart w:id="7" w:name="لمن-هذا-الدليل"/>
       <w:bookmarkEnd w:id="6"/>
       <w:r>
@@ -3741,7 +3747,7 @@
         <w:bidi w:val="1"/>
         <w:rPr/>
       </w:pPr>
-      <w:bookmarkStart w:id="8" w:name="__RefHeading___Toc2442_5898764"/>
+      <w:bookmarkStart w:id="8" w:name="__RefHeading___Toc2437_3553792858"/>
       <w:bookmarkStart w:id="9" w:name="شريط-عرض-توضيحي-بلا-أمان-وصول"/>
       <w:bookmarkEnd w:id="8"/>
       <w:r>
@@ -3925,15 +3931,14 @@
       <w:r>
         <w:rPr>
           <w:rStyle w:val="VerbatimChar"/>
-          <w:rtl w:val="true"/>
-        </w:rPr>
-        <w:t>--</w:t>
+        </w:rPr>
+        <w:t>‎</w:t>
       </w:r>
       <w:r>
         <w:rPr>
           <w:rStyle w:val="VerbatimChar"/>
         </w:rPr>
-        <w:t>no-instructor</w:t>
+        <w:t>--no-instructor‎</w:t>
       </w:r>
       <w:r>
         <w:rPr>
@@ -3961,7 +3966,7 @@
         <w:bidi w:val="1"/>
         <w:rPr/>
       </w:pPr>
-      <w:bookmarkStart w:id="10" w:name="__RefHeading___Toc2444_5898764"/>
+      <w:bookmarkStart w:id="10" w:name="__RefHeading___Toc2439_3553792858"/>
       <w:bookmarkStart w:id="11" w:name="المتطلبات"/>
       <w:bookmarkEnd w:id="10"/>
       <w:r>
@@ -4020,7 +4025,7 @@
         <w:rPr>
           <w:rStyle w:val="VerbatimChar"/>
         </w:rPr>
-        <w:t>numpy</w:t>
+        <w:t>‎numpy‎</w:t>
       </w:r>
       <w:r>
         <w:rPr>
@@ -4038,7 +4043,13 @@
         <w:rPr>
           <w:rStyle w:val="VerbatimChar"/>
         </w:rPr>
-        <w:t>pandas</w:t>
+        <w:t>‎</w:t>
+      </w:r>
+      <w:r>
+        <w:rPr>
+          <w:rStyle w:val="VerbatimChar"/>
+        </w:rPr>
+        <w:t>pandas‎</w:t>
       </w:r>
       <w:r>
         <w:rPr>
@@ -4056,7 +4067,13 @@
         <w:rPr>
           <w:rStyle w:val="VerbatimChar"/>
         </w:rPr>
-        <w:t>starlette</w:t>
+        <w:t>‎</w:t>
+      </w:r>
+      <w:r>
+        <w:rPr>
+          <w:rStyle w:val="VerbatimChar"/>
+        </w:rPr>
+        <w:t>starlette‎</w:t>
       </w:r>
       <w:r>
         <w:rPr>
@@ -4074,7 +4091,13 @@
         <w:rPr>
           <w:rStyle w:val="VerbatimChar"/>
         </w:rPr>
-        <w:t>uvicorn</w:t>
+        <w:t>‎</w:t>
+      </w:r>
+      <w:r>
+        <w:rPr>
+          <w:rStyle w:val="VerbatimChar"/>
+        </w:rPr>
+        <w:t>uvicorn‎</w:t>
       </w:r>
       <w:r>
         <w:rPr>
@@ -4092,7 +4115,13 @@
         <w:rPr>
           <w:rStyle w:val="VerbatimChar"/>
         </w:rPr>
-        <w:t>pydantic</w:t>
+        <w:t>‎</w:t>
+      </w:r>
+      <w:r>
+        <w:rPr>
+          <w:rStyle w:val="VerbatimChar"/>
+        </w:rPr>
+        <w:t>pydantic‎</w:t>
       </w:r>
       <w:r>
         <w:rPr>
@@ -4135,7 +4164,7 @@
         <w:rPr>
           <w:rStyle w:val="VerbatimChar"/>
         </w:rPr>
-        <w:t>tsc</w:t>
+        <w:t>‎tsc‎</w:t>
       </w:r>
       <w:r>
         <w:rPr/>
@@ -4197,14 +4226,31 @@
         <w:rPr>
           <w:rStyle w:val="VerbatimChar"/>
         </w:rPr>
-        <w:t>data/raw/oulad</w:t>
+        <w:t>‎data/raw/oulad/‎</w:t>
+      </w:r>
+      <w:r>
+        <w:rPr>
+          <w:rtl w:val="true"/>
+        </w:rPr>
+        <w:t xml:space="preserve"> </w:t>
+      </w:r>
+      <w:r>
+        <w:rPr>
+          <w:rtl w:val="true"/>
+        </w:rPr>
+        <w:t>و</w:t>
       </w:r>
       <w:r>
         <w:rPr>
           <w:rStyle w:val="VerbatimChar"/>
-          <w:rtl w:val="true"/>
-        </w:rPr>
-        <w:t>/</w:t>
+        </w:rPr>
+        <w:t>‎</w:t>
+      </w:r>
+      <w:r>
+        <w:rPr>
+          <w:rStyle w:val="VerbatimChar"/>
+        </w:rPr>
+        <w:t>data/cache/‎</w:t>
       </w:r>
       <w:r>
         <w:rPr>
@@ -4222,14 +4268,13 @@
         <w:rPr>
           <w:rStyle w:val="VerbatimChar"/>
         </w:rPr>
-        <w:t>data/cache</w:t>
+        <w:t>‎</w:t>
       </w:r>
       <w:r>
         <w:rPr>
           <w:rStyle w:val="VerbatimChar"/>
-          <w:rtl w:val="true"/>
-        </w:rPr>
-        <w:t>/</w:t>
+        </w:rPr>
+        <w:t>artifacts/‎</w:t>
       </w:r>
       <w:r>
         <w:rPr>
@@ -4241,56 +4286,43 @@
         <w:rPr>
           <w:rtl w:val="true"/>
         </w:rPr>
-        <w:t>و</w:t>
+        <w:t xml:space="preserve">وملف </w:t>
       </w:r>
       <w:r>
         <w:rPr>
           <w:rStyle w:val="VerbatimChar"/>
         </w:rPr>
-        <w:t>artifacts</w:t>
+        <w:t>‎</w:t>
       </w:r>
       <w:r>
         <w:rPr>
           <w:rStyle w:val="VerbatimChar"/>
-          <w:rtl w:val="true"/>
-        </w:rPr>
-        <w:t>/</w:t>
-      </w:r>
-      <w:r>
-        <w:rPr>
-          <w:rtl w:val="true"/>
-        </w:rPr>
-        <w:t xml:space="preserve"> </w:t>
-      </w:r>
-      <w:r>
-        <w:rPr>
-          <w:rtl w:val="true"/>
-        </w:rPr>
-        <w:t xml:space="preserve">وملف </w:t>
+        </w:rPr>
+        <w:t>results/dev2013/hybrid_frozen.json‎</w:t>
+      </w:r>
+      <w:r>
+        <w:rPr>
+          <w:rtl w:val="true"/>
+        </w:rPr>
+        <w:t xml:space="preserve">. </w:t>
+      </w:r>
+      <w:r>
+        <w:rPr>
+          <w:rtl w:val="true"/>
+        </w:rPr>
+        <w:t xml:space="preserve">إن غابت، يرد الخادم بخطأ </w:t>
       </w:r>
       <w:r>
         <w:rPr>
           <w:rStyle w:val="VerbatimChar"/>
         </w:rPr>
-        <w:t>results/dev2013/hybrid_frozen.json</w:t>
-      </w:r>
-      <w:r>
-        <w:rPr>
-          <w:rtl w:val="true"/>
-        </w:rPr>
-        <w:t xml:space="preserve">. </w:t>
-      </w:r>
-      <w:r>
-        <w:rPr>
-          <w:rtl w:val="true"/>
-        </w:rPr>
-        <w:t xml:space="preserve">إن غابت، يرد الخادم بخطأ </w:t>
+        <w:t>‎</w:t>
       </w:r>
       <w:r>
         <w:rPr>
           <w:rStyle w:val="VerbatimChar"/>
         </w:rPr>
-        <w:t>artifacts_missing</w:t>
+        <w:t>artifacts_missing‎</w:t>
       </w:r>
       <w:r>
         <w:rPr>
@@ -4449,7 +4481,7 @@
         <w:bidi w:val="1"/>
         <w:rPr/>
       </w:pPr>
-      <w:bookmarkStart w:id="14" w:name="__RefHeading___Toc2446_5898764"/>
+      <w:bookmarkStart w:id="14" w:name="__RefHeading___Toc2441_3553792858"/>
       <w:bookmarkStart w:id="15" w:name="البدء-السريع-لمشغل-النظام"/>
       <w:bookmarkEnd w:id="14"/>
       <w:r>
@@ -4484,15 +4516,14 @@
       <w:r>
         <w:rPr>
           <w:rStyle w:val="VerbatimChar"/>
-          <w:rtl w:val="true"/>
-        </w:rPr>
-        <w:t>/</w:t>
+        </w:rPr>
+        <w:t>‎</w:t>
       </w:r>
       <w:r>
         <w:rPr>
           <w:rStyle w:val="VerbatimChar"/>
         </w:rPr>
-        <w:t>home/user/rec-eLearning-sys</w:t>
+        <w:t>/home/user/rec-eLearning-sys‎</w:t>
       </w:r>
       <w:r>
         <w:rPr>
@@ -4519,7 +4550,7 @@
         <w:bidi w:val="1"/>
         <w:rPr/>
       </w:pPr>
-      <w:bookmarkStart w:id="16" w:name="__RefHeading___Toc2448_5898764"/>
+      <w:bookmarkStart w:id="16" w:name="__RefHeading___Toc2443_3553792858"/>
       <w:bookmarkStart w:id="17" w:name="الخطوات-الأساسية"/>
       <w:bookmarkEnd w:id="16"/>
       <w:r>
@@ -4718,14 +4749,13 @@
         <w:rPr>
           <w:rStyle w:val="VerbatimChar"/>
         </w:rPr>
-        <w:t>data/cache</w:t>
+        <w:t>‎</w:t>
       </w:r>
       <w:r>
         <w:rPr>
           <w:rStyle w:val="VerbatimChar"/>
-          <w:rtl w:val="true"/>
-        </w:rPr>
-        <w:t>/</w:t>
+        </w:rPr>
+        <w:t>data/cache/‎</w:t>
       </w:r>
       <w:r>
         <w:rPr>
@@ -4743,20 +4773,13 @@
         <w:rPr>
           <w:rStyle w:val="VerbatimChar"/>
         </w:rPr>
-        <w:t>503</w:t>
+        <w:t>‎</w:t>
       </w:r>
       <w:r>
         <w:rPr>
           <w:rStyle w:val="VerbatimChar"/>
-          <w:rtl w:val="true"/>
-        </w:rPr>
-        <w:t xml:space="preserve"> </w:t>
-      </w:r>
-      <w:r>
-        <w:rPr>
-          <w:rStyle w:val="VerbatimChar"/>
-        </w:rPr>
-        <w:t>artifacts_missing</w:t>
+        </w:rPr>
+        <w:t>503 artifacts_missing‎</w:t>
       </w:r>
       <w:r>
         <w:rPr>
@@ -4893,7 +4916,13 @@
         <w:rPr>
           <w:rStyle w:val="VerbatimChar"/>
         </w:rPr>
-        <w:t>src/frontend/dist/js</w:t>
+        <w:t>‎</w:t>
+      </w:r>
+      <w:r>
+        <w:rPr>
+          <w:rStyle w:val="VerbatimChar"/>
+        </w:rPr>
+        <w:t>src/frontend/dist/js‎</w:t>
       </w:r>
       <w:r>
         <w:rPr>
@@ -4943,14 +4972,13 @@
         <w:rPr>
           <w:rStyle w:val="VerbatimChar"/>
         </w:rPr>
-        <w:t>dist</w:t>
+        <w:t>‎</w:t>
       </w:r>
       <w:r>
         <w:rPr>
           <w:rStyle w:val="VerbatimChar"/>
-          <w:rtl w:val="true"/>
-        </w:rPr>
-        <w:t>/</w:t>
+        </w:rPr>
+        <w:t>dist/‎</w:t>
       </w:r>
       <w:r>
         <w:rPr>
@@ -4980,14 +5008,13 @@
         <w:rPr>
           <w:rStyle w:val="VerbatimChar"/>
         </w:rPr>
-        <w:t>dist</w:t>
+        <w:t>‎</w:t>
       </w:r>
       <w:r>
         <w:rPr>
           <w:rStyle w:val="VerbatimChar"/>
-          <w:rtl w:val="true"/>
-        </w:rPr>
-        <w:t>/</w:t>
+        </w:rPr>
+        <w:t>dist/‎</w:t>
       </w:r>
       <w:r>
         <w:rPr>
@@ -5114,7 +5141,13 @@
         <w:rPr>
           <w:rStyle w:val="VerbatimChar"/>
         </w:rPr>
-        <w:t>http://127.0.0.1:8000</w:t>
+        <w:t>‎</w:t>
+      </w:r>
+      <w:r>
+        <w:rPr>
+          <w:rStyle w:val="VerbatimChar"/>
+        </w:rPr>
+        <w:t>http://127.0.0.1:8000‎</w:t>
       </w:r>
       <w:r>
         <w:rPr>
@@ -5131,9 +5164,14 @@
       <w:r>
         <w:rPr>
           <w:rStyle w:val="VerbatimChar"/>
-          <w:rtl w:val="true"/>
-        </w:rPr>
-        <w:t>/</w:t>
+        </w:rPr>
+        <w:t>‎</w:t>
+      </w:r>
+      <w:r>
+        <w:rPr>
+          <w:rStyle w:val="VerbatimChar"/>
+        </w:rPr>
+        <w:t>/‎</w:t>
       </w:r>
       <w:r>
         <w:rPr>
@@ -5150,22 +5188,200 @@
       <w:r>
         <w:rPr>
           <w:rStyle w:val="VerbatimChar"/>
-          <w:rtl w:val="true"/>
-        </w:rPr>
-        <w:t>/</w:t>
+        </w:rPr>
+        <w:t>‎</w:t>
       </w:r>
       <w:r>
         <w:rPr>
           <w:rStyle w:val="VerbatimChar"/>
         </w:rPr>
-        <w:t>api</w:t>
+        <w:t>/api/‎</w:t>
+      </w:r>
+      <w:r>
+        <w:rPr>
+          <w:rtl w:val="true"/>
+        </w:rPr>
+        <w:t xml:space="preserve">. </w:t>
+      </w:r>
+      <w:r>
+        <w:rPr>
+          <w:rtl w:val="true"/>
+        </w:rPr>
+        <w:t xml:space="preserve">خيار </w:t>
       </w:r>
       <w:r>
         <w:rPr>
           <w:rStyle w:val="VerbatimChar"/>
-          <w:rtl w:val="true"/>
-        </w:rPr>
-        <w:t>/</w:t>
+        </w:rPr>
+        <w:t>‎</w:t>
+      </w:r>
+      <w:r>
+        <w:rPr>
+          <w:rStyle w:val="VerbatimChar"/>
+        </w:rPr>
+        <w:t>--warm‎</w:t>
+      </w:r>
+      <w:r>
+        <w:rPr>
+          <w:rtl w:val="true"/>
+        </w:rPr>
+        <w:t xml:space="preserve"> </w:t>
+      </w:r>
+      <w:r>
+        <w:rPr>
+          <w:rtl w:val="true"/>
+        </w:rPr>
+        <w:t xml:space="preserve">يسخّن في الخلفية ستة أيام للعرض الافتراضي </w:t>
+      </w:r>
+      <w:r>
+        <w:rPr>
+          <w:rtl w:val="true"/>
+        </w:rPr>
+        <w:t>(</w:t>
+      </w:r>
+      <w:r>
+        <w:rPr/>
+        <w:t>75</w:t>
+      </w:r>
+      <w:r>
+        <w:rPr>
+          <w:rtl w:val="true"/>
+        </w:rPr>
+        <w:t xml:space="preserve"> </w:t>
+      </w:r>
+      <w:r>
+        <w:rPr>
+          <w:rtl w:val="true"/>
+        </w:rPr>
+        <w:t>و</w:t>
+      </w:r>
+      <w:r>
+        <w:rPr/>
+        <w:t>56</w:t>
+      </w:r>
+      <w:r>
+        <w:rPr>
+          <w:rtl w:val="true"/>
+        </w:rPr>
+        <w:t xml:space="preserve"> </w:t>
+      </w:r>
+      <w:r>
+        <w:rPr>
+          <w:rtl w:val="true"/>
+        </w:rPr>
+        <w:t>و</w:t>
+      </w:r>
+      <w:r>
+        <w:rPr/>
+        <w:t>70</w:t>
+      </w:r>
+      <w:r>
+        <w:rPr>
+          <w:rtl w:val="true"/>
+        </w:rPr>
+        <w:t xml:space="preserve"> </w:t>
+      </w:r>
+      <w:r>
+        <w:rPr>
+          <w:rtl w:val="true"/>
+        </w:rPr>
+        <w:t>و</w:t>
+      </w:r>
+      <w:r>
+        <w:rPr/>
+        <w:t>112</w:t>
+      </w:r>
+      <w:r>
+        <w:rPr>
+          <w:rtl w:val="true"/>
+        </w:rPr>
+        <w:t xml:space="preserve"> </w:t>
+      </w:r>
+      <w:r>
+        <w:rPr>
+          <w:rtl w:val="true"/>
+        </w:rPr>
+        <w:t>و</w:t>
+      </w:r>
+      <w:r>
+        <w:rPr/>
+        <w:t>126</w:t>
+      </w:r>
+      <w:r>
+        <w:rPr>
+          <w:rtl w:val="true"/>
+        </w:rPr>
+        <w:t xml:space="preserve"> </w:t>
+      </w:r>
+      <w:r>
+        <w:rPr>
+          <w:rtl w:val="true"/>
+        </w:rPr>
+        <w:t>و</w:t>
+      </w:r>
+      <w:r>
+        <w:rPr/>
+        <w:t>182</w:t>
+      </w:r>
+      <w:r>
+        <w:rPr>
+          <w:rtl w:val="true"/>
+        </w:rPr>
+        <w:t>)</w:t>
+      </w:r>
+      <w:r>
+        <w:rPr>
+          <w:rtl w:val="true"/>
+        </w:rPr>
+        <w:t xml:space="preserve">، ويستغرق ذلك نحو </w:t>
+      </w:r>
+      <w:r>
+        <w:rPr/>
+        <w:t>28</w:t>
+      </w:r>
+      <w:r>
+        <w:rPr>
+          <w:rtl w:val="true"/>
+        </w:rPr>
+        <w:t xml:space="preserve"> </w:t>
+      </w:r>
+      <w:r>
+        <w:rPr>
+          <w:rtl w:val="true"/>
+        </w:rPr>
+        <w:t xml:space="preserve">ثانية كاملة، ويصبح اليوم </w:t>
+      </w:r>
+      <w:r>
+        <w:rPr/>
+        <w:t>75</w:t>
+      </w:r>
+      <w:r>
+        <w:rPr>
+          <w:rtl w:val="true"/>
+        </w:rPr>
+        <w:t xml:space="preserve"> </w:t>
+      </w:r>
+      <w:r>
+        <w:rPr>
+          <w:rtl w:val="true"/>
+        </w:rPr>
+        <w:t xml:space="preserve">جاهزاً بعد نحو </w:t>
+      </w:r>
+      <w:r>
+        <w:rPr/>
+        <w:t>12</w:t>
+      </w:r>
+      <w:r>
+        <w:rPr>
+          <w:rtl w:val="true"/>
+        </w:rPr>
+        <w:t xml:space="preserve"> </w:t>
+      </w:r>
+      <w:r>
+        <w:rPr>
+          <w:rtl w:val="true"/>
+        </w:rPr>
+        <w:t>ثانية</w:t>
       </w:r>
       <w:r>
         <w:rPr>
@@ -5177,207 +5393,19 @@
         <w:rPr>
           <w:rtl w:val="true"/>
         </w:rPr>
-        <w:t xml:space="preserve">خيار </w:t>
+        <w:t xml:space="preserve">الخيار </w:t>
       </w:r>
       <w:r>
         <w:rPr>
           <w:rStyle w:val="VerbatimChar"/>
-          <w:rtl w:val="true"/>
-        </w:rPr>
-        <w:t>--</w:t>
+        </w:rPr>
+        <w:t>‎</w:t>
       </w:r>
       <w:r>
         <w:rPr>
           <w:rStyle w:val="VerbatimChar"/>
         </w:rPr>
-        <w:t>warm</w:t>
-      </w:r>
-      <w:r>
-        <w:rPr>
-          <w:rtl w:val="true"/>
-        </w:rPr>
-        <w:t xml:space="preserve"> </w:t>
-      </w:r>
-      <w:r>
-        <w:rPr>
-          <w:rtl w:val="true"/>
-        </w:rPr>
-        <w:t xml:space="preserve">يسخّن في الخلفية ستة أيام للعرض الافتراضي </w:t>
-      </w:r>
-      <w:r>
-        <w:rPr>
-          <w:rtl w:val="true"/>
-        </w:rPr>
-        <w:t>(</w:t>
-      </w:r>
-      <w:r>
-        <w:rPr/>
-        <w:t>75</w:t>
-      </w:r>
-      <w:r>
-        <w:rPr>
-          <w:rtl w:val="true"/>
-        </w:rPr>
-        <w:t xml:space="preserve"> </w:t>
-      </w:r>
-      <w:r>
-        <w:rPr>
-          <w:rtl w:val="true"/>
-        </w:rPr>
-        <w:t>و</w:t>
-      </w:r>
-      <w:r>
-        <w:rPr/>
-        <w:t>56</w:t>
-      </w:r>
-      <w:r>
-        <w:rPr>
-          <w:rtl w:val="true"/>
-        </w:rPr>
-        <w:t xml:space="preserve"> </w:t>
-      </w:r>
-      <w:r>
-        <w:rPr>
-          <w:rtl w:val="true"/>
-        </w:rPr>
-        <w:t>و</w:t>
-      </w:r>
-      <w:r>
-        <w:rPr/>
-        <w:t>70</w:t>
-      </w:r>
-      <w:r>
-        <w:rPr>
-          <w:rtl w:val="true"/>
-        </w:rPr>
-        <w:t xml:space="preserve"> </w:t>
-      </w:r>
-      <w:r>
-        <w:rPr>
-          <w:rtl w:val="true"/>
-        </w:rPr>
-        <w:t>و</w:t>
-      </w:r>
-      <w:r>
-        <w:rPr/>
-        <w:t>112</w:t>
-      </w:r>
-      <w:r>
-        <w:rPr>
-          <w:rtl w:val="true"/>
-        </w:rPr>
-        <w:t xml:space="preserve"> </w:t>
-      </w:r>
-      <w:r>
-        <w:rPr>
-          <w:rtl w:val="true"/>
-        </w:rPr>
-        <w:t>و</w:t>
-      </w:r>
-      <w:r>
-        <w:rPr/>
-        <w:t>126</w:t>
-      </w:r>
-      <w:r>
-        <w:rPr>
-          <w:rtl w:val="true"/>
-        </w:rPr>
-        <w:t xml:space="preserve"> </w:t>
-      </w:r>
-      <w:r>
-        <w:rPr>
-          <w:rtl w:val="true"/>
-        </w:rPr>
-        <w:t>و</w:t>
-      </w:r>
-      <w:r>
-        <w:rPr/>
-        <w:t>182</w:t>
-      </w:r>
-      <w:r>
-        <w:rPr>
-          <w:rtl w:val="true"/>
-        </w:rPr>
-        <w:t>)</w:t>
-      </w:r>
-      <w:r>
-        <w:rPr>
-          <w:rtl w:val="true"/>
-        </w:rPr>
-        <w:t xml:space="preserve">، ويستغرق ذلك نحو </w:t>
-      </w:r>
-      <w:r>
-        <w:rPr/>
-        <w:t>28</w:t>
-      </w:r>
-      <w:r>
-        <w:rPr>
-          <w:rtl w:val="true"/>
-        </w:rPr>
-        <w:t xml:space="preserve"> </w:t>
-      </w:r>
-      <w:r>
-        <w:rPr>
-          <w:rtl w:val="true"/>
-        </w:rPr>
-        <w:t xml:space="preserve">ثانية كاملة، ويصبح اليوم </w:t>
-      </w:r>
-      <w:r>
-        <w:rPr/>
-        <w:t>75</w:t>
-      </w:r>
-      <w:r>
-        <w:rPr>
-          <w:rtl w:val="true"/>
-        </w:rPr>
-        <w:t xml:space="preserve"> </w:t>
-      </w:r>
-      <w:r>
-        <w:rPr>
-          <w:rtl w:val="true"/>
-        </w:rPr>
-        <w:t xml:space="preserve">جاهزاً بعد نحو </w:t>
-      </w:r>
-      <w:r>
-        <w:rPr/>
-        <w:t>12</w:t>
-      </w:r>
-      <w:r>
-        <w:rPr>
-          <w:rtl w:val="true"/>
-        </w:rPr>
-        <w:t xml:space="preserve"> </w:t>
-      </w:r>
-      <w:r>
-        <w:rPr>
-          <w:rtl w:val="true"/>
-        </w:rPr>
-        <w:t>ثانية</w:t>
-      </w:r>
-      <w:r>
-        <w:rPr>
-          <w:rtl w:val="true"/>
-        </w:rPr>
-        <w:t xml:space="preserve">. </w:t>
-      </w:r>
-      <w:r>
-        <w:rPr>
-          <w:rtl w:val="true"/>
-        </w:rPr>
-        <w:t xml:space="preserve">الخيار </w:t>
-      </w:r>
-      <w:r>
-        <w:rPr>
-          <w:rStyle w:val="VerbatimChar"/>
-          <w:rtl w:val="true"/>
-        </w:rPr>
-        <w:t>--</w:t>
-      </w:r>
-      <w:r>
-        <w:rPr>
-          <w:rStyle w:val="VerbatimChar"/>
-        </w:rPr>
-        <w:t>warm-weekly</w:t>
+        <w:t>--warm-weekly‎</w:t>
       </w:r>
       <w:r>
         <w:rPr>
@@ -5452,7 +5480,13 @@
         <w:rPr>
           <w:rStyle w:val="VerbatimChar"/>
         </w:rPr>
-        <w:t>warm.state</w:t>
+        <w:t>‎</w:t>
+      </w:r>
+      <w:r>
+        <w:rPr>
+          <w:rStyle w:val="VerbatimChar"/>
+        </w:rPr>
+        <w:t>warm.state‎</w:t>
       </w:r>
       <w:r>
         <w:rPr>
@@ -5464,7 +5498,7 @@
         <w:rPr>
           <w:rStyle w:val="VerbatimChar"/>
         </w:rPr>
-        <w:t>pending</w:t>
+        <w:t>‎pending‎</w:t>
       </w:r>
       <w:r>
         <w:rPr>
@@ -5482,7 +5516,13 @@
         <w:rPr>
           <w:rStyle w:val="VerbatimChar"/>
         </w:rPr>
-        <w:t>running</w:t>
+        <w:t>‎</w:t>
+      </w:r>
+      <w:r>
+        <w:rPr>
+          <w:rStyle w:val="VerbatimChar"/>
+        </w:rPr>
+        <w:t>running‎</w:t>
       </w:r>
       <w:r>
         <w:rPr>
@@ -5500,7 +5540,13 @@
         <w:rPr>
           <w:rStyle w:val="VerbatimChar"/>
         </w:rPr>
-        <w:t>done</w:t>
+        <w:t>‎</w:t>
+      </w:r>
+      <w:r>
+        <w:rPr>
+          <w:rStyle w:val="VerbatimChar"/>
+        </w:rPr>
+        <w:t>done‎</w:t>
       </w:r>
       <w:r>
         <w:rPr>
@@ -5518,7 +5564,13 @@
         <w:rPr>
           <w:rStyle w:val="VerbatimChar"/>
         </w:rPr>
-        <w:t>failed</w:t>
+        <w:t>‎</w:t>
+      </w:r>
+      <w:r>
+        <w:rPr>
+          <w:rStyle w:val="VerbatimChar"/>
+        </w:rPr>
+        <w:t>failed‎</w:t>
       </w:r>
       <w:r>
         <w:rPr>
@@ -5611,14 +5663,13 @@
         <w:rPr>
           <w:rStyle w:val="VerbatimChar"/>
         </w:rPr>
-        <w:t>http://127.0.0.1:8000</w:t>
+        <w:t>‎</w:t>
       </w:r>
       <w:r>
         <w:rPr>
           <w:rStyle w:val="VerbatimChar"/>
-          <w:rtl w:val="true"/>
-        </w:rPr>
-        <w:t>/</w:t>
+        </w:rPr>
+        <w:t>http://127.0.0.1:8000/‎</w:t>
       </w:r>
       <w:r>
         <w:rPr>
@@ -5793,40 +5844,38 @@
       <w:r>
         <w:rPr>
           <w:rStyle w:val="VerbatimChar"/>
-          <w:rtl w:val="true"/>
-        </w:rPr>
-        <w:t>/</w:t>
+        </w:rPr>
+        <w:t>‎</w:t>
       </w:r>
       <w:r>
         <w:rPr>
           <w:rStyle w:val="VerbatimChar"/>
         </w:rPr>
-        <w:t>api/instructor</w:t>
+        <w:t>/api/instructor/*‎</w:t>
+      </w:r>
+      <w:r>
+        <w:rPr>
+          <w:rtl w:val="true"/>
+        </w:rPr>
+        <w:t xml:space="preserve"> </w:t>
+      </w:r>
+      <w:r>
+        <w:rPr>
+          <w:rtl w:val="true"/>
+        </w:rPr>
+        <w:t xml:space="preserve">ترد بالخطأ </w:t>
       </w:r>
       <w:r>
         <w:rPr>
           <w:rStyle w:val="VerbatimChar"/>
-          <w:rtl w:val="true"/>
-        </w:rPr>
-        <w:t>/*</w:t>
-      </w:r>
-      <w:r>
-        <w:rPr>
-          <w:rtl w:val="true"/>
-        </w:rPr>
-        <w:t xml:space="preserve"> </w:t>
-      </w:r>
-      <w:r>
-        <w:rPr>
-          <w:rtl w:val="true"/>
-        </w:rPr>
-        <w:t xml:space="preserve">ترد بالخطأ </w:t>
+        </w:rPr>
+        <w:t>‎</w:t>
       </w:r>
       <w:r>
         <w:rPr>
           <w:rStyle w:val="VerbatimChar"/>
         </w:rPr>
-        <w:t>instructor_disabled</w:t>
+        <w:t>instructor_disabled‎</w:t>
       </w:r>
       <w:r>
         <w:rPr>
@@ -6086,10 +6135,9 @@
               <w:rPr>
                 <w:rStyle w:val="VerbatimChar"/>
                 <w:kern w:val="0"/>
-                <w:rtl w:val="true"/>
-                <w:lang w:val="en-US" w:eastAsia="en-US" w:bidi="ar-SA"/>
-              </w:rPr>
-              <w:t>--</w:t>
+                <w:lang w:val="en-US" w:eastAsia="en-US" w:bidi="ar-SA"/>
+              </w:rPr>
+              <w:t>‎</w:t>
             </w:r>
             <w:r>
               <w:rPr>
@@ -6097,7 +6145,7 @@
                 <w:kern w:val="0"/>
                 <w:lang w:val="en-US" w:eastAsia="en-US" w:bidi="ar-SA"/>
               </w:rPr>
-              <w:t>host 127.0.0.1</w:t>
+              <w:t>--host 127.0.0.1‎</w:t>
             </w:r>
           </w:p>
         </w:tc>
@@ -6185,10 +6233,9 @@
               <w:rPr>
                 <w:rStyle w:val="VerbatimChar"/>
                 <w:kern w:val="0"/>
-                <w:rtl w:val="true"/>
-                <w:lang w:val="en-US" w:eastAsia="en-US" w:bidi="ar-SA"/>
-              </w:rPr>
-              <w:t>--</w:t>
+                <w:lang w:val="en-US" w:eastAsia="en-US" w:bidi="ar-SA"/>
+              </w:rPr>
+              <w:t>‎</w:t>
             </w:r>
             <w:r>
               <w:rPr>
@@ -6196,7 +6243,7 @@
                 <w:kern w:val="0"/>
                 <w:lang w:val="en-US" w:eastAsia="en-US" w:bidi="ar-SA"/>
               </w:rPr>
-              <w:t>port 8001</w:t>
+              <w:t>--port 8001‎</w:t>
             </w:r>
           </w:p>
         </w:tc>
@@ -6284,10 +6331,9 @@
               <w:rPr>
                 <w:rStyle w:val="VerbatimChar"/>
                 <w:kern w:val="0"/>
-                <w:rtl w:val="true"/>
-                <w:lang w:val="en-US" w:eastAsia="en-US" w:bidi="ar-SA"/>
-              </w:rPr>
-              <w:t>--</w:t>
+                <w:lang w:val="en-US" w:eastAsia="en-US" w:bidi="ar-SA"/>
+              </w:rPr>
+              <w:t>‎</w:t>
             </w:r>
             <w:r>
               <w:rPr>
@@ -6295,7 +6341,7 @@
                 <w:kern w:val="0"/>
                 <w:lang w:val="en-US" w:eastAsia="en-US" w:bidi="ar-SA"/>
               </w:rPr>
-              <w:t>warm-presentation BBB_2013J</w:t>
+              <w:t>--warm-presentation BBB_2013J‎</w:t>
             </w:r>
           </w:p>
         </w:tc>
@@ -6360,10 +6406,9 @@
               <w:rPr>
                 <w:rStyle w:val="VerbatimChar"/>
                 <w:kern w:val="0"/>
-                <w:rtl w:val="true"/>
-                <w:lang w:val="en-US" w:eastAsia="en-US" w:bidi="ar-SA"/>
-              </w:rPr>
-              <w:t>--</w:t>
+                <w:lang w:val="en-US" w:eastAsia="en-US" w:bidi="ar-SA"/>
+              </w:rPr>
+              <w:t>‎</w:t>
             </w:r>
             <w:r>
               <w:rPr>
@@ -6371,7 +6416,7 @@
                 <w:kern w:val="0"/>
                 <w:lang w:val="en-US" w:eastAsia="en-US" w:bidi="ar-SA"/>
               </w:rPr>
-              <w:t>warm-days 75,126</w:t>
+              <w:t>--warm-days 75,126‎</w:t>
             </w:r>
           </w:p>
         </w:tc>
@@ -6436,10 +6481,9 @@
               <w:rPr>
                 <w:rStyle w:val="VerbatimChar"/>
                 <w:kern w:val="0"/>
-                <w:rtl w:val="true"/>
-                <w:lang w:val="en-US" w:eastAsia="en-US" w:bidi="ar-SA"/>
-              </w:rPr>
-              <w:t>--</w:t>
+                <w:lang w:val="en-US" w:eastAsia="en-US" w:bidi="ar-SA"/>
+              </w:rPr>
+              <w:t>‎</w:t>
             </w:r>
             <w:r>
               <w:rPr>
@@ -6447,7 +6491,7 @@
                 <w:kern w:val="0"/>
                 <w:lang w:val="en-US" w:eastAsia="en-US" w:bidi="ar-SA"/>
               </w:rPr>
-              <w:t>log-level debug</w:t>
+              <w:t>--log-level debug‎</w:t>
             </w:r>
           </w:p>
         </w:tc>
@@ -6603,7 +6647,7 @@
         <w:bidi w:val="1"/>
         <w:rPr/>
       </w:pPr>
-      <w:bookmarkStart w:id="18" w:name="__RefHeading___Toc2450_5898764"/>
+      <w:bookmarkStart w:id="18" w:name="__RefHeading___Toc2445_3553792858"/>
       <w:bookmarkStart w:id="19" w:name="وضع-المحاكاة-بلا-خادم"/>
       <w:bookmarkEnd w:id="18"/>
       <w:r>
@@ -6779,14 +6823,13 @@
         <w:rPr>
           <w:rStyle w:val="VerbatimChar"/>
         </w:rPr>
-        <w:t>http://127.0.0.1:8000</w:t>
+        <w:t>‎</w:t>
       </w:r>
       <w:r>
         <w:rPr>
           <w:rStyle w:val="VerbatimChar"/>
-          <w:rtl w:val="true"/>
-        </w:rPr>
-        <w:t>/</w:t>
+        </w:rPr>
+        <w:t>http://127.0.0.1:8000/‎</w:t>
       </w:r>
       <w:r>
         <w:rPr>
@@ -6804,7 +6847,13 @@
         <w:rPr>
           <w:rStyle w:val="VerbatimChar"/>
         </w:rPr>
-        <w:t>GET /api/health</w:t>
+        <w:t>‎</w:t>
+      </w:r>
+      <w:r>
+        <w:rPr>
+          <w:rStyle w:val="VerbatimChar"/>
+        </w:rPr>
+        <w:t>GET /api/health‎</w:t>
       </w:r>
       <w:r>
         <w:rPr>
@@ -6890,15 +6939,14 @@
       <w:r>
         <w:rPr>
           <w:rStyle w:val="VerbatimChar"/>
-          <w:rtl w:val="true"/>
-        </w:rPr>
-        <w:t>?</w:t>
+        </w:rPr>
+        <w:t>‎</w:t>
       </w:r>
       <w:r>
         <w:rPr>
           <w:rStyle w:val="VerbatimChar"/>
         </w:rPr>
-        <w:t>mock=1</w:t>
+        <w:t>?mock=1‎</w:t>
       </w:r>
       <w:r>
         <w:rPr>
@@ -6928,7 +6976,13 @@
         <w:rPr>
           <w:rStyle w:val="VerbatimChar"/>
         </w:rPr>
-        <w:t>sessionStorage</w:t>
+        <w:t>‎</w:t>
+      </w:r>
+      <w:r>
+        <w:rPr>
+          <w:rStyle w:val="VerbatimChar"/>
+        </w:rPr>
+        <w:t>sessionStorage‎</w:t>
       </w:r>
       <w:r>
         <w:rPr>
@@ -6950,15 +7004,14 @@
       <w:r>
         <w:rPr>
           <w:rStyle w:val="VerbatimChar"/>
-          <w:rtl w:val="true"/>
-        </w:rPr>
-        <w:t>?</w:t>
+        </w:rPr>
+        <w:t>‎</w:t>
       </w:r>
       <w:r>
         <w:rPr>
           <w:rStyle w:val="VerbatimChar"/>
         </w:rPr>
-        <w:t>mock=0</w:t>
+        <w:t>?mock=0‎</w:t>
       </w:r>
       <w:r>
         <w:rPr>
@@ -7035,7 +7088,13 @@
         <w:rPr>
           <w:rStyle w:val="VerbatimChar"/>
         </w:rPr>
-        <w:t>BBB_2013J</w:t>
+        <w:t>‎</w:t>
+      </w:r>
+      <w:r>
+        <w:rPr>
+          <w:rStyle w:val="VerbatimChar"/>
+        </w:rPr>
+        <w:t>BBB_2013J‎</w:t>
       </w:r>
       <w:r>
         <w:rPr>
@@ -7047,7 +7106,13 @@
         <w:rPr>
           <w:rStyle w:val="VerbatimChar"/>
         </w:rPr>
-        <w:t>FFF_2013J</w:t>
+        <w:t>‎</w:t>
+      </w:r>
+      <w:r>
+        <w:rPr>
+          <w:rStyle w:val="VerbatimChar"/>
+        </w:rPr>
+        <w:t>FFF_2013J‎</w:t>
       </w:r>
       <w:r>
         <w:rPr>
@@ -7065,7 +7130,13 @@
         <w:rPr>
           <w:rStyle w:val="VerbatimChar"/>
         </w:rPr>
-        <w:t>BBB_2014J</w:t>
+        <w:t>‎</w:t>
+      </w:r>
+      <w:r>
+        <w:rPr>
+          <w:rStyle w:val="VerbatimChar"/>
+        </w:rPr>
+        <w:t>BBB_2014J‎</w:t>
       </w:r>
       <w:r>
         <w:rPr>
@@ -7109,8 +7180,8 @@
         <w:bidi w:val="1"/>
         <w:rPr/>
       </w:pPr>
-      <w:bookmarkStart w:id="20" w:name="__RefHeading___Toc2452_5898764"/>
-      <w:bookmarkStart w:id="21" w:name="لقطات-الشاشة"/>
+      <w:bookmarkStart w:id="20" w:name="__RefHeading___Toc2447_3553792858"/>
+      <w:bookmarkStart w:id="21" w:name="صور-الشاشة"/>
       <w:bookmarkEnd w:id="20"/>
       <w:r>
         <w:rPr/>
@@ -7126,7 +7197,7 @@
         <w:rPr>
           <w:rtl w:val="true"/>
         </w:rPr>
-        <w:t>لقطات الشاشة</w:t>
+        <w:t>صور الشاشة</w:t>
       </w:r>
     </w:p>
     <w:p>
@@ -7139,7 +7210,7 @@
         <w:rPr>
           <w:rtl w:val="true"/>
         </w:rPr>
-        <w:t>تُلتقط اللقطات بمتصفح حقيقي على خادم حي</w:t>
+        <w:t>تُلتقط صور الشاشة بمتصفح حقيقي على خادم حي</w:t>
       </w:r>
       <w:r>
         <w:rPr>
@@ -7238,20 +7309,19 @@
         <w:rPr>
           <w:rtl w:val="true"/>
         </w:rPr>
-        <w:t xml:space="preserve">تُحفظ اللقطات في </w:t>
+        <w:t xml:space="preserve">تُحفظ صور الشاشة في </w:t>
       </w:r>
       <w:r>
         <w:rPr>
           <w:rStyle w:val="VerbatimChar"/>
         </w:rPr>
-        <w:t>deliverables/05-user-guide/screenshots</w:t>
+        <w:t>‎</w:t>
       </w:r>
       <w:r>
         <w:rPr>
           <w:rStyle w:val="VerbatimChar"/>
-          <w:rtl w:val="true"/>
-        </w:rPr>
-        <w:t>/</w:t>
+        </w:rPr>
+        <w:t>deliverables/05-user-guide/screenshots/‎</w:t>
       </w:r>
       <w:r>
         <w:rPr>
@@ -7269,51 +7339,13 @@
         <w:rPr>
           <w:rStyle w:val="VerbatimChar"/>
         </w:rPr>
-        <w:t>live</w:t>
+        <w:t>‎</w:t>
       </w:r>
       <w:r>
         <w:rPr>
           <w:rStyle w:val="VerbatimChar"/>
-          <w:rtl w:val="true"/>
-        </w:rPr>
-        <w:t>-</w:t>
-      </w:r>
-      <w:r>
-        <w:rPr>
-          <w:rtl w:val="true"/>
-        </w:rPr>
-        <w:t xml:space="preserve">. </w:t>
-      </w:r>
-      <w:r>
-        <w:rPr>
-          <w:rtl w:val="true"/>
-        </w:rPr>
-        <w:t xml:space="preserve">اللقطات الأقدم بالبادئة </w:t>
-      </w:r>
-      <w:r>
-        <w:rPr>
-          <w:rStyle w:val="VerbatimChar"/>
-        </w:rPr>
-        <w:t>0x</w:t>
-      </w:r>
-      <w:r>
-        <w:rPr>
-          <w:rStyle w:val="VerbatimChar"/>
-          <w:rtl w:val="true"/>
-        </w:rPr>
-        <w:t>-</w:t>
-      </w:r>
-      <w:r>
-        <w:rPr>
-          <w:rtl w:val="true"/>
-        </w:rPr>
-        <w:t xml:space="preserve"> </w:t>
-      </w:r>
-      <w:r>
-        <w:rPr>
-          <w:rtl w:val="true"/>
-        </w:rPr>
-        <w:t>من وضع المحاكاة قديمة ولا يعتمد عليها هذا الدليل</w:t>
+        </w:rPr>
+        <w:t>live-‎</w:t>
       </w:r>
       <w:r>
         <w:rPr>
@@ -7329,7 +7361,7 @@
         <w:bidi w:val="1"/>
         <w:rPr/>
       </w:pPr>
-      <w:bookmarkStart w:id="22" w:name="__RefHeading___Toc2454_5898764"/>
+      <w:bookmarkStart w:id="22" w:name="__RefHeading___Toc2449_3553792858"/>
       <w:bookmarkStart w:id="23" w:name="استكشاف-الأخطاء-الشائعة"/>
       <w:bookmarkEnd w:id="22"/>
       <w:r>
@@ -7598,18 +7630,9 @@
               <w:rPr>
                 <w:rStyle w:val="VerbatimChar"/>
                 <w:kern w:val="0"/>
-                <w:rtl w:val="true"/>
-                <w:lang w:val="en-US" w:eastAsia="en-US" w:bidi="ar-SA"/>
-              </w:rPr>
-              <w:t>--</w:t>
-            </w:r>
-            <w:r>
-              <w:rPr>
-                <w:rStyle w:val="VerbatimChar"/>
-                <w:kern w:val="0"/>
-                <w:lang w:val="en-US" w:eastAsia="en-US" w:bidi="ar-SA"/>
-              </w:rPr>
-              <w:t>port 8001</w:t>
+                <w:lang w:val="en-US" w:eastAsia="en-US" w:bidi="ar-SA"/>
+              </w:rPr>
+              <w:t>‎--port 8001‎</w:t>
             </w:r>
           </w:p>
         </w:tc>
@@ -7652,24 +7675,15 @@
                 <w:kern w:val="0"/>
                 <w:lang w:val="en-US" w:eastAsia="en-US" w:bidi="ar-SA"/>
               </w:rPr>
-              <w:t>503</w:t>
+              <w:t>‎</w:t>
             </w:r>
             <w:r>
               <w:rPr>
                 <w:rStyle w:val="VerbatimChar"/>
                 <w:kern w:val="0"/>
-                <w:rtl w:val="true"/>
-                <w:lang w:val="en-US" w:eastAsia="en-US" w:bidi="ar-SA"/>
-              </w:rPr>
-              <w:t xml:space="preserve"> </w:t>
-            </w:r>
-            <w:r>
-              <w:rPr>
-                <w:rStyle w:val="VerbatimChar"/>
-                <w:kern w:val="0"/>
-                <w:lang w:val="en-US" w:eastAsia="en-US" w:bidi="ar-SA"/>
-              </w:rPr>
-              <w:t>artifacts_missing</w:t>
+                <w:lang w:val="en-US" w:eastAsia="en-US" w:bidi="ar-SA"/>
+              </w:rPr>
+              <w:t>503 artifacts_missing‎</w:t>
             </w:r>
           </w:p>
         </w:tc>
@@ -7741,16 +7755,15 @@
                 <w:kern w:val="0"/>
                 <w:lang w:val="en-US" w:eastAsia="en-US" w:bidi="ar-SA"/>
               </w:rPr>
-              <w:t>data/raw/oulad</w:t>
+              <w:t>‎</w:t>
             </w:r>
             <w:r>
               <w:rPr>
                 <w:rStyle w:val="VerbatimChar"/>
                 <w:kern w:val="0"/>
-                <w:rtl w:val="true"/>
-                <w:lang w:val="en-US" w:eastAsia="en-US" w:bidi="ar-SA"/>
-              </w:rPr>
-              <w:t>/</w:t>
+                <w:lang w:val="en-US" w:eastAsia="en-US" w:bidi="ar-SA"/>
+              </w:rPr>
+              <w:t>data/raw/oulad/‎</w:t>
             </w:r>
             <w:r>
               <w:rPr>
@@ -7774,16 +7787,15 @@
                 <w:kern w:val="0"/>
                 <w:lang w:val="en-US" w:eastAsia="en-US" w:bidi="ar-SA"/>
               </w:rPr>
-              <w:t>data/cache</w:t>
+              <w:t>‎</w:t>
             </w:r>
             <w:r>
               <w:rPr>
                 <w:rStyle w:val="VerbatimChar"/>
                 <w:kern w:val="0"/>
-                <w:rtl w:val="true"/>
-                <w:lang w:val="en-US" w:eastAsia="en-US" w:bidi="ar-SA"/>
-              </w:rPr>
-              <w:t>/</w:t>
+                <w:lang w:val="en-US" w:eastAsia="en-US" w:bidi="ar-SA"/>
+              </w:rPr>
+              <w:t>data/cache/‎</w:t>
             </w:r>
             <w:r>
               <w:rPr>
@@ -7807,16 +7819,15 @@
                 <w:kern w:val="0"/>
                 <w:lang w:val="en-US" w:eastAsia="en-US" w:bidi="ar-SA"/>
               </w:rPr>
-              <w:t>artifacts</w:t>
+              <w:t>‎</w:t>
             </w:r>
             <w:r>
               <w:rPr>
                 <w:rStyle w:val="VerbatimChar"/>
                 <w:kern w:val="0"/>
-                <w:rtl w:val="true"/>
-                <w:lang w:val="en-US" w:eastAsia="en-US" w:bidi="ar-SA"/>
-              </w:rPr>
-              <w:t>/</w:t>
+                <w:lang w:val="en-US" w:eastAsia="en-US" w:bidi="ar-SA"/>
+              </w:rPr>
+              <w:t>artifacts/‎</w:t>
             </w:r>
             <w:r>
               <w:rPr>
@@ -7832,7 +7843,15 @@
                 <w:kern w:val="0"/>
                 <w:lang w:val="en-US" w:eastAsia="en-US" w:bidi="ar-SA"/>
               </w:rPr>
-              <w:t>src/ml/README.md</w:t>
+              <w:t>‎</w:t>
+            </w:r>
+            <w:r>
+              <w:rPr>
+                <w:rStyle w:val="VerbatimChar"/>
+                <w:kern w:val="0"/>
+                <w:lang w:val="en-US" w:eastAsia="en-US" w:bidi="ar-SA"/>
+              </w:rPr>
+              <w:t>src/ml/README.md‎</w:t>
             </w:r>
             <w:r>
               <w:rPr>
@@ -8001,7 +8020,15 @@
                 <w:kern w:val="0"/>
                 <w:lang w:val="en-US" w:eastAsia="en-US" w:bidi="ar-SA"/>
               </w:rPr>
-              <w:t>GET /api/health</w:t>
+              <w:t>‎</w:t>
+            </w:r>
+            <w:r>
+              <w:rPr>
+                <w:rStyle w:val="VerbatimChar"/>
+                <w:kern w:val="0"/>
+                <w:lang w:val="en-US" w:eastAsia="en-US" w:bidi="ar-SA"/>
+              </w:rPr>
+              <w:t>GET /api/health‎</w:t>
             </w:r>
             <w:r>
               <w:rPr>
@@ -8092,16 +8119,15 @@
                 <w:kern w:val="0"/>
                 <w:lang w:val="en-US" w:eastAsia="en-US" w:bidi="ar-SA"/>
               </w:rPr>
-              <w:t>dist</w:t>
+              <w:t>‎</w:t>
             </w:r>
             <w:r>
               <w:rPr>
                 <w:rStyle w:val="VerbatimChar"/>
                 <w:kern w:val="0"/>
-                <w:rtl w:val="true"/>
-                <w:lang w:val="en-US" w:eastAsia="en-US" w:bidi="ar-SA"/>
-              </w:rPr>
-              <w:t>/</w:t>
+                <w:lang w:val="en-US" w:eastAsia="en-US" w:bidi="ar-SA"/>
+              </w:rPr>
+              <w:t>dist/‎</w:t>
             </w:r>
             <w:r>
               <w:rPr>
@@ -8157,7 +8183,15 @@
                 <w:kern w:val="0"/>
                 <w:lang w:val="en-US" w:eastAsia="en-US" w:bidi="ar-SA"/>
               </w:rPr>
-              <w:t>bash src/frontend/build.sh</w:t>
+              <w:t>‎</w:t>
+            </w:r>
+            <w:r>
+              <w:rPr>
+                <w:rStyle w:val="VerbatimChar"/>
+                <w:kern w:val="0"/>
+                <w:lang w:val="en-US" w:eastAsia="en-US" w:bidi="ar-SA"/>
+              </w:rPr>
+              <w:t>bash src/frontend/build.sh‎</w:t>
             </w:r>
           </w:p>
         </w:tc>
@@ -8364,10 +8398,9 @@
               <w:rPr>
                 <w:rStyle w:val="VerbatimChar"/>
                 <w:kern w:val="0"/>
-                <w:rtl w:val="true"/>
-                <w:lang w:val="en-US" w:eastAsia="en-US" w:bidi="ar-SA"/>
-              </w:rPr>
-              <w:t>--</w:t>
+                <w:lang w:val="en-US" w:eastAsia="en-US" w:bidi="ar-SA"/>
+              </w:rPr>
+              <w:t>‎</w:t>
             </w:r>
             <w:r>
               <w:rPr>
@@ -8375,7 +8408,7 @@
                 <w:kern w:val="0"/>
                 <w:lang w:val="en-US" w:eastAsia="en-US" w:bidi="ar-SA"/>
               </w:rPr>
-              <w:t>warm</w:t>
+              <w:t>--warm‎</w:t>
             </w:r>
             <w:r>
               <w:rPr>
@@ -8528,10 +8561,9 @@
               <w:rPr>
                 <w:rStyle w:val="VerbatimChar"/>
                 <w:kern w:val="0"/>
-                <w:rtl w:val="true"/>
-                <w:lang w:val="en-US" w:eastAsia="en-US" w:bidi="ar-SA"/>
-              </w:rPr>
-              <w:t>?</w:t>
+                <w:lang w:val="en-US" w:eastAsia="en-US" w:bidi="ar-SA"/>
+              </w:rPr>
+              <w:t>‎</w:t>
             </w:r>
             <w:r>
               <w:rPr>
@@ -8539,7 +8571,7 @@
                 <w:kern w:val="0"/>
                 <w:lang w:val="en-US" w:eastAsia="en-US" w:bidi="ar-SA"/>
               </w:rPr>
-              <w:t>mock=0</w:t>
+              <w:t>?mock=0‎</w:t>
             </w:r>
           </w:p>
         </w:tc>
@@ -8619,10 +8651,9 @@
               <w:rPr>
                 <w:rStyle w:val="VerbatimChar"/>
                 <w:kern w:val="0"/>
-                <w:rtl w:val="true"/>
-                <w:lang w:val="en-US" w:eastAsia="en-US" w:bidi="ar-SA"/>
-              </w:rPr>
-              <w:t>--</w:t>
+                <w:lang w:val="en-US" w:eastAsia="en-US" w:bidi="ar-SA"/>
+              </w:rPr>
+              <w:t>‎</w:t>
             </w:r>
             <w:r>
               <w:rPr>
@@ -8630,7 +8661,7 @@
                 <w:kern w:val="0"/>
                 <w:lang w:val="en-US" w:eastAsia="en-US" w:bidi="ar-SA"/>
               </w:rPr>
-              <w:t>no-instructor</w:t>
+              <w:t>--no-instructor‎</w:t>
             </w:r>
           </w:p>
         </w:tc>
@@ -8705,7 +8736,15 @@
                 <w:kern w:val="0"/>
                 <w:lang w:val="en-US" w:eastAsia="en-US" w:bidi="ar-SA"/>
               </w:rPr>
-              <w:t>day_out_of_range</w:t>
+              <w:t>‎</w:t>
+            </w:r>
+            <w:r>
+              <w:rPr>
+                <w:rStyle w:val="VerbatimChar"/>
+                <w:kern w:val="0"/>
+                <w:lang w:val="en-US" w:eastAsia="en-US" w:bidi="ar-SA"/>
+              </w:rPr>
+              <w:t>day_out_of_range‎</w:t>
             </w:r>
           </w:p>
         </w:tc>
@@ -8856,7 +8895,7 @@
         <w:bidi w:val="1"/>
         <w:rPr/>
       </w:pPr>
-      <w:bookmarkStart w:id="26" w:name="__RefHeading___Toc2456_5898764"/>
+      <w:bookmarkStart w:id="26" w:name="__RefHeading___Toc2451_3553792858"/>
       <w:bookmarkStart w:id="27" w:name="دليل-المتعلم"/>
       <w:bookmarkEnd w:id="26"/>
       <w:r>
@@ -8927,30 +8966,6 @@
         </w:rPr>
         <w:t>من هذا المقرر؟</w:t>
       </w:r>
-      <w:r>
-        <w:rPr>
-          <w:rtl w:val="true"/>
-        </w:rPr>
-        <w:t xml:space="preserve"> وتجيب عن ثلاثة أسئلة فرعية</w:t>
-      </w:r>
-      <w:r>
-        <w:rPr>
-          <w:rtl w:val="true"/>
-        </w:rPr>
-        <w:t xml:space="preserve">: </w:t>
-      </w:r>
-      <w:r>
-        <w:rPr>
-          <w:rtl w:val="true"/>
-        </w:rPr>
-        <w:t>لماذا، ومنذ متى، وما الذي تغيّر</w:t>
-      </w:r>
-      <w:r>
-        <w:rPr>
-          <w:rtl w:val="true"/>
-        </w:rPr>
-        <w:t>.</w:t>
-      </w:r>
     </w:p>
     <w:p>
       <w:pPr>
@@ -8958,7 +8973,7 @@
         <w:bidi w:val="1"/>
         <w:rPr/>
       </w:pPr>
-      <w:bookmarkStart w:id="28" w:name="__RefHeading___Toc2458_5898764"/>
+      <w:bookmarkStart w:id="28" w:name="__RefHeading___Toc2453_3553792858"/>
       <w:bookmarkStart w:id="29" w:name="الصفحة-الرئيسية"/>
       <w:bookmarkEnd w:id="28"/>
       <w:r>
@@ -9276,7 +9291,7 @@
         <w:rPr>
           <w:rtl w:val="true"/>
         </w:rPr>
-        <w:t xml:space="preserve">بطاقات للعروض التسعة للتطوير، وبطاقة لعرض </w:t>
+        <w:t xml:space="preserve">بطاقات للعروض التسعة للتطوير، وبطاقة واحدة لعرض </w:t>
       </w:r>
       <w:r>
         <w:rPr/>
@@ -9292,7 +9307,17 @@
         <w:rPr>
           <w:rtl w:val="true"/>
         </w:rPr>
-        <w:t xml:space="preserve">تحمل عبارة </w:t>
+        <w:t xml:space="preserve">هي </w:t>
+      </w:r>
+      <w:r>
+        <w:rPr/>
+        <w:t>BBB_2014J</w:t>
+      </w:r>
+      <w:r>
+        <w:rPr>
+          <w:rtl w:val="true"/>
+        </w:rPr>
+        <w:t xml:space="preserve">، تحمل عبارة </w:t>
       </w:r>
       <w:r>
         <w:rPr>
@@ -9304,13 +9329,101 @@
         <w:rPr>
           <w:rtl w:val="true"/>
         </w:rPr>
+        <w:t xml:space="preserve">تأكيدي </w:t>
+      </w:r>
+      <w:r>
+        <w:rPr/>
+        <w:t>2014</w:t>
+      </w:r>
+      <w:r>
+        <w:rPr>
+          <w:rtl w:val="true"/>
+        </w:rPr>
+        <w:t xml:space="preserve"> (</w:t>
+      </w:r>
+      <w:r>
+        <w:rPr>
+          <w:rtl w:val="true"/>
+        </w:rPr>
         <w:t>مقفل حتى النشر</w:t>
       </w:r>
       <w:r>
         <w:rPr>
           <w:rtl w:val="true"/>
         </w:rPr>
-        <w:t xml:space="preserve">». </w:t>
+        <w:t xml:space="preserve">)» </w:t>
+      </w:r>
+      <w:r>
+        <w:rPr>
+          <w:rtl w:val="true"/>
+        </w:rPr>
+        <w:t xml:space="preserve">وتعرض </w:t>
+      </w:r>
+      <w:r>
+        <w:rPr/>
+        <w:t>0</w:t>
+      </w:r>
+      <w:r>
+        <w:rPr>
+          <w:rtl w:val="true"/>
+        </w:rPr>
+        <w:t xml:space="preserve"> </w:t>
+      </w:r>
+      <w:r>
+        <w:rPr>
+          <w:rtl w:val="true"/>
+        </w:rPr>
+        <w:t>تسجيلاً و</w:t>
+      </w:r>
+      <w:r>
+        <w:rPr/>
+        <w:t>0</w:t>
+      </w:r>
+      <w:r>
+        <w:rPr>
+          <w:rtl w:val="true"/>
+        </w:rPr>
+        <w:t xml:space="preserve"> </w:t>
+      </w:r>
+      <w:r>
+        <w:rPr>
+          <w:rtl w:val="true"/>
+        </w:rPr>
+        <w:t>يوماً</w:t>
+      </w:r>
+      <w:r>
+        <w:rPr>
+          <w:rtl w:val="true"/>
+        </w:rPr>
+        <w:t xml:space="preserve">. </w:t>
+      </w:r>
+      <w:r>
+        <w:rPr>
+          <w:rtl w:val="true"/>
+        </w:rPr>
+        <w:t xml:space="preserve">الواجهة لا تعرض من عروض </w:t>
+      </w:r>
+      <w:r>
+        <w:rPr/>
+        <w:t>2014</w:t>
+      </w:r>
+      <w:r>
+        <w:rPr>
+          <w:rtl w:val="true"/>
+        </w:rPr>
+        <w:t xml:space="preserve"> </w:t>
+      </w:r>
+      <w:r>
+        <w:rPr>
+          <w:rtl w:val="true"/>
+        </w:rPr>
+        <w:t>إلا هذه البطاقة</w:t>
+      </w:r>
+      <w:r>
+        <w:rPr>
+          <w:rtl w:val="true"/>
+        </w:rPr>
+        <w:t xml:space="preserve">. </w:t>
       </w:r>
       <w:r>
         <w:rPr>
@@ -9639,7 +9752,7 @@
         <w:bidi w:val="1"/>
         <w:rPr/>
       </w:pPr>
-      <w:bookmarkStart w:id="30" w:name="__RefHeading___Toc2460_5898764"/>
+      <w:bookmarkStart w:id="30" w:name="__RefHeading___Toc2455_3553792858"/>
       <w:bookmarkStart w:id="31" w:name="شريط-الأيام-ومعنى-العلامات"/>
       <w:bookmarkEnd w:id="30"/>
       <w:r>
@@ -10359,7 +10472,7 @@
                 <w:rtl w:val="true"/>
                 <w:lang w:val="en-US" w:eastAsia="en-US" w:bidi="ar-SA"/>
               </w:rPr>
-              <w:t>قطوع النموذج الثقيل</w:t>
+              <w:t>قطع النموذج</w:t>
             </w:r>
           </w:p>
         </w:tc>
@@ -10398,15 +10511,7 @@
                 <w:rtl w:val="true"/>
                 <w:lang w:val="en-US" w:eastAsia="en-US" w:bidi="ar-SA"/>
               </w:rPr>
-              <w:t xml:space="preserve"> </w:t>
-            </w:r>
-            <w:r>
-              <w:rPr>
-                <w:kern w:val="0"/>
-                <w:rtl w:val="true"/>
-                <w:lang w:val="en-US" w:eastAsia="en-US" w:bidi="ar-SA"/>
-              </w:rPr>
-              <w:t>و</w:t>
+              <w:t xml:space="preserve"> · </w:t>
             </w:r>
             <w:r>
               <w:rPr>
@@ -10421,15 +10526,7 @@
                 <w:rtl w:val="true"/>
                 <w:lang w:val="en-US" w:eastAsia="en-US" w:bidi="ar-SA"/>
               </w:rPr>
-              <w:t xml:space="preserve"> </w:t>
-            </w:r>
-            <w:r>
-              <w:rPr>
-                <w:kern w:val="0"/>
-                <w:rtl w:val="true"/>
-                <w:lang w:val="en-US" w:eastAsia="en-US" w:bidi="ar-SA"/>
-              </w:rPr>
-              <w:t>و</w:t>
+              <w:t xml:space="preserve"> · </w:t>
             </w:r>
             <w:r>
               <w:rPr>
@@ -10468,7 +10565,7 @@
                 <w:rtl w:val="true"/>
                 <w:lang w:val="en-US" w:eastAsia="en-US" w:bidi="ar-SA"/>
               </w:rPr>
-              <w:t xml:space="preserve">الأيام التي دُرّبت عندها المكوّنات الثقيلة، وتظهر في شارة </w:t>
+              <w:t xml:space="preserve">اليوم الذي دُرّبت عنده معاملات المكوّنات الثقيلة، وتظهر في شارة </w:t>
             </w:r>
             <w:r>
               <w:rPr>
@@ -10527,7 +10624,7 @@
                 <w:rtl w:val="true"/>
                 <w:lang w:val="en-US" w:eastAsia="en-US" w:bidi="ar-SA"/>
               </w:rPr>
-              <w:t>قطوع درجة الخطر النسبية</w:t>
+              <w:t>قطع الخطر</w:t>
             </w:r>
           </w:p>
         </w:tc>
@@ -10566,15 +10663,7 @@
                 <w:rtl w:val="true"/>
                 <w:lang w:val="en-US" w:eastAsia="en-US" w:bidi="ar-SA"/>
               </w:rPr>
-              <w:t xml:space="preserve"> </w:t>
-            </w:r>
-            <w:r>
-              <w:rPr>
-                <w:kern w:val="0"/>
-                <w:rtl w:val="true"/>
-                <w:lang w:val="en-US" w:eastAsia="en-US" w:bidi="ar-SA"/>
-              </w:rPr>
-              <w:t>و</w:t>
+              <w:t xml:space="preserve"> · </w:t>
             </w:r>
             <w:r>
               <w:rPr>
@@ -10589,15 +10678,7 @@
                 <w:rtl w:val="true"/>
                 <w:lang w:val="en-US" w:eastAsia="en-US" w:bidi="ar-SA"/>
               </w:rPr>
-              <w:t xml:space="preserve"> </w:t>
-            </w:r>
-            <w:r>
-              <w:rPr>
-                <w:kern w:val="0"/>
-                <w:rtl w:val="true"/>
-                <w:lang w:val="en-US" w:eastAsia="en-US" w:bidi="ar-SA"/>
-              </w:rPr>
-              <w:t>و</w:t>
+              <w:t xml:space="preserve"> · </w:t>
             </w:r>
             <w:r>
               <w:rPr>
@@ -10636,7 +10717,7 @@
                 <w:rtl w:val="true"/>
                 <w:lang w:val="en-US" w:eastAsia="en-US" w:bidi="ar-SA"/>
               </w:rPr>
-              <w:t>الأيام التي دُرّب عندها نموذج الدرجة النسبية</w:t>
+              <w:t>اليوم الذي تُحسب عنده ملامح السلوك لدرجة الخطر النسبية</w:t>
             </w:r>
           </w:p>
         </w:tc>
@@ -11075,7 +11156,7 @@
         <w:bidi w:val="1"/>
         <w:rPr/>
       </w:pPr>
-      <w:bookmarkStart w:id="32" w:name="__RefHeading___Toc2462_5898764"/>
+      <w:bookmarkStart w:id="32" w:name="__RefHeading___Toc2457_3553792858"/>
       <w:bookmarkStart w:id="33" w:name="شريط-السياق"/>
       <w:bookmarkEnd w:id="32"/>
       <w:r>
@@ -11553,7 +11634,7 @@
         <w:bidi w:val="1"/>
         <w:rPr/>
       </w:pPr>
-      <w:bookmarkStart w:id="34" w:name="__RefHeading___Toc2464_5898764"/>
+      <w:bookmarkStart w:id="34" w:name="__RefHeading___Toc2459_3553792858"/>
       <w:bookmarkStart w:id="35" w:name="قراءة-بطاقة-التوصية"/>
       <w:bookmarkEnd w:id="34"/>
       <w:r>
@@ -11783,7 +11864,7 @@
         <w:rPr>
           <w:rStyle w:val="VerbatimChar"/>
         </w:rPr>
-        <w:t>id_site</w:t>
+        <w:t>‎id_site‎</w:t>
       </w:r>
       <w:r>
         <w:rPr>
@@ -12423,7 +12504,7 @@
         <w:bidi w:val="1"/>
         <w:rPr/>
       </w:pPr>
-      <w:bookmarkStart w:id="36" w:name="__RefHeading___Toc2466_5898764"/>
+      <w:bookmarkStart w:id="36" w:name="__RefHeading___Toc2461_3553792858"/>
       <w:bookmarkStart w:id="37" w:name="نافذة-لماذا"/>
       <w:bookmarkEnd w:id="36"/>
       <w:r>
@@ -13092,7 +13173,7 @@
         <w:bidi w:val="1"/>
         <w:rPr/>
       </w:pPr>
-      <w:bookmarkStart w:id="38" w:name="__RefHeading___Toc2468_5898764"/>
+      <w:bookmarkStart w:id="38" w:name="__RefHeading___Toc2463_3553792858"/>
       <w:bookmarkStart w:id="39" w:name="شارة-تاريخ-النموذج"/>
       <w:bookmarkEnd w:id="38"/>
       <w:r>
@@ -13485,7 +13566,7 @@
         <w:bidi w:val="1"/>
         <w:rPr/>
       </w:pPr>
-      <w:bookmarkStart w:id="40" w:name="__RefHeading___Toc2470_5898764"/>
+      <w:bookmarkStart w:id="40" w:name="__RefHeading___Toc2465_3553792858"/>
       <w:bookmarkStart w:id="41" w:name="حالة-قبل-أول-قطع"/>
       <w:bookmarkEnd w:id="40"/>
       <w:r>
@@ -13749,7 +13830,7 @@
         <w:bidi w:val="1"/>
         <w:rPr/>
       </w:pPr>
-      <w:bookmarkStart w:id="42" w:name="__RefHeading___Toc2472_5898764"/>
+      <w:bookmarkStart w:id="42" w:name="__RefHeading___Toc2467_3553792858"/>
       <w:bookmarkStart w:id="43" w:name="حالة-بلا-نشاط-سابق"/>
       <w:bookmarkEnd w:id="42"/>
       <w:r>
@@ -13859,7 +13940,7 @@
         <w:bidi w:val="1"/>
         <w:rPr/>
       </w:pPr>
-      <w:bookmarkStart w:id="44" w:name="__RefHeading___Toc2474_5898764"/>
+      <w:bookmarkStart w:id="44" w:name="__RefHeading___Toc2469_3553792858"/>
       <w:bookmarkStart w:id="45" w:name="نشاطي-في-آخر-28-يوما"/>
       <w:bookmarkEnd w:id="44"/>
       <w:r>
@@ -14200,7 +14281,7 @@
         <w:bidi w:val="1"/>
         <w:rPr/>
       </w:pPr>
-      <w:bookmarkStart w:id="46" w:name="__RefHeading___Toc2476_5898764"/>
+      <w:bookmarkStart w:id="46" w:name="__RefHeading___Toc2471_3553792858"/>
       <w:bookmarkStart w:id="47" w:name="ما-لا-تعرضه-صفحة-المتعلم"/>
       <w:bookmarkEnd w:id="46"/>
       <w:r>
@@ -14408,7 +14489,7 @@
         <w:bidi w:val="1"/>
         <w:rPr/>
       </w:pPr>
-      <w:bookmarkStart w:id="48" w:name="__RefHeading___Toc2478_5898764"/>
+      <w:bookmarkStart w:id="48" w:name="__RefHeading___Toc2473_3553792858"/>
       <w:bookmarkStart w:id="49" w:name="حالة-منسحب"/>
       <w:bookmarkEnd w:id="48"/>
       <w:r>
@@ -14456,7 +14537,7 @@
         <w:rPr>
           <w:rtl w:val="true"/>
         </w:rPr>
-        <w:t xml:space="preserve">إن انسحب التسجيل قبل اليوم </w:t>
+        <w:t xml:space="preserve">إذا كان يوم الانسحاب مساوياً لليوم </w:t>
       </w:r>
       <w:r>
         <w:rPr/>
@@ -14466,7 +14547,25 @@
         <w:rPr>
           <w:rtl w:val="true"/>
         </w:rPr>
-        <w:t>، يظهر في الصفحة تنبيه يبدأ بـ</w:t>
+        <w:t xml:space="preserve"> </w:t>
+      </w:r>
+      <w:r>
+        <w:rPr>
+          <w:rtl w:val="true"/>
+        </w:rPr>
+        <w:t>أو أقدم منه، فلا تُعرض أي توصيات</w:t>
+      </w:r>
+      <w:r>
+        <w:rPr>
+          <w:rtl w:val="true"/>
+        </w:rPr>
+        <w:t xml:space="preserve">. </w:t>
+      </w:r>
+      <w:r>
+        <w:rPr>
+          <w:rtl w:val="true"/>
+        </w:rPr>
+        <w:t xml:space="preserve">تظهر عبارة </w:t>
       </w:r>
       <w:r>
         <w:rPr>
@@ -14478,7 +14577,7 @@
         <w:rPr>
           <w:rtl w:val="true"/>
         </w:rPr>
-        <w:t>انتهى هذا التسجيل…</w:t>
+        <w:t>انتهى هذا التسجيل قبل اليوم المختار</w:t>
       </w:r>
       <w:r>
         <w:rPr>
@@ -14490,7 +14589,19 @@
         <w:rPr>
           <w:rtl w:val="true"/>
         </w:rPr>
-        <w:t>ويذكر يوم الانسحاب</w:t>
+        <w:t xml:space="preserve">مع السطر </w:t>
+      </w:r>
+      <w:r>
+        <w:rPr>
+          <w:rtl w:val="true"/>
+        </w:rPr>
+        <w:t>«</w:t>
+      </w:r>
+      <w:r>
+        <w:rPr>
+          <w:rtl w:val="true"/>
+        </w:rPr>
+        <w:t>لا توصيات بعد الانسحاب</w:t>
       </w:r>
       <w:r>
         <w:rPr>
@@ -14502,11 +14613,31 @@
         <w:rPr>
           <w:rtl w:val="true"/>
         </w:rPr>
-        <w:t xml:space="preserve">تُعرض التوصيات محسوبة على تاريخ المتعلم حتى يوم الانسحاب، لا حتى اليوم </w:t>
-      </w:r>
-      <w:r>
-        <w:rPr/>
-        <w:t>t</w:t>
+        <w:t>اختر يوماً أبكر أو تسجيلاً آخر</w:t>
+      </w:r>
+      <w:r>
+        <w:rPr>
+          <w:rtl w:val="true"/>
+        </w:rPr>
+        <w:t xml:space="preserve">.» </w:t>
+      </w:r>
+      <w:r>
+        <w:rPr>
+          <w:rtl w:val="true"/>
+        </w:rPr>
+        <w:t>ولا تذكر واجهة المتعلم يوم الانسحاب</w:t>
+      </w:r>
+      <w:r>
+        <w:rPr>
+          <w:rtl w:val="true"/>
+        </w:rPr>
+        <w:t xml:space="preserve">. </w:t>
+      </w:r>
+      <w:r>
+        <w:rPr>
+          <w:rtl w:val="true"/>
+        </w:rPr>
+        <w:t>يظهر اليوم في درج ملف المتعلم عند المدرّس فقط</w:t>
       </w:r>
       <w:r>
         <w:rPr>
@@ -14589,7 +14720,7 @@
         <w:bidi w:val="1"/>
         <w:rPr/>
       </w:pPr>
-      <w:bookmarkStart w:id="52" w:name="__RefHeading___Toc2480_5898764"/>
+      <w:bookmarkStart w:id="52" w:name="__RefHeading___Toc2475_3553792858"/>
       <w:bookmarkStart w:id="53" w:name="دليل-المدرس-أو-المشرف"/>
       <w:bookmarkEnd w:id="52"/>
       <w:r>
@@ -14650,7 +14781,7 @@
         <w:bidi w:val="1"/>
         <w:rPr/>
       </w:pPr>
-      <w:bookmarkStart w:id="54" w:name="__RefHeading___Toc2482_5898764"/>
+      <w:bookmarkStart w:id="54" w:name="__RefHeading___Toc2477_3553792858"/>
       <w:bookmarkStart w:id="55" w:name="تنبيه-قبل-البدء"/>
       <w:bookmarkEnd w:id="54"/>
       <w:r>
@@ -14930,7 +15061,7 @@
         <w:bidi w:val="1"/>
         <w:rPr/>
       </w:pPr>
-      <w:bookmarkStart w:id="56" w:name="__RefHeading___Toc2484_5898764"/>
+      <w:bookmarkStart w:id="56" w:name="__RefHeading___Toc2479_3553792858"/>
       <w:bookmarkStart w:id="57" w:name="تبدأ-اللوحة-من-اليوم-56"/>
       <w:bookmarkEnd w:id="56"/>
       <w:r>
@@ -15018,7 +15149,7 @@
         <w:bidi w:val="1"/>
         <w:rPr/>
       </w:pPr>
-      <w:bookmarkStart w:id="58" w:name="__RefHeading___Toc2486_5898764"/>
+      <w:bookmarkStart w:id="58" w:name="__RefHeading___Toc2481_3553792858"/>
       <w:bookmarkStart w:id="59" w:name="لوحة-المؤشرات"/>
       <w:bookmarkEnd w:id="58"/>
       <w:r>
@@ -15048,6 +15179,18 @@
         <w:rPr>
           <w:rtl w:val="true"/>
         </w:rPr>
+        <w:t>الأرقام توضيحية من تشغيل واحد ولا يُستشهد بها</w:t>
+      </w:r>
+      <w:r>
+        <w:rPr>
+          <w:rtl w:val="true"/>
+        </w:rPr>
+        <w:t xml:space="preserve">. </w:t>
+      </w:r>
+      <w:r>
+        <w:rPr>
+          <w:rtl w:val="true"/>
+        </w:rPr>
         <w:t>خمس بطاقات أعلى الصفحة</w:t>
       </w:r>
       <w:r>
@@ -15082,7 +15225,13 @@
         <w:rPr>
           <w:rStyle w:val="VerbatimChar"/>
         </w:rPr>
-        <w:t>FFF_2013J</w:t>
+        <w:t>‎</w:t>
+      </w:r>
+      <w:r>
+        <w:rPr>
+          <w:rStyle w:val="VerbatimChar"/>
+        </w:rPr>
+        <w:t>FFF_2013J‎</w:t>
       </w:r>
       <w:r>
         <w:rPr>
@@ -16281,7 +16430,7 @@
         <w:bidi w:val="1"/>
         <w:rPr/>
       </w:pPr>
-      <w:bookmarkStart w:id="60" w:name="__RefHeading___Toc2488_5898764"/>
+      <w:bookmarkStart w:id="60" w:name="__RefHeading___Toc2483_3553792858"/>
       <w:bookmarkStart w:id="61" w:name="العناقيد-السلوكية"/>
       <w:bookmarkEnd w:id="60"/>
       <w:r>
@@ -16452,6 +16601,44 @@
         <w:rPr>
           <w:rtl w:val="true"/>
         </w:rPr>
+        <w:t xml:space="preserve">. </w:t>
+      </w:r>
+      <w:r>
+        <w:rPr>
+          <w:rtl w:val="true"/>
+        </w:rPr>
+        <w:t xml:space="preserve">تبقى لقطة العناقيد ثابتة حين تغيّر اليوم </w:t>
+      </w:r>
+      <w:r>
+        <w:rPr/>
+        <w:t>t</w:t>
+      </w:r>
+      <w:r>
+        <w:rPr>
+          <w:rtl w:val="true"/>
+        </w:rPr>
+        <w:t xml:space="preserve">، لأن </w:t>
+      </w:r>
+      <w:r>
+        <w:rPr/>
+        <w:t>t</w:t>
+      </w:r>
+      <w:r>
+        <w:rPr>
+          <w:rtl w:val="true"/>
+        </w:rPr>
+        <w:t xml:space="preserve"> </w:t>
+      </w:r>
+      <w:r>
+        <w:rPr>
+          <w:rtl w:val="true"/>
+        </w:rPr>
+        <w:t>هو ما تُحسب عنده التوصيات والدرجات وحدها</w:t>
+      </w:r>
+      <w:r>
+        <w:rPr>
+          <w:rtl w:val="true"/>
+        </w:rPr>
         <w:t>.</w:t>
       </w:r>
     </w:p>
@@ -17389,7 +17576,7 @@
         <w:bidi w:val="1"/>
         <w:rPr/>
       </w:pPr>
-      <w:bookmarkStart w:id="62" w:name="__RefHeading___Toc2490_5898764"/>
+      <w:bookmarkStart w:id="62" w:name="__RefHeading___Toc2485_3553792858"/>
       <w:bookmarkStart w:id="63" w:name="توزيع-درجة-الخطر-النسبية"/>
       <w:bookmarkEnd w:id="62"/>
       <w:r>
@@ -17737,7 +17924,7 @@
         </w:rPr>
         <w:drawing>
           <wp:inline distT="0" distB="0" distL="0" distR="0">
-            <wp:extent cx="5334000" cy="4074795"/>
+            <wp:extent cx="5334000" cy="7223125"/>
             <wp:effectExtent l="0" t="0" r="0" b="0"/>
             <wp:docPr id="13" name="Image7" descr="الشكل 6: لوحة المدرّس، الجزء الثاني: توزيع الدرجة النسبية وملامح السلوك وتغطية التوصيات. ملف المتعلم المعروض في الشكل 7 اختير على هذا الأساس نفسه، لا لأنه في حالة خطر."/>
             <wp:cNvGraphicFramePr>
@@ -17761,7 +17948,7 @@
                   <pic:spPr bwMode="auto">
                     <a:xfrm>
                       <a:off x="0" y="0"/>
-                      <a:ext cx="5334000" cy="4074795"/>
+                      <a:ext cx="5334000" cy="7223125"/>
                     </a:xfrm>
                     <a:prstGeom prst="rect">
                       <a:avLst/>
@@ -18152,19 +18339,116 @@
         <w:rPr>
           <w:rtl w:val="true"/>
         </w:rPr>
-        <w:t xml:space="preserve">): </w:t>
-      </w:r>
-      <w:r>
-        <w:rPr>
-          <w:rtl w:val="true"/>
-        </w:rPr>
-        <w:t>الخط المتقطع والإطار الداكن يميّزان ما فوق العتبة لا اللون وحده</w:t>
+        <w:t>)</w:t>
+      </w:r>
+      <w:r>
+        <w:rPr>
+          <w:rtl w:val="true"/>
+        </w:rPr>
+        <w:t>؛ الخط المتقطع والإطار الداكن يميّزان ما فوق العتبة لا اللون وحده</w:t>
       </w:r>
       <w:r>
         <w:rPr>
           <w:rtl w:val="true"/>
         </w:rPr>
         <w:t>.»</w:t>
+      </w:r>
+    </w:p>
+    <w:p>
+      <w:pPr>
+        <w:pStyle w:val="Normal"/>
+        <w:bidi w:val="1"/>
+        <w:rPr/>
+      </w:pPr>
+      <w:r>
+        <w:rPr>
+          <w:rtl w:val="true"/>
+        </w:rPr>
+        <w:t xml:space="preserve">الشارة </w:t>
+      </w:r>
+      <w:r>
+        <w:rPr>
+          <w:rtl w:val="true"/>
+        </w:rPr>
+        <w:t>«</w:t>
+      </w:r>
+      <w:r>
+        <w:rPr>
+          <w:rtl w:val="true"/>
+        </w:rPr>
+        <w:t xml:space="preserve">تطوير — ترك عرض خارج التدريب </w:t>
+      </w:r>
+      <w:r>
+        <w:rPr>
+          <w:rtl w:val="true"/>
+        </w:rPr>
+        <w:t>(</w:t>
+      </w:r>
+      <w:r>
+        <w:rPr/>
+        <w:t>lopo_2013</w:t>
+      </w:r>
+      <w:r>
+        <w:rPr>
+          <w:rtl w:val="true"/>
+        </w:rPr>
+        <w:t xml:space="preserve">)» </w:t>
+      </w:r>
+      <w:r>
+        <w:rPr>
+          <w:rtl w:val="true"/>
+        </w:rPr>
+        <w:t xml:space="preserve">أعلى المدرج تعني أن نماذج الخطر في وضع التطوير دُرّبت على العروض الثمانية الأخرى من </w:t>
+      </w:r>
+      <w:r>
+        <w:rPr/>
+        <w:t>2013</w:t>
+      </w:r>
+      <w:r>
+        <w:rPr>
+          <w:rtl w:val="true"/>
+        </w:rPr>
+        <w:t xml:space="preserve"> </w:t>
+      </w:r>
+      <w:r>
+        <w:rPr>
+          <w:rtl w:val="true"/>
+        </w:rPr>
+        <w:t>مع ترك العرض الحالي خارج التدريب</w:t>
+      </w:r>
+      <w:r>
+        <w:rPr>
+          <w:rtl w:val="true"/>
+        </w:rPr>
+        <w:t xml:space="preserve">. </w:t>
+      </w:r>
+      <w:r>
+        <w:rPr>
+          <w:rtl w:val="true"/>
+        </w:rPr>
+        <w:t xml:space="preserve">في عروض </w:t>
+      </w:r>
+      <w:r>
+        <w:rPr/>
+        <w:t>2014</w:t>
+      </w:r>
+      <w:r>
+        <w:rPr>
+          <w:rtl w:val="true"/>
+        </w:rPr>
+        <w:t xml:space="preserve"> </w:t>
+      </w:r>
+      <w:r>
+        <w:rPr>
+          <w:rtl w:val="true"/>
+        </w:rPr>
+        <w:t>يختلف المصدر</w:t>
+      </w:r>
+      <w:r>
+        <w:rPr>
+          <w:rtl w:val="true"/>
+        </w:rPr>
+        <w:t>.</w:t>
       </w:r>
       <w:bookmarkEnd w:id="63"/>
     </w:p>
@@ -18174,7 +18458,7 @@
         <w:bidi w:val="1"/>
         <w:rPr/>
       </w:pPr>
-      <w:bookmarkStart w:id="64" w:name="__RefHeading___Toc2492_5898764"/>
+      <w:bookmarkStart w:id="64" w:name="__RefHeading___Toc2487_3553792858"/>
       <w:bookmarkStart w:id="65" w:name="ملامح-السلوك"/>
       <w:bookmarkEnd w:id="64"/>
       <w:r>
@@ -18252,7 +18536,7 @@
         <w:rPr>
           <w:rtl w:val="true"/>
         </w:rPr>
-        <w:t>الملامح في اللقطة</w:t>
+        <w:t>الملامح عند اليوم المعروض</w:t>
       </w:r>
       <w:r>
         <w:rPr>
@@ -18707,7 +18991,7 @@
         <w:bidi w:val="1"/>
         <w:rPr/>
       </w:pPr>
-      <w:bookmarkStart w:id="66" w:name="__RefHeading___Toc2494_5898764"/>
+      <w:bookmarkStart w:id="66" w:name="__RefHeading___Toc2489_3553792858"/>
       <w:bookmarkStart w:id="67" w:name="تغطية-التوصيات"/>
       <w:bookmarkEnd w:id="66"/>
       <w:r>
@@ -18758,7 +19042,47 @@
         <w:rPr>
           <w:rtl w:val="true"/>
         </w:rPr>
-        <w:t xml:space="preserve"> العبارة في أعلاه تقول مثلاً</w:t>
+        <w:t xml:space="preserve"> هذا ما تسميه بطاقة المؤشرات </w:t>
+      </w:r>
+      <w:r>
+        <w:rPr>
+          <w:rtl w:val="true"/>
+        </w:rPr>
+        <w:t>«</w:t>
+      </w:r>
+      <w:r>
+        <w:rPr>
+          <w:rtl w:val="true"/>
+        </w:rPr>
+        <w:t>اتساع التوصيات</w:t>
+      </w:r>
+      <w:r>
+        <w:rPr>
+          <w:rtl w:val="true"/>
+        </w:rPr>
+        <w:t>» (</w:t>
+      </w:r>
+      <w:r>
+        <w:rPr>
+          <w:rtl w:val="true"/>
+        </w:rPr>
+        <w:t xml:space="preserve">القسم </w:t>
+      </w:r>
+      <w:r>
+        <w:rPr/>
+        <w:t>4.3</w:t>
+      </w:r>
+      <w:r>
+        <w:rPr>
+          <w:rtl w:val="true"/>
+        </w:rPr>
+        <w:t xml:space="preserve">). </w:t>
+      </w:r>
+      <w:r>
+        <w:rPr>
+          <w:rtl w:val="true"/>
+        </w:rPr>
+        <w:t>العبارة في أعلاه تقول مثلاً</w:t>
       </w:r>
       <w:r>
         <w:rPr>
@@ -18873,7 +19197,7 @@
         <w:bidi w:val="1"/>
         <w:rPr/>
       </w:pPr>
-      <w:bookmarkStart w:id="68" w:name="__RefHeading___Toc2496_5898764"/>
+      <w:bookmarkStart w:id="68" w:name="__RefHeading___Toc2491_3553792858"/>
       <w:bookmarkStart w:id="69" w:name="جدول-المتعلمين"/>
       <w:bookmarkEnd w:id="68"/>
       <w:r>
@@ -18903,7 +19227,7 @@
         <w:rPr>
           <w:rtl w:val="true"/>
         </w:rPr>
-        <w:t xml:space="preserve">الجدول بعنوان </w:t>
+        <w:t xml:space="preserve">عنوان الجدول </w:t>
       </w:r>
       <w:r>
         <w:rPr>
@@ -18915,25 +19239,59 @@
         <w:rPr>
           <w:rtl w:val="true"/>
         </w:rPr>
-        <w:t xml:space="preserve">المتعلمون </w:t>
-      </w:r>
-      <w:r>
-        <w:rPr>
-          <w:rtl w:val="true"/>
-        </w:rPr>
-        <w:t>(</w:t>
-      </w:r>
-      <w:r>
-        <w:rPr>
-          <w:rtl w:val="true"/>
-        </w:rPr>
-        <w:t>مرتبون بدرجة الخطر النسبية تنازلياً</w:t>
-      </w:r>
-      <w:r>
-        <w:rPr>
-          <w:rtl w:val="true"/>
-        </w:rPr>
-        <w:t xml:space="preserve">)». </w:t>
+        <w:t>المتعلمون</w:t>
+      </w:r>
+      <w:r>
+        <w:rPr>
+          <w:rtl w:val="true"/>
+        </w:rPr>
+        <w:t>»</w:t>
+      </w:r>
+      <w:r>
+        <w:rPr>
+          <w:rtl w:val="true"/>
+        </w:rPr>
+        <w:t xml:space="preserve">، وتحته سطر مثل </w:t>
+      </w:r>
+      <w:r>
+        <w:rPr>
+          <w:rtl w:val="true"/>
+        </w:rPr>
+        <w:t>«</w:t>
+      </w:r>
+      <w:r>
+        <w:rPr/>
+        <w:t>100</w:t>
+      </w:r>
+      <w:r>
+        <w:rPr>
+          <w:rtl w:val="true"/>
+        </w:rPr>
+        <w:t xml:space="preserve"> </w:t>
+      </w:r>
+      <w:r>
+        <w:rPr>
+          <w:rtl w:val="true"/>
+        </w:rPr>
+        <w:t xml:space="preserve">متعلماً </w:t>
+      </w:r>
+      <w:r>
+        <w:rPr>
+          <w:rtl w:val="true"/>
+        </w:rPr>
+        <w:t xml:space="preserve">· </w:t>
+      </w:r>
+      <w:r>
+        <w:rPr>
+          <w:rtl w:val="true"/>
+        </w:rPr>
+        <w:t>مرتبون حسب درجة الخطر</w:t>
+      </w:r>
+      <w:r>
+        <w:rPr>
+          <w:rtl w:val="true"/>
+        </w:rPr>
+        <w:t xml:space="preserve">». </w:t>
       </w:r>
       <w:r>
         <w:rPr>
@@ -19471,7 +19829,7 @@
                 <w:rtl w:val="true"/>
                 <w:lang w:val="en-US" w:eastAsia="en-US" w:bidi="ar-SA"/>
               </w:rPr>
-              <w:t>درجة الخطر النسبية</w:t>
+              <w:t>درجة الخطر</w:t>
             </w:r>
           </w:p>
         </w:tc>
@@ -19846,7 +20204,7 @@
         <w:rPr>
           <w:rtl w:val="true"/>
         </w:rPr>
-        <w:t>التسجيل، والعنقود، والأيام النشطة، وآخر وصول، والالتزام، ودرجة الخطر النسبية</w:t>
+        <w:t>التسجيل، والعنقود، والأيام النشطة، وآخر وصول، والالتزام، ودرجة الخطر</w:t>
       </w:r>
       <w:r>
         <w:rPr>
@@ -20208,7 +20566,7 @@
           <wp:inline distT="0" distB="0" distL="0" distR="0">
             <wp:extent cx="5334000" cy="3333750"/>
             <wp:effectExtent l="0" t="0" r="0" b="0"/>
-            <wp:docPr id="14" name="Image8" descr="الشكل 7: ملف المتعلم والدرج الجانبي بجانب جدول المتعلمين. المتعلم FFF_2013J-29769 اختير على هذا الأساس: درجته 0.362 قريبة من وسيط الفوج 0.365 ودون العتبة 0.456، لا لأنه في حالة خطر. والجدول مفروز بالتسجيل بلا مرشّح، وعمود الدرجة معروض كاملاً."/>
+            <wp:docPr id="14" name="Image8" descr="الشكل 7: ملف المتعلم والدرج الجانبي بجانب جدول المتعلمين. المتعلم FFF_2013J-29769 اختير على هذا الأساس: درجته 0.36 (العتبة 0.46) وهو الأقرب إلى وسيط الفوج وفق الواجهة البرمجية، لا لأنه في حالة خطر. والجدول مفروز بالتسجيل بلا مرشّح، وعمود الدرجة معروض كاملاً."/>
             <wp:cNvGraphicFramePr>
               <a:graphicFrameLocks xmlns:a="http://schemas.openxmlformats.org/drawingml/2006/main" noChangeAspect="1"/>
             </wp:cNvGraphicFramePr>
@@ -20216,7 +20574,7 @@
               <a:graphicData uri="http://schemas.openxmlformats.org/drawingml/2006/picture">
                 <pic:pic xmlns:pic="http://schemas.openxmlformats.org/drawingml/2006/picture">
                   <pic:nvPicPr>
-                    <pic:cNvPr id="14" name="Image8" descr="الشكل 7: ملف المتعلم والدرج الجانبي بجانب جدول المتعلمين. المتعلم FFF_2013J-29769 اختير على هذا الأساس: درجته 0.362 قريبة من وسيط الفوج 0.365 ودون العتبة 0.456، لا لأنه في حالة خطر. والجدول مفروز بالتسجيل بلا مرشّح، وعمود الدرجة معروض كاملاً."/>
+                    <pic:cNvPr id="14" name="Image8" descr="الشكل 7: ملف المتعلم والدرج الجانبي بجانب جدول المتعلمين. المتعلم FFF_2013J-29769 اختير على هذا الأساس: درجته 0.36 (العتبة 0.46) وهو الأقرب إلى وسيط الفوج وفق الواجهة البرمجية، لا لأنه في حالة خطر. والجدول مفروز بالتسجيل بلا مرشّح، وعمود الدرجة معروض كاملاً."/>
                     <pic:cNvPicPr>
                       <a:picLocks noChangeAspect="1" noChangeArrowheads="1"/>
                     </pic:cNvPicPr>
@@ -20314,45 +20672,35 @@
       </w:r>
       <w:r>
         <w:rPr/>
-        <w:t>0.362</w:t>
-      </w:r>
-      <w:r>
-        <w:rPr>
-          <w:rtl w:val="true"/>
-        </w:rPr>
-        <w:t xml:space="preserve"> </w:t>
-      </w:r>
-      <w:r>
-        <w:rPr>
-          <w:rtl w:val="true"/>
-        </w:rPr>
-        <w:t xml:space="preserve">قريبة من وسيط الفوج </w:t>
-      </w:r>
-      <w:r>
-        <w:rPr/>
-        <w:t>0.365</w:t>
-      </w:r>
-      <w:r>
-        <w:rPr>
-          <w:rtl w:val="true"/>
-        </w:rPr>
-        <w:t xml:space="preserve"> </w:t>
-      </w:r>
-      <w:r>
-        <w:rPr>
-          <w:rtl w:val="true"/>
-        </w:rPr>
-        <w:t xml:space="preserve">ودون العتبة </w:t>
-      </w:r>
-      <w:r>
-        <w:rPr/>
-        <w:t>0.456</w:t>
-      </w:r>
-      <w:r>
-        <w:rPr>
-          <w:rtl w:val="true"/>
-        </w:rPr>
-        <w:t>، لا لأنه في حالة خطر</w:t>
+        <w:t>0.36</w:t>
+      </w:r>
+      <w:r>
+        <w:rPr>
+          <w:rtl w:val="true"/>
+        </w:rPr>
+        <w:t xml:space="preserve"> (</w:t>
+      </w:r>
+      <w:r>
+        <w:rPr>
+          <w:rtl w:val="true"/>
+        </w:rPr>
+        <w:t xml:space="preserve">العتبة </w:t>
+      </w:r>
+      <w:r>
+        <w:rPr/>
+        <w:t>0.46</w:t>
+      </w:r>
+      <w:r>
+        <w:rPr>
+          <w:rtl w:val="true"/>
+        </w:rPr>
+        <w:t xml:space="preserve">) </w:t>
+      </w:r>
+      <w:r>
+        <w:rPr>
+          <w:rtl w:val="true"/>
+        </w:rPr>
+        <w:t>وهو الأقرب إلى وسيط الفوج وفق الواجهة البرمجية، لا لأنه في حالة خطر</w:t>
       </w:r>
       <w:r>
         <w:rPr>
@@ -20380,7 +20728,7 @@
         <w:bidi w:val="1"/>
         <w:rPr/>
       </w:pPr>
-      <w:bookmarkStart w:id="70" w:name="__RefHeading___Toc2498_5898764"/>
+      <w:bookmarkStart w:id="70" w:name="__RefHeading___Toc2493_3553792858"/>
       <w:bookmarkStart w:id="71" w:name="ملف-المتعلم"/>
       <w:bookmarkEnd w:id="70"/>
       <w:r>
@@ -20612,55 +20960,13 @@
         <w:rPr>
           <w:rtl w:val="true"/>
         </w:rPr>
-        <w:t>: «(</w:t>
-      </w:r>
-      <w:r>
-        <w:rPr/>
-        <w:t>z</w:t>
-      </w:r>
-      <w:r>
-        <w:rPr>
-          <w:rtl w:val="true"/>
-        </w:rPr>
-        <w:t xml:space="preserve">: </w:t>
-      </w:r>
-      <w:r>
-        <w:rPr>
-          <w:rtl w:val="true"/>
-        </w:rPr>
-        <w:t xml:space="preserve">عدد الانحرافات المعيارية عن الوسيط؛ </w:t>
-      </w:r>
-      <w:r>
-        <w:rPr/>
-        <w:t>w·z</w:t>
-      </w:r>
-      <w:r>
-        <w:rPr>
-          <w:rtl w:val="true"/>
-        </w:rPr>
-        <w:t xml:space="preserve">: </w:t>
-      </w:r>
-      <w:r>
-        <w:rPr>
-          <w:rtl w:val="true"/>
-        </w:rPr>
-        <w:t xml:space="preserve">الوزن مضروباً في </w:t>
-      </w:r>
-      <w:r>
-        <w:rPr/>
-        <w:t>z</w:t>
-      </w:r>
-      <w:r>
-        <w:rPr>
-          <w:rtl w:val="true"/>
-        </w:rPr>
-        <w:t xml:space="preserve">.) </w:t>
-      </w:r>
-      <w:r>
-        <w:rPr>
-          <w:rtl w:val="true"/>
-        </w:rPr>
-        <w:t>الموجب يرفع الدرجة والسالب يخفضها؛ درجة نسبية غير معايَرة لترتيب الأولوية، لا حكم</w:t>
+        <w:t>: «</w:t>
+      </w:r>
+      <w:r>
+        <w:rPr>
+          <w:rtl w:val="true"/>
+        </w:rPr>
+        <w:t>الموجب يرفع الدرجة والسالب يخفضها؛ درجة نسبية غير معايَرة لترتيب الأولوية لا حكم</w:t>
       </w:r>
       <w:r>
         <w:rPr>
@@ -20900,13 +21206,13 @@
         <w:rPr>
           <w:rtl w:val="true"/>
         </w:rPr>
-        <w:t>»</w:t>
-      </w:r>
-      <w:r>
-        <w:rPr>
-          <w:rtl w:val="true"/>
-        </w:rPr>
-        <w:t>، وتُحسب له درجة إن وُجدت</w:t>
+        <w:t xml:space="preserve">». </w:t>
+      </w:r>
+      <w:r>
+        <w:rPr>
+          <w:rtl w:val="true"/>
+        </w:rPr>
+        <w:t>هذا اليوم يظهر في الدرج فقط ولا يظهر للمتعلم</w:t>
       </w:r>
       <w:r>
         <w:rPr>
@@ -21087,7 +21393,7 @@
         <w:bidi w:val="1"/>
         <w:rPr/>
       </w:pPr>
-      <w:bookmarkStart w:id="72" w:name="__RefHeading___Toc2500_5898764"/>
+      <w:bookmarkStart w:id="72" w:name="__RefHeading___Toc2495_3553792858"/>
       <w:bookmarkStart w:id="73" w:name="القيود-الأخلاقية-والمنهجية"/>
       <w:bookmarkEnd w:id="72"/>
       <w:r>
@@ -21538,7 +21844,7 @@
         <w:bidi w:val="1"/>
         <w:rPr/>
       </w:pPr>
-      <w:bookmarkStart w:id="74" w:name="__RefHeading___Toc2502_5898764"/>
+      <w:bookmarkStart w:id="74" w:name="__RefHeading___Toc2497_3553792858"/>
       <w:bookmarkStart w:id="75" w:name="ماذا-أفعل-كمدرس"/>
       <w:bookmarkEnd w:id="74"/>
       <w:r>
@@ -21657,7 +21963,7 @@
         <w:bidi w:val="1"/>
         <w:rPr/>
       </w:pPr>
-      <w:bookmarkStart w:id="76" w:name="__RefHeading___Toc2504_5898764"/>
+      <w:bookmarkStart w:id="76" w:name="__RefHeading___Toc2499_3553792858"/>
       <w:bookmarkStart w:id="77" w:name="X745443570c429d909b26e3257e881b7ff04140e"/>
       <w:bookmarkEnd w:id="76"/>
       <w:r>
@@ -22131,7 +22437,7 @@
         <w:bidi w:val="1"/>
         <w:rPr/>
       </w:pPr>
-      <w:bookmarkStart w:id="80" w:name="__RefHeading___Toc2506_5898764"/>
+      <w:bookmarkStart w:id="80" w:name="__RefHeading___Toc2501_3553792858"/>
       <w:bookmarkStart w:id="81" w:name="الأسئلة-الشائعة"/>
       <w:bookmarkEnd w:id="80"/>
       <w:r>
@@ -22664,7 +22970,7 @@
         <w:rPr>
           <w:rStyle w:val="VerbatimChar"/>
         </w:rPr>
-        <w:t>confirmatory_locked</w:t>
+        <w:t>‎confirmatory_locked‎</w:t>
       </w:r>
       <w:r>
         <w:rPr>
@@ -22722,14 +23028,13 @@
         <w:rPr>
           <w:rStyle w:val="VerbatimChar"/>
         </w:rPr>
-        <w:t>results</w:t>
+        <w:t>‎</w:t>
       </w:r>
       <w:r>
         <w:rPr>
           <w:rStyle w:val="VerbatimChar"/>
-          <w:rtl w:val="true"/>
-        </w:rPr>
-        <w:t>/</w:t>
+        </w:rPr>
+        <w:t>results/‎</w:t>
       </w:r>
       <w:r>
         <w:rPr>
@@ -23654,15 +23959,14 @@
       <w:r>
         <w:rPr>
           <w:rStyle w:val="VerbatimChar"/>
-          <w:rtl w:val="true"/>
-        </w:rPr>
-        <w:t>--</w:t>
+        </w:rPr>
+        <w:t>‎</w:t>
       </w:r>
       <w:r>
         <w:rPr>
           <w:rStyle w:val="VerbatimChar"/>
         </w:rPr>
-        <w:t>warm</w:t>
+        <w:t>--warm‎</w:t>
       </w:r>
       <w:r>
         <w:rPr>
@@ -23771,7 +24075,7 @@
         <w:bidi w:val="1"/>
         <w:rPr/>
       </w:pPr>
-      <w:bookmarkStart w:id="83" w:name="__RefHeading___Toc2508_5898764"/>
+      <w:bookmarkStart w:id="83" w:name="__RefHeading___Toc2503_3553792858"/>
       <w:bookmarkStart w:id="84" w:name="الملاحق"/>
       <w:bookmarkEnd w:id="83"/>
       <w:r>
@@ -23797,7 +24101,7 @@
         <w:bidi w:val="1"/>
         <w:rPr/>
       </w:pPr>
-      <w:bookmarkStart w:id="85" w:name="__RefHeading___Toc2510_5898764"/>
+      <w:bookmarkStart w:id="85" w:name="__RefHeading___Toc2505_3553792858"/>
       <w:bookmarkEnd w:id="85"/>
       <w:r>
         <w:rPr/>
@@ -24966,7 +25270,7 @@
         <w:bidi w:val="1"/>
         <w:rPr/>
       </w:pPr>
-      <w:bookmarkStart w:id="87" w:name="__RefHeading___Toc2512_5898764"/>
+      <w:bookmarkStart w:id="87" w:name="__RefHeading___Toc2507_3553792858"/>
       <w:bookmarkEnd w:id="87"/>
       <w:r>
         <w:rPr/>
@@ -25128,10 +25432,9 @@
               <w:rPr>
                 <w:rStyle w:val="VerbatimChar"/>
                 <w:kern w:val="0"/>
-                <w:rtl w:val="true"/>
-                <w:lang w:val="en-US" w:eastAsia="en-US" w:bidi="ar-SA"/>
-              </w:rPr>
-              <w:t>/</w:t>
+                <w:lang w:val="en-US" w:eastAsia="en-US" w:bidi="ar-SA"/>
+              </w:rPr>
+              <w:t>‎</w:t>
             </w:r>
             <w:r>
               <w:rPr>
@@ -25139,7 +25442,7 @@
                 <w:kern w:val="0"/>
                 <w:lang w:val="en-US" w:eastAsia="en-US" w:bidi="ar-SA"/>
               </w:rPr>
-              <w:t>api/health</w:t>
+              <w:t>/api/health‎</w:t>
             </w:r>
           </w:p>
         </w:tc>
@@ -25204,10 +25507,9 @@
               <w:rPr>
                 <w:rStyle w:val="VerbatimChar"/>
                 <w:kern w:val="0"/>
-                <w:rtl w:val="true"/>
-                <w:lang w:val="en-US" w:eastAsia="en-US" w:bidi="ar-SA"/>
-              </w:rPr>
-              <w:t>/</w:t>
+                <w:lang w:val="en-US" w:eastAsia="en-US" w:bidi="ar-SA"/>
+              </w:rPr>
+              <w:t>‎</w:t>
             </w:r>
             <w:r>
               <w:rPr>
@@ -25215,7 +25517,7 @@
                 <w:kern w:val="0"/>
                 <w:lang w:val="en-US" w:eastAsia="en-US" w:bidi="ar-SA"/>
               </w:rPr>
-              <w:t>api/meta</w:t>
+              <w:t>/api/meta‎</w:t>
             </w:r>
           </w:p>
         </w:tc>
@@ -25280,10 +25582,9 @@
               <w:rPr>
                 <w:rStyle w:val="VerbatimChar"/>
                 <w:kern w:val="0"/>
-                <w:rtl w:val="true"/>
-                <w:lang w:val="en-US" w:eastAsia="en-US" w:bidi="ar-SA"/>
-              </w:rPr>
-              <w:t>/</w:t>
+                <w:lang w:val="en-US" w:eastAsia="en-US" w:bidi="ar-SA"/>
+              </w:rPr>
+              <w:t>‎</w:t>
             </w:r>
             <w:r>
               <w:rPr>
@@ -25291,7 +25592,7 @@
                 <w:kern w:val="0"/>
                 <w:lang w:val="en-US" w:eastAsia="en-US" w:bidi="ar-SA"/>
               </w:rPr>
-              <w:t>api/presentations</w:t>
+              <w:t>/api/presentations‎</w:t>
             </w:r>
           </w:p>
         </w:tc>
@@ -25356,10 +25657,9 @@
               <w:rPr>
                 <w:rStyle w:val="VerbatimChar"/>
                 <w:kern w:val="0"/>
-                <w:rtl w:val="true"/>
-                <w:lang w:val="en-US" w:eastAsia="en-US" w:bidi="ar-SA"/>
-              </w:rPr>
-              <w:t>/</w:t>
+                <w:lang w:val="en-US" w:eastAsia="en-US" w:bidi="ar-SA"/>
+              </w:rPr>
+              <w:t>‎</w:t>
             </w:r>
             <w:r>
               <w:rPr>
@@ -25367,7 +25667,7 @@
                 <w:kern w:val="0"/>
                 <w:lang w:val="en-US" w:eastAsia="en-US" w:bidi="ar-SA"/>
               </w:rPr>
-              <w:t>api/registrations</w:t>
+              <w:t>/api/registrations‎</w:t>
             </w:r>
           </w:p>
         </w:tc>
@@ -25432,10 +25732,9 @@
               <w:rPr>
                 <w:rStyle w:val="VerbatimChar"/>
                 <w:kern w:val="0"/>
-                <w:rtl w:val="true"/>
-                <w:lang w:val="en-US" w:eastAsia="en-US" w:bidi="ar-SA"/>
-              </w:rPr>
-              <w:t>/</w:t>
+                <w:lang w:val="en-US" w:eastAsia="en-US" w:bidi="ar-SA"/>
+              </w:rPr>
+              <w:t>‎</w:t>
             </w:r>
             <w:r>
               <w:rPr>
@@ -25443,7 +25742,7 @@
                 <w:kern w:val="0"/>
                 <w:lang w:val="en-US" w:eastAsia="en-US" w:bidi="ar-SA"/>
               </w:rPr>
-              <w:t>api/recommendations</w:t>
+              <w:t>/api/recommendations‎</w:t>
             </w:r>
           </w:p>
         </w:tc>
@@ -25538,10 +25837,9 @@
               <w:rPr>
                 <w:rStyle w:val="VerbatimChar"/>
                 <w:kern w:val="0"/>
-                <w:rtl w:val="true"/>
-                <w:lang w:val="en-US" w:eastAsia="en-US" w:bidi="ar-SA"/>
-              </w:rPr>
-              <w:t>/</w:t>
+                <w:lang w:val="en-US" w:eastAsia="en-US" w:bidi="ar-SA"/>
+              </w:rPr>
+              <w:t>‎</w:t>
             </w:r>
             <w:r>
               <w:rPr>
@@ -25549,7 +25847,7 @@
                 <w:kern w:val="0"/>
                 <w:lang w:val="en-US" w:eastAsia="en-US" w:bidi="ar-SA"/>
               </w:rPr>
-              <w:t>api/explanations/{registration}/{id_site}</w:t>
+              <w:t>/api/explanations/{registration}/{id_site}‎</w:t>
             </w:r>
           </w:p>
         </w:tc>
@@ -25614,10 +25912,9 @@
               <w:rPr>
                 <w:rStyle w:val="VerbatimChar"/>
                 <w:kern w:val="0"/>
-                <w:rtl w:val="true"/>
-                <w:lang w:val="en-US" w:eastAsia="en-US" w:bidi="ar-SA"/>
-              </w:rPr>
-              <w:t>/</w:t>
+                <w:lang w:val="en-US" w:eastAsia="en-US" w:bidi="ar-SA"/>
+              </w:rPr>
+              <w:t>‎</w:t>
             </w:r>
             <w:r>
               <w:rPr>
@@ -25625,7 +25922,7 @@
                 <w:kern w:val="0"/>
                 <w:lang w:val="en-US" w:eastAsia="en-US" w:bidi="ar-SA"/>
               </w:rPr>
-              <w:t>api/learner/{registration}/history</w:t>
+              <w:t>/api/learner/{registration}/history‎</w:t>
             </w:r>
           </w:p>
         </w:tc>
@@ -25697,10 +25994,9 @@
               <w:rPr>
                 <w:rStyle w:val="VerbatimChar"/>
                 <w:kern w:val="0"/>
-                <w:rtl w:val="true"/>
-                <w:lang w:val="en-US" w:eastAsia="en-US" w:bidi="ar-SA"/>
-              </w:rPr>
-              <w:t>/</w:t>
+                <w:lang w:val="en-US" w:eastAsia="en-US" w:bidi="ar-SA"/>
+              </w:rPr>
+              <w:t>‎</w:t>
             </w:r>
             <w:r>
               <w:rPr>
@@ -25708,7 +26004,7 @@
                 <w:kern w:val="0"/>
                 <w:lang w:val="en-US" w:eastAsia="en-US" w:bidi="ar-SA"/>
               </w:rPr>
-              <w:t>api/instructor/overview</w:t>
+              <w:t>/api/instructor/overview‎</w:t>
             </w:r>
           </w:p>
         </w:tc>
@@ -25773,10 +26069,9 @@
               <w:rPr>
                 <w:rStyle w:val="VerbatimChar"/>
                 <w:kern w:val="0"/>
-                <w:rtl w:val="true"/>
-                <w:lang w:val="en-US" w:eastAsia="en-US" w:bidi="ar-SA"/>
-              </w:rPr>
-              <w:t>/</w:t>
+                <w:lang w:val="en-US" w:eastAsia="en-US" w:bidi="ar-SA"/>
+              </w:rPr>
+              <w:t>‎</w:t>
             </w:r>
             <w:r>
               <w:rPr>
@@ -25784,7 +26079,7 @@
                 <w:kern w:val="0"/>
                 <w:lang w:val="en-US" w:eastAsia="en-US" w:bidi="ar-SA"/>
               </w:rPr>
-              <w:t>api/instructor/clusters</w:t>
+              <w:t>/api/instructor/clusters‎</w:t>
             </w:r>
           </w:p>
         </w:tc>
@@ -25849,10 +26144,9 @@
               <w:rPr>
                 <w:rStyle w:val="VerbatimChar"/>
                 <w:kern w:val="0"/>
-                <w:rtl w:val="true"/>
-                <w:lang w:val="en-US" w:eastAsia="en-US" w:bidi="ar-SA"/>
-              </w:rPr>
-              <w:t>/</w:t>
+                <w:lang w:val="en-US" w:eastAsia="en-US" w:bidi="ar-SA"/>
+              </w:rPr>
+              <w:t>‎</w:t>
             </w:r>
             <w:r>
               <w:rPr>
@@ -25860,7 +26154,7 @@
                 <w:kern w:val="0"/>
                 <w:lang w:val="en-US" w:eastAsia="en-US" w:bidi="ar-SA"/>
               </w:rPr>
-              <w:t>api/instructor/learners</w:t>
+              <w:t>/api/instructor/learners‎</w:t>
             </w:r>
           </w:p>
         </w:tc>
@@ -25925,10 +26219,9 @@
               <w:rPr>
                 <w:rStyle w:val="VerbatimChar"/>
                 <w:kern w:val="0"/>
-                <w:rtl w:val="true"/>
-                <w:lang w:val="en-US" w:eastAsia="en-US" w:bidi="ar-SA"/>
-              </w:rPr>
-              <w:t>/</w:t>
+                <w:lang w:val="en-US" w:eastAsia="en-US" w:bidi="ar-SA"/>
+              </w:rPr>
+              <w:t>‎</w:t>
             </w:r>
             <w:r>
               <w:rPr>
@@ -25936,7 +26229,7 @@
                 <w:kern w:val="0"/>
                 <w:lang w:val="en-US" w:eastAsia="en-US" w:bidi="ar-SA"/>
               </w:rPr>
-              <w:t>api/instructor/learner/{registration}</w:t>
+              <w:t>/api/instructor/learner/{registration}‎</w:t>
             </w:r>
           </w:p>
         </w:tc>
@@ -26008,7 +26301,7 @@
         <w:rPr>
           <w:rStyle w:val="VerbatimChar"/>
         </w:rPr>
-        <w:t>day_before_first_snapshot</w:t>
+        <w:t>‎day_before_first_snapshot‎</w:t>
       </w:r>
       <w:r>
         <w:rPr>
@@ -26020,7 +26313,13 @@
         <w:rPr>
           <w:rStyle w:val="VerbatimChar"/>
         </w:rPr>
-        <w:t>day_out_of_range</w:t>
+        <w:t>‎</w:t>
+      </w:r>
+      <w:r>
+        <w:rPr>
+          <w:rStyle w:val="VerbatimChar"/>
+        </w:rPr>
+        <w:t>day_out_of_range‎</w:t>
       </w:r>
       <w:r>
         <w:rPr>
@@ -26032,7 +26331,13 @@
         <w:rPr>
           <w:rStyle w:val="VerbatimChar"/>
         </w:rPr>
-        <w:t>confirmatory_locked</w:t>
+        <w:t>‎</w:t>
+      </w:r>
+      <w:r>
+        <w:rPr>
+          <w:rStyle w:val="VerbatimChar"/>
+        </w:rPr>
+        <w:t>confirmatory_locked‎</w:t>
       </w:r>
       <w:r>
         <w:rPr>
@@ -26044,7 +26349,13 @@
         <w:rPr>
           <w:rStyle w:val="VerbatimChar"/>
         </w:rPr>
-        <w:t>artifacts_missing</w:t>
+        <w:t>‎</w:t>
+      </w:r>
+      <w:r>
+        <w:rPr>
+          <w:rStyle w:val="VerbatimChar"/>
+        </w:rPr>
+        <w:t>artifacts_missing‎</w:t>
       </w:r>
       <w:r>
         <w:rPr>
@@ -26056,7 +26367,13 @@
         <w:rPr>
           <w:rStyle w:val="VerbatimChar"/>
         </w:rPr>
-        <w:t>instructor_disabled</w:t>
+        <w:t>‎</w:t>
+      </w:r>
+      <w:r>
+        <w:rPr>
+          <w:rStyle w:val="VerbatimChar"/>
+        </w:rPr>
+        <w:t>instructor_disabled‎</w:t>
       </w:r>
       <w:r>
         <w:rPr>
@@ -26071,7 +26388,7 @@
         <w:bidi w:val="1"/>
         <w:rPr/>
       </w:pPr>
-      <w:bookmarkStart w:id="88" w:name="__RefHeading___Toc2514_5898764"/>
+      <w:bookmarkStart w:id="88" w:name="__RefHeading___Toc2509_3553792858"/>
       <w:bookmarkEnd w:id="88"/>
       <w:r>
         <w:rPr/>
@@ -26280,7 +26597,15 @@
                 <w:kern w:val="0"/>
                 <w:lang w:val="en-US" w:eastAsia="en-US" w:bidi="ar-SA"/>
               </w:rPr>
-              <w:t>FFF_2013J</w:t>
+              <w:t>‎</w:t>
+            </w:r>
+            <w:r>
+              <w:rPr>
+                <w:rStyle w:val="VerbatimChar"/>
+                <w:kern w:val="0"/>
+                <w:lang w:val="en-US" w:eastAsia="en-US" w:bidi="ar-SA"/>
+              </w:rPr>
+              <w:t>FFF_2013J‎</w:t>
             </w:r>
           </w:p>
         </w:tc>
@@ -28750,7 +29075,15 @@
                 <w:kern w:val="0"/>
                 <w:lang w:val="en-US" w:eastAsia="en-US" w:bidi="ar-SA"/>
               </w:rPr>
-              <w:t>id_site</w:t>
+              <w:t>‎</w:t>
+            </w:r>
+            <w:r>
+              <w:rPr>
+                <w:rStyle w:val="VerbatimChar"/>
+                <w:kern w:val="0"/>
+                <w:lang w:val="en-US" w:eastAsia="en-US" w:bidi="ar-SA"/>
+              </w:rPr>
+              <w:t>id_site‎</w:t>
             </w:r>
           </w:p>
         </w:tc>
@@ -28796,7 +29129,7 @@
         <w:bidi w:val="1"/>
         <w:rPr/>
       </w:pPr>
-      <w:bookmarkStart w:id="90" w:name="__RefHeading___Toc2516_5898764"/>
+      <w:bookmarkStart w:id="90" w:name="__RefHeading___Toc2511_3553792858"/>
       <w:bookmarkEnd w:id="90"/>
       <w:r>
         <w:rPr/>
@@ -28812,7 +29145,7 @@
         <w:rPr>
           <w:rtl w:val="true"/>
         </w:rPr>
-        <w:t>عن اللقطات</w:t>
+        <w:t>عن صور الشاشة</w:t>
       </w:r>
     </w:p>
     <w:p>
@@ -28826,7 +29159,7 @@
         <w:rPr>
           <w:rtl w:val="true"/>
         </w:rPr>
-        <w:t>اللقطات المستعملة في هذا الدليل مأخوذة من وضع التشغيل الحي بعد آخر تحديث للواجهة</w:t>
+        <w:t>صور الشاشة المستعملة في هذا الدليل مأخوذة من وضع التشغيل الحي بعد آخر تحديث للواجهة</w:t>
       </w:r>
       <w:r>
         <w:rPr>
@@ -28838,7 +29171,7 @@
         <w:rPr>
           <w:rtl w:val="true"/>
         </w:rPr>
-        <w:t xml:space="preserve">لقطات المدرّس </w:t>
+        <w:t xml:space="preserve">صور المدرّس </w:t>
       </w:r>
       <w:r>
         <w:rPr>
@@ -28882,7 +29215,7 @@
         <w:rPr>
           <w:rtl w:val="true"/>
         </w:rPr>
-        <w:t xml:space="preserve">ولقطة المتعلم </w:t>
+        <w:t xml:space="preserve">وصورة المتعلم </w:t>
       </w:r>
       <w:r>
         <w:rPr>
@@ -28922,13 +29255,19 @@
         <w:rPr>
           <w:rtl w:val="true"/>
         </w:rPr>
-        <w:t xml:space="preserve">لقطات وضع المحاكاة القديمة نُقلت إلى </w:t>
+        <w:t xml:space="preserve">صور وضع المحاكاة نُقلت إلى </w:t>
       </w:r>
       <w:r>
         <w:rPr>
           <w:rStyle w:val="VerbatimChar"/>
         </w:rPr>
-        <w:t>src/frontend/screenshots/mock</w:t>
+        <w:t>‎</w:t>
+      </w:r>
+      <w:r>
+        <w:rPr>
+          <w:rStyle w:val="VerbatimChar"/>
+        </w:rPr>
+        <w:t>src/frontend/screenshots/mock‎</w:t>
       </w:r>
       <w:r>
         <w:rPr>
@@ -29003,7 +29342,7 @@
       <w:rPr>
         <w:rtl w:val="true"/>
       </w:rPr>
-      <w:t>36</w:t>
+      <w:t>37</w:t>
     </w:r>
     <w:r>
       <w:rPr>
@@ -29046,7 +29385,7 @@
       <w:rPr>
         <w:rtl w:val="true"/>
       </w:rPr>
-      <w:t>36</w:t>
+      <w:t>37</w:t>
     </w:r>
     <w:r>
       <w:rPr>

</xml_diff>

<commit_message>
WIP: agents' in-progress edits
Co-Authored-By: Claude Fable 5.1 <noreply@anthropic.com>
Claude-Session: https://claude.ai/code/session_01Y5Ccgz17Pq2brpK5TTSYa7
</commit_message>
<xml_diff>
--- a/deliverables/05-user-guide/دليل-المستخدم-والواجهات.docx
+++ b/deliverables/05-user-guide/دليل-المستخدم-والواجهات.docx
@@ -378,7 +378,7 @@
             </w:rPr>
             <w:fldChar w:fldCharType="separate"/>
           </w:r>
-          <w:hyperlink w:anchor="__RefHeading___Toc2429_3553792858">
+          <w:hyperlink w:anchor="__RefHeading___Toc2429_2819991301">
             <w:r>
               <w:rPr>
                 <w:webHidden/>
@@ -424,7 +424,7 @@
             </w:tabs>
             <w:rPr/>
           </w:pPr>
-          <w:hyperlink w:anchor="__RefHeading___Toc2431_3553792858">
+          <w:hyperlink w:anchor="__RefHeading___Toc2431_2819991301">
             <w:r>
               <w:rPr>
                 <w:webHidden/>
@@ -470,7 +470,7 @@
             </w:tabs>
             <w:rPr/>
           </w:pPr>
-          <w:hyperlink w:anchor="__RefHeading___Toc2433_3553792858">
+          <w:hyperlink w:anchor="__RefHeading___Toc2433_2819991301">
             <w:r>
               <w:rPr>
                 <w:webHidden/>
@@ -516,7 +516,7 @@
             </w:tabs>
             <w:rPr/>
           </w:pPr>
-          <w:hyperlink w:anchor="__RefHeading___Toc2435_3553792858">
+          <w:hyperlink w:anchor="__RefHeading___Toc2435_2819991301">
             <w:r>
               <w:rPr>
                 <w:webHidden/>
@@ -562,7 +562,7 @@
             </w:tabs>
             <w:rPr/>
           </w:pPr>
-          <w:hyperlink w:anchor="__RefHeading___Toc2437_3553792858">
+          <w:hyperlink w:anchor="__RefHeading___Toc2437_2819991301">
             <w:r>
               <w:rPr>
                 <w:webHidden/>
@@ -623,7 +623,7 @@
             </w:tabs>
             <w:rPr/>
           </w:pPr>
-          <w:hyperlink w:anchor="__RefHeading___Toc2439_3553792858">
+          <w:hyperlink w:anchor="__RefHeading___Toc2439_2819991301">
             <w:r>
               <w:rPr>
                 <w:webHidden/>
@@ -669,7 +669,7 @@
             </w:tabs>
             <w:rPr/>
           </w:pPr>
-          <w:hyperlink w:anchor="__RefHeading___Toc2441_3553792858">
+          <w:hyperlink w:anchor="__RefHeading___Toc2441_2819991301">
             <w:r>
               <w:rPr>
                 <w:webHidden/>
@@ -715,7 +715,7 @@
             </w:tabs>
             <w:rPr/>
           </w:pPr>
-          <w:hyperlink w:anchor="__RefHeading___Toc2443_3553792858">
+          <w:hyperlink w:anchor="__RefHeading___Toc2443_2819991301">
             <w:r>
               <w:rPr>
                 <w:webHidden/>
@@ -761,7 +761,7 @@
             </w:tabs>
             <w:rPr/>
           </w:pPr>
-          <w:hyperlink w:anchor="__RefHeading___Toc2445_3553792858">
+          <w:hyperlink w:anchor="__RefHeading___Toc2445_2819991301">
             <w:r>
               <w:rPr>
                 <w:webHidden/>
@@ -822,7 +822,7 @@
             </w:tabs>
             <w:rPr/>
           </w:pPr>
-          <w:hyperlink w:anchor="__RefHeading___Toc2447_3553792858">
+          <w:hyperlink w:anchor="__RefHeading___Toc2447_2819991301">
             <w:r>
               <w:rPr>
                 <w:webHidden/>
@@ -868,7 +868,7 @@
             </w:tabs>
             <w:rPr/>
           </w:pPr>
-          <w:hyperlink w:anchor="__RefHeading___Toc2449_3553792858">
+          <w:hyperlink w:anchor="__RefHeading___Toc2449_2819991301">
             <w:r>
               <w:rPr>
                 <w:webHidden/>
@@ -914,7 +914,7 @@
             </w:tabs>
             <w:rPr/>
           </w:pPr>
-          <w:hyperlink w:anchor="__RefHeading___Toc2451_3553792858">
+          <w:hyperlink w:anchor="__RefHeading___Toc2451_2819991301">
             <w:r>
               <w:rPr>
                 <w:webHidden/>
@@ -960,7 +960,7 @@
             </w:tabs>
             <w:rPr/>
           </w:pPr>
-          <w:hyperlink w:anchor="__RefHeading___Toc2453_3553792858">
+          <w:hyperlink w:anchor="__RefHeading___Toc2453_2819991301">
             <w:r>
               <w:rPr>
                 <w:webHidden/>
@@ -1006,7 +1006,7 @@
             </w:tabs>
             <w:rPr/>
           </w:pPr>
-          <w:hyperlink w:anchor="__RefHeading___Toc2455_3553792858">
+          <w:hyperlink w:anchor="__RefHeading___Toc2455_2819991301">
             <w:r>
               <w:rPr>
                 <w:webHidden/>
@@ -1052,7 +1052,7 @@
             </w:tabs>
             <w:rPr/>
           </w:pPr>
-          <w:hyperlink w:anchor="__RefHeading___Toc2457_3553792858">
+          <w:hyperlink w:anchor="__RefHeading___Toc2457_2819991301">
             <w:r>
               <w:rPr>
                 <w:webHidden/>
@@ -1098,7 +1098,7 @@
             </w:tabs>
             <w:rPr/>
           </w:pPr>
-          <w:hyperlink w:anchor="__RefHeading___Toc2459_3553792858">
+          <w:hyperlink w:anchor="__RefHeading___Toc2459_2819991301">
             <w:r>
               <w:rPr>
                 <w:webHidden/>
@@ -1144,7 +1144,7 @@
             </w:tabs>
             <w:rPr/>
           </w:pPr>
-          <w:hyperlink w:anchor="__RefHeading___Toc2461_3553792858">
+          <w:hyperlink w:anchor="__RefHeading___Toc2461_2819991301">
             <w:r>
               <w:rPr>
                 <w:webHidden/>
@@ -1205,7 +1205,7 @@
             </w:tabs>
             <w:rPr/>
           </w:pPr>
-          <w:hyperlink w:anchor="__RefHeading___Toc2463_3553792858">
+          <w:hyperlink w:anchor="__RefHeading___Toc2463_2819991301">
             <w:r>
               <w:rPr>
                 <w:webHidden/>
@@ -1266,7 +1266,7 @@
             </w:tabs>
             <w:rPr/>
           </w:pPr>
-          <w:hyperlink w:anchor="__RefHeading___Toc2465_3553792858">
+          <w:hyperlink w:anchor="__RefHeading___Toc2465_2819991301">
             <w:r>
               <w:rPr>
                 <w:webHidden/>
@@ -1327,7 +1327,7 @@
             </w:tabs>
             <w:rPr/>
           </w:pPr>
-          <w:hyperlink w:anchor="__RefHeading___Toc2467_3553792858">
+          <w:hyperlink w:anchor="__RefHeading___Toc2467_2819991301">
             <w:r>
               <w:rPr>
                 <w:webHidden/>
@@ -1388,7 +1388,7 @@
             </w:tabs>
             <w:rPr/>
           </w:pPr>
-          <w:hyperlink w:anchor="__RefHeading___Toc2469_3553792858">
+          <w:hyperlink w:anchor="__RefHeading___Toc2469_2819991301">
             <w:r>
               <w:rPr>
                 <w:webHidden/>
@@ -1454,7 +1454,7 @@
             </w:tabs>
             <w:rPr/>
           </w:pPr>
-          <w:hyperlink w:anchor="__RefHeading___Toc2471_3553792858">
+          <w:hyperlink w:anchor="__RefHeading___Toc2471_2819991301">
             <w:r>
               <w:rPr>
                 <w:webHidden/>
@@ -1500,7 +1500,7 @@
             </w:tabs>
             <w:rPr/>
           </w:pPr>
-          <w:hyperlink w:anchor="__RefHeading___Toc2473_3553792858">
+          <w:hyperlink w:anchor="__RefHeading___Toc2473_2819991301">
             <w:r>
               <w:rPr>
                 <w:webHidden/>
@@ -1561,7 +1561,7 @@
             </w:tabs>
             <w:rPr/>
           </w:pPr>
-          <w:hyperlink w:anchor="__RefHeading___Toc2475_3553792858">
+          <w:hyperlink w:anchor="__RefHeading___Toc2475_2819991301">
             <w:r>
               <w:rPr>
                 <w:webHidden/>
@@ -1607,7 +1607,7 @@
             </w:tabs>
             <w:rPr/>
           </w:pPr>
-          <w:hyperlink w:anchor="__RefHeading___Toc2477_3553792858">
+          <w:hyperlink w:anchor="__RefHeading___Toc2477_2819991301">
             <w:r>
               <w:rPr>
                 <w:webHidden/>
@@ -1653,7 +1653,7 @@
             </w:tabs>
             <w:rPr/>
           </w:pPr>
-          <w:hyperlink w:anchor="__RefHeading___Toc2479_3553792858">
+          <w:hyperlink w:anchor="__RefHeading___Toc2479_2819991301">
             <w:r>
               <w:rPr>
                 <w:webHidden/>
@@ -1705,7 +1705,7 @@
             </w:tabs>
             <w:rPr/>
           </w:pPr>
-          <w:hyperlink w:anchor="__RefHeading___Toc2481_3553792858">
+          <w:hyperlink w:anchor="__RefHeading___Toc2481_2819991301">
             <w:r>
               <w:rPr>
                 <w:webHidden/>
@@ -1751,7 +1751,7 @@
             </w:tabs>
             <w:rPr/>
           </w:pPr>
-          <w:hyperlink w:anchor="__RefHeading___Toc2483_3553792858">
+          <w:hyperlink w:anchor="__RefHeading___Toc2483_2819991301">
             <w:r>
               <w:rPr>
                 <w:webHidden/>
@@ -1797,7 +1797,7 @@
             </w:tabs>
             <w:rPr/>
           </w:pPr>
-          <w:hyperlink w:anchor="__RefHeading___Toc2485_3553792858">
+          <w:hyperlink w:anchor="__RefHeading___Toc2485_2819991301">
             <w:r>
               <w:rPr>
                 <w:webHidden/>
@@ -1843,7 +1843,7 @@
             </w:tabs>
             <w:rPr/>
           </w:pPr>
-          <w:hyperlink w:anchor="__RefHeading___Toc2487_3553792858">
+          <w:hyperlink w:anchor="__RefHeading___Toc2487_2819991301">
             <w:r>
               <w:rPr>
                 <w:webHidden/>
@@ -1889,7 +1889,7 @@
             </w:tabs>
             <w:rPr/>
           </w:pPr>
-          <w:hyperlink w:anchor="__RefHeading___Toc2489_3553792858">
+          <w:hyperlink w:anchor="__RefHeading___Toc2489_2819991301">
             <w:r>
               <w:rPr>
                 <w:webHidden/>
@@ -1935,7 +1935,7 @@
             </w:tabs>
             <w:rPr/>
           </w:pPr>
-          <w:hyperlink w:anchor="__RefHeading___Toc2491_3553792858">
+          <w:hyperlink w:anchor="__RefHeading___Toc2491_2819991301">
             <w:r>
               <w:rPr>
                 <w:webHidden/>
@@ -1981,7 +1981,7 @@
             </w:tabs>
             <w:rPr/>
           </w:pPr>
-          <w:hyperlink w:anchor="__RefHeading___Toc2493_3553792858">
+          <w:hyperlink w:anchor="__RefHeading___Toc2493_2819991301">
             <w:r>
               <w:rPr>
                 <w:webHidden/>
@@ -2027,7 +2027,7 @@
             </w:tabs>
             <w:rPr/>
           </w:pPr>
-          <w:hyperlink w:anchor="__RefHeading___Toc2495_3553792858">
+          <w:hyperlink w:anchor="__RefHeading___Toc2495_2819991301">
             <w:r>
               <w:rPr>
                 <w:webHidden/>
@@ -2073,7 +2073,7 @@
             </w:tabs>
             <w:rPr/>
           </w:pPr>
-          <w:hyperlink w:anchor="__RefHeading___Toc2497_3553792858">
+          <w:hyperlink w:anchor="__RefHeading___Toc2497_2819991301">
             <w:r>
               <w:rPr>
                 <w:webHidden/>
@@ -2119,7 +2119,7 @@
             </w:tabs>
             <w:rPr/>
           </w:pPr>
-          <w:hyperlink w:anchor="__RefHeading___Toc2499_3553792858">
+          <w:hyperlink w:anchor="__RefHeading___Toc2499_2819991301">
             <w:r>
               <w:rPr>
                 <w:webHidden/>
@@ -2179,7 +2179,7 @@
             </w:tabs>
             <w:rPr/>
           </w:pPr>
-          <w:hyperlink w:anchor="__RefHeading___Toc2501_3553792858">
+          <w:hyperlink w:anchor="__RefHeading___Toc2501_2819991301">
             <w:r>
               <w:rPr>
                 <w:webHidden/>
@@ -2225,7 +2225,7 @@
             </w:tabs>
             <w:rPr/>
           </w:pPr>
-          <w:hyperlink w:anchor="__RefHeading___Toc2503_3553792858">
+          <w:hyperlink w:anchor="__RefHeading___Toc2503_2819991301">
             <w:r>
               <w:rPr>
                 <w:webHidden/>
@@ -2271,7 +2271,7 @@
             </w:tabs>
             <w:rPr/>
           </w:pPr>
-          <w:hyperlink w:anchor="__RefHeading___Toc2505_3553792858">
+          <w:hyperlink w:anchor="__RefHeading___Toc2505_2819991301">
             <w:r>
               <w:rPr>
                 <w:webHidden/>
@@ -2317,7 +2317,7 @@
             </w:tabs>
             <w:rPr/>
           </w:pPr>
-          <w:hyperlink w:anchor="__RefHeading___Toc2507_3553792858">
+          <w:hyperlink w:anchor="__RefHeading___Toc2507_2819991301">
             <w:r>
               <w:rPr>
                 <w:webHidden/>
@@ -2378,7 +2378,7 @@
             </w:tabs>
             <w:rPr/>
           </w:pPr>
-          <w:hyperlink w:anchor="__RefHeading___Toc2509_3553792858">
+          <w:hyperlink w:anchor="__RefHeading___Toc2509_2819991301">
             <w:r>
               <w:rPr>
                 <w:webHidden/>
@@ -2424,7 +2424,7 @@
             </w:tabs>
             <w:rPr/>
           </w:pPr>
-          <w:hyperlink w:anchor="__RefHeading___Toc2511_3553792858">
+          <w:hyperlink w:anchor="__RefHeading___Toc2511_2819991301">
             <w:r>
               <w:rPr>
                 <w:webHidden/>
@@ -2475,7 +2475,7 @@
         <w:bidi w:val="1"/>
         <w:rPr/>
       </w:pPr>
-      <w:bookmarkStart w:id="0" w:name="__RefHeading___Toc2429_3553792858"/>
+      <w:bookmarkStart w:id="0" w:name="__RefHeading___Toc2429_2819991301"/>
       <w:bookmarkStart w:id="1" w:name="مقدمة"/>
       <w:bookmarkEnd w:id="0"/>
       <w:r>
@@ -2501,7 +2501,7 @@
         <w:bidi w:val="1"/>
         <w:rPr/>
       </w:pPr>
-      <w:bookmarkStart w:id="2" w:name="__RefHeading___Toc2431_3553792858"/>
+      <w:bookmarkStart w:id="2" w:name="__RefHeading___Toc2431_2819991301"/>
       <w:bookmarkStart w:id="3" w:name="ما-هذا-النظام"/>
       <w:bookmarkEnd w:id="2"/>
       <w:r>
@@ -2760,7 +2760,7 @@
         <w:bidi w:val="1"/>
         <w:rPr/>
       </w:pPr>
-      <w:bookmarkStart w:id="4" w:name="__RefHeading___Toc2433_3553792858"/>
+      <w:bookmarkStart w:id="4" w:name="__RefHeading___Toc2433_2819991301"/>
       <w:bookmarkStart w:id="5" w:name="ما-الذي-يفعله-النظام-وما-الذي-لا-يفعله"/>
       <w:bookmarkEnd w:id="4"/>
       <w:r>
@@ -3482,7 +3482,7 @@
         <w:bidi w:val="1"/>
         <w:rPr/>
       </w:pPr>
-      <w:bookmarkStart w:id="6" w:name="__RefHeading___Toc2435_3553792858"/>
+      <w:bookmarkStart w:id="6" w:name="__RefHeading___Toc2435_2819991301"/>
       <w:bookmarkStart w:id="7" w:name="لمن-هذا-الدليل"/>
       <w:bookmarkEnd w:id="6"/>
       <w:r>
@@ -3747,7 +3747,7 @@
         <w:bidi w:val="1"/>
         <w:rPr/>
       </w:pPr>
-      <w:bookmarkStart w:id="8" w:name="__RefHeading___Toc2437_3553792858"/>
+      <w:bookmarkStart w:id="8" w:name="__RefHeading___Toc2437_2819991301"/>
       <w:bookmarkStart w:id="9" w:name="شريط-عرض-توضيحي-بلا-أمان-وصول"/>
       <w:bookmarkEnd w:id="8"/>
       <w:r>
@@ -3966,7 +3966,7 @@
         <w:bidi w:val="1"/>
         <w:rPr/>
       </w:pPr>
-      <w:bookmarkStart w:id="10" w:name="__RefHeading___Toc2439_3553792858"/>
+      <w:bookmarkStart w:id="10" w:name="__RefHeading___Toc2439_2819991301"/>
       <w:bookmarkStart w:id="11" w:name="المتطلبات"/>
       <w:bookmarkEnd w:id="10"/>
       <w:r>
@@ -4481,7 +4481,7 @@
         <w:bidi w:val="1"/>
         <w:rPr/>
       </w:pPr>
-      <w:bookmarkStart w:id="14" w:name="__RefHeading___Toc2441_3553792858"/>
+      <w:bookmarkStart w:id="14" w:name="__RefHeading___Toc2441_2819991301"/>
       <w:bookmarkStart w:id="15" w:name="البدء-السريع-لمشغل-النظام"/>
       <w:bookmarkEnd w:id="14"/>
       <w:r>
@@ -4550,7 +4550,7 @@
         <w:bidi w:val="1"/>
         <w:rPr/>
       </w:pPr>
-      <w:bookmarkStart w:id="16" w:name="__RefHeading___Toc2443_3553792858"/>
+      <w:bookmarkStart w:id="16" w:name="__RefHeading___Toc2443_2819991301"/>
       <w:bookmarkStart w:id="17" w:name="الخطوات-الأساسية"/>
       <w:bookmarkEnd w:id="16"/>
       <w:r>
@@ -6647,7 +6647,7 @@
         <w:bidi w:val="1"/>
         <w:rPr/>
       </w:pPr>
-      <w:bookmarkStart w:id="18" w:name="__RefHeading___Toc2445_3553792858"/>
+      <w:bookmarkStart w:id="18" w:name="__RefHeading___Toc2445_2819991301"/>
       <w:bookmarkStart w:id="19" w:name="وضع-المحاكاة-بلا-خادم"/>
       <w:bookmarkEnd w:id="18"/>
       <w:r>
@@ -7180,7 +7180,7 @@
         <w:bidi w:val="1"/>
         <w:rPr/>
       </w:pPr>
-      <w:bookmarkStart w:id="20" w:name="__RefHeading___Toc2447_3553792858"/>
+      <w:bookmarkStart w:id="20" w:name="__RefHeading___Toc2447_2819991301"/>
       <w:bookmarkStart w:id="21" w:name="صور-الشاشة"/>
       <w:bookmarkEnd w:id="20"/>
       <w:r>
@@ -7361,7 +7361,7 @@
         <w:bidi w:val="1"/>
         <w:rPr/>
       </w:pPr>
-      <w:bookmarkStart w:id="22" w:name="__RefHeading___Toc2449_3553792858"/>
+      <w:bookmarkStart w:id="22" w:name="__RefHeading___Toc2449_2819991301"/>
       <w:bookmarkStart w:id="23" w:name="استكشاف-الأخطاء-الشائعة"/>
       <w:bookmarkEnd w:id="22"/>
       <w:r>
@@ -8895,7 +8895,7 @@
         <w:bidi w:val="1"/>
         <w:rPr/>
       </w:pPr>
-      <w:bookmarkStart w:id="26" w:name="__RefHeading___Toc2451_3553792858"/>
+      <w:bookmarkStart w:id="26" w:name="__RefHeading___Toc2451_2819991301"/>
       <w:bookmarkStart w:id="27" w:name="دليل-المتعلم"/>
       <w:bookmarkEnd w:id="26"/>
       <w:r>
@@ -8973,7 +8973,7 @@
         <w:bidi w:val="1"/>
         <w:rPr/>
       </w:pPr>
-      <w:bookmarkStart w:id="28" w:name="__RefHeading___Toc2453_3553792858"/>
+      <w:bookmarkStart w:id="28" w:name="__RefHeading___Toc2453_2819991301"/>
       <w:bookmarkStart w:id="29" w:name="الصفحة-الرئيسية"/>
       <w:bookmarkEnd w:id="28"/>
       <w:r>
@@ -9752,7 +9752,7 @@
         <w:bidi w:val="1"/>
         <w:rPr/>
       </w:pPr>
-      <w:bookmarkStart w:id="30" w:name="__RefHeading___Toc2455_3553792858"/>
+      <w:bookmarkStart w:id="30" w:name="__RefHeading___Toc2455_2819991301"/>
       <w:bookmarkStart w:id="31" w:name="شريط-الأيام-ومعنى-العلامات"/>
       <w:bookmarkEnd w:id="30"/>
       <w:r>
@@ -11156,7 +11156,7 @@
         <w:bidi w:val="1"/>
         <w:rPr/>
       </w:pPr>
-      <w:bookmarkStart w:id="32" w:name="__RefHeading___Toc2457_3553792858"/>
+      <w:bookmarkStart w:id="32" w:name="__RefHeading___Toc2457_2819991301"/>
       <w:bookmarkStart w:id="33" w:name="شريط-السياق"/>
       <w:bookmarkEnd w:id="32"/>
       <w:r>
@@ -11634,7 +11634,7 @@
         <w:bidi w:val="1"/>
         <w:rPr/>
       </w:pPr>
-      <w:bookmarkStart w:id="34" w:name="__RefHeading___Toc2459_3553792858"/>
+      <w:bookmarkStart w:id="34" w:name="__RefHeading___Toc2459_2819991301"/>
       <w:bookmarkStart w:id="35" w:name="قراءة-بطاقة-التوصية"/>
       <w:bookmarkEnd w:id="34"/>
       <w:r>
@@ -12504,7 +12504,7 @@
         <w:bidi w:val="1"/>
         <w:rPr/>
       </w:pPr>
-      <w:bookmarkStart w:id="36" w:name="__RefHeading___Toc2461_3553792858"/>
+      <w:bookmarkStart w:id="36" w:name="__RefHeading___Toc2461_2819991301"/>
       <w:bookmarkStart w:id="37" w:name="نافذة-لماذا"/>
       <w:bookmarkEnd w:id="36"/>
       <w:r>
@@ -13173,7 +13173,7 @@
         <w:bidi w:val="1"/>
         <w:rPr/>
       </w:pPr>
-      <w:bookmarkStart w:id="38" w:name="__RefHeading___Toc2463_3553792858"/>
+      <w:bookmarkStart w:id="38" w:name="__RefHeading___Toc2463_2819991301"/>
       <w:bookmarkStart w:id="39" w:name="شارة-تاريخ-النموذج"/>
       <w:bookmarkEnd w:id="38"/>
       <w:r>
@@ -13566,7 +13566,7 @@
         <w:bidi w:val="1"/>
         <w:rPr/>
       </w:pPr>
-      <w:bookmarkStart w:id="40" w:name="__RefHeading___Toc2465_3553792858"/>
+      <w:bookmarkStart w:id="40" w:name="__RefHeading___Toc2465_2819991301"/>
       <w:bookmarkStart w:id="41" w:name="حالة-قبل-أول-قطع"/>
       <w:bookmarkEnd w:id="40"/>
       <w:r>
@@ -13830,7 +13830,7 @@
         <w:bidi w:val="1"/>
         <w:rPr/>
       </w:pPr>
-      <w:bookmarkStart w:id="42" w:name="__RefHeading___Toc2467_3553792858"/>
+      <w:bookmarkStart w:id="42" w:name="__RefHeading___Toc2467_2819991301"/>
       <w:bookmarkStart w:id="43" w:name="حالة-بلا-نشاط-سابق"/>
       <w:bookmarkEnd w:id="42"/>
       <w:r>
@@ -13940,7 +13940,7 @@
         <w:bidi w:val="1"/>
         <w:rPr/>
       </w:pPr>
-      <w:bookmarkStart w:id="44" w:name="__RefHeading___Toc2469_3553792858"/>
+      <w:bookmarkStart w:id="44" w:name="__RefHeading___Toc2469_2819991301"/>
       <w:bookmarkStart w:id="45" w:name="نشاطي-في-آخر-28-يوما"/>
       <w:bookmarkEnd w:id="44"/>
       <w:r>
@@ -14281,7 +14281,7 @@
         <w:bidi w:val="1"/>
         <w:rPr/>
       </w:pPr>
-      <w:bookmarkStart w:id="46" w:name="__RefHeading___Toc2471_3553792858"/>
+      <w:bookmarkStart w:id="46" w:name="__RefHeading___Toc2471_2819991301"/>
       <w:bookmarkStart w:id="47" w:name="ما-لا-تعرضه-صفحة-المتعلم"/>
       <w:bookmarkEnd w:id="46"/>
       <w:r>
@@ -14489,7 +14489,7 @@
         <w:bidi w:val="1"/>
         <w:rPr/>
       </w:pPr>
-      <w:bookmarkStart w:id="48" w:name="__RefHeading___Toc2473_3553792858"/>
+      <w:bookmarkStart w:id="48" w:name="__RefHeading___Toc2473_2819991301"/>
       <w:bookmarkStart w:id="49" w:name="حالة-منسحب"/>
       <w:bookmarkEnd w:id="48"/>
       <w:r>
@@ -14720,7 +14720,7 @@
         <w:bidi w:val="1"/>
         <w:rPr/>
       </w:pPr>
-      <w:bookmarkStart w:id="52" w:name="__RefHeading___Toc2475_3553792858"/>
+      <w:bookmarkStart w:id="52" w:name="__RefHeading___Toc2475_2819991301"/>
       <w:bookmarkStart w:id="53" w:name="دليل-المدرس-أو-المشرف"/>
       <w:bookmarkEnd w:id="52"/>
       <w:r>
@@ -14781,7 +14781,7 @@
         <w:bidi w:val="1"/>
         <w:rPr/>
       </w:pPr>
-      <w:bookmarkStart w:id="54" w:name="__RefHeading___Toc2477_3553792858"/>
+      <w:bookmarkStart w:id="54" w:name="__RefHeading___Toc2477_2819991301"/>
       <w:bookmarkStart w:id="55" w:name="تنبيه-قبل-البدء"/>
       <w:bookmarkEnd w:id="54"/>
       <w:r>
@@ -15061,7 +15061,7 @@
         <w:bidi w:val="1"/>
         <w:rPr/>
       </w:pPr>
-      <w:bookmarkStart w:id="56" w:name="__RefHeading___Toc2479_3553792858"/>
+      <w:bookmarkStart w:id="56" w:name="__RefHeading___Toc2479_2819991301"/>
       <w:bookmarkStart w:id="57" w:name="تبدأ-اللوحة-من-اليوم-56"/>
       <w:bookmarkEnd w:id="56"/>
       <w:r>
@@ -15149,7 +15149,7 @@
         <w:bidi w:val="1"/>
         <w:rPr/>
       </w:pPr>
-      <w:bookmarkStart w:id="58" w:name="__RefHeading___Toc2481_3553792858"/>
+      <w:bookmarkStart w:id="58" w:name="__RefHeading___Toc2481_2819991301"/>
       <w:bookmarkStart w:id="59" w:name="لوحة-المؤشرات"/>
       <w:bookmarkEnd w:id="58"/>
       <w:r>
@@ -16430,7 +16430,7 @@
         <w:bidi w:val="1"/>
         <w:rPr/>
       </w:pPr>
-      <w:bookmarkStart w:id="60" w:name="__RefHeading___Toc2483_3553792858"/>
+      <w:bookmarkStart w:id="60" w:name="__RefHeading___Toc2483_2819991301"/>
       <w:bookmarkStart w:id="61" w:name="العناقيد-السلوكية"/>
       <w:bookmarkEnd w:id="60"/>
       <w:r>
@@ -17576,7 +17576,7 @@
         <w:bidi w:val="1"/>
         <w:rPr/>
       </w:pPr>
-      <w:bookmarkStart w:id="62" w:name="__RefHeading___Toc2485_3553792858"/>
+      <w:bookmarkStart w:id="62" w:name="__RefHeading___Toc2485_2819991301"/>
       <w:bookmarkStart w:id="63" w:name="توزيع-درجة-الخطر-النسبية"/>
       <w:bookmarkEnd w:id="62"/>
       <w:r>
@@ -18458,7 +18458,7 @@
         <w:bidi w:val="1"/>
         <w:rPr/>
       </w:pPr>
-      <w:bookmarkStart w:id="64" w:name="__RefHeading___Toc2487_3553792858"/>
+      <w:bookmarkStart w:id="64" w:name="__RefHeading___Toc2487_2819991301"/>
       <w:bookmarkStart w:id="65" w:name="ملامح-السلوك"/>
       <w:bookmarkEnd w:id="64"/>
       <w:r>
@@ -18991,7 +18991,7 @@
         <w:bidi w:val="1"/>
         <w:rPr/>
       </w:pPr>
-      <w:bookmarkStart w:id="66" w:name="__RefHeading___Toc2489_3553792858"/>
+      <w:bookmarkStart w:id="66" w:name="__RefHeading___Toc2489_2819991301"/>
       <w:bookmarkStart w:id="67" w:name="تغطية-التوصيات"/>
       <w:bookmarkEnd w:id="66"/>
       <w:r>
@@ -19197,7 +19197,7 @@
         <w:bidi w:val="1"/>
         <w:rPr/>
       </w:pPr>
-      <w:bookmarkStart w:id="68" w:name="__RefHeading___Toc2491_3553792858"/>
+      <w:bookmarkStart w:id="68" w:name="__RefHeading___Toc2491_2819991301"/>
       <w:bookmarkStart w:id="69" w:name="جدول-المتعلمين"/>
       <w:bookmarkEnd w:id="68"/>
       <w:r>
@@ -19251,7 +19251,7 @@
         <w:rPr>
           <w:rtl w:val="true"/>
         </w:rPr>
-        <w:t xml:space="preserve">، وتحته سطر مثل </w:t>
+        <w:t xml:space="preserve">، وتحته سطر يصف الترتيب الحالي، مثل </w:t>
       </w:r>
       <w:r>
         <w:rPr>
@@ -19285,7 +19285,7 @@
         <w:rPr>
           <w:rtl w:val="true"/>
         </w:rPr>
-        <w:t>مرتبون حسب درجة الخطر</w:t>
+        <w:t>مرتبون حسب التسجيل تصاعدياً</w:t>
       </w:r>
       <w:r>
         <w:rPr>
@@ -19991,7 +19991,7 @@
         <w:rPr>
           <w:rtl w:val="true"/>
         </w:rPr>
-        <w:t>قائمة المتعلمين مرتبة بالدرجة النسبية، مع أهم عامل لكل متعلم</w:t>
+        <w:t>قائمة المتعلمين مع درجة الخطر وأهم عامل لكل متعلم، ويمكن ترتيبها بأي عمود</w:t>
       </w:r>
       <w:r>
         <w:rPr>
@@ -20728,7 +20728,7 @@
         <w:bidi w:val="1"/>
         <w:rPr/>
       </w:pPr>
-      <w:bookmarkStart w:id="70" w:name="__RefHeading___Toc2493_3553792858"/>
+      <w:bookmarkStart w:id="70" w:name="__RefHeading___Toc2493_2819991301"/>
       <w:bookmarkStart w:id="71" w:name="ملف-المتعلم"/>
       <w:bookmarkEnd w:id="70"/>
       <w:r>
@@ -21393,7 +21393,7 @@
         <w:bidi w:val="1"/>
         <w:rPr/>
       </w:pPr>
-      <w:bookmarkStart w:id="72" w:name="__RefHeading___Toc2495_3553792858"/>
+      <w:bookmarkStart w:id="72" w:name="__RefHeading___Toc2495_2819991301"/>
       <w:bookmarkStart w:id="73" w:name="القيود-الأخلاقية-والمنهجية"/>
       <w:bookmarkEnd w:id="72"/>
       <w:r>
@@ -21844,7 +21844,7 @@
         <w:bidi w:val="1"/>
         <w:rPr/>
       </w:pPr>
-      <w:bookmarkStart w:id="74" w:name="__RefHeading___Toc2497_3553792858"/>
+      <w:bookmarkStart w:id="74" w:name="__RefHeading___Toc2497_2819991301"/>
       <w:bookmarkStart w:id="75" w:name="ماذا-أفعل-كمدرس"/>
       <w:bookmarkEnd w:id="74"/>
       <w:r>
@@ -21963,7 +21963,7 @@
         <w:bidi w:val="1"/>
         <w:rPr/>
       </w:pPr>
-      <w:bookmarkStart w:id="76" w:name="__RefHeading___Toc2499_3553792858"/>
+      <w:bookmarkStart w:id="76" w:name="__RefHeading___Toc2499_2819991301"/>
       <w:bookmarkStart w:id="77" w:name="X745443570c429d909b26e3257e881b7ff04140e"/>
       <w:bookmarkEnd w:id="76"/>
       <w:r>
@@ -22437,7 +22437,7 @@
         <w:bidi w:val="1"/>
         <w:rPr/>
       </w:pPr>
-      <w:bookmarkStart w:id="80" w:name="__RefHeading___Toc2501_3553792858"/>
+      <w:bookmarkStart w:id="80" w:name="__RefHeading___Toc2501_2819991301"/>
       <w:bookmarkStart w:id="81" w:name="الأسئلة-الشائعة"/>
       <w:bookmarkEnd w:id="80"/>
       <w:r>
@@ -24075,7 +24075,7 @@
         <w:bidi w:val="1"/>
         <w:rPr/>
       </w:pPr>
-      <w:bookmarkStart w:id="83" w:name="__RefHeading___Toc2503_3553792858"/>
+      <w:bookmarkStart w:id="83" w:name="__RefHeading___Toc2503_2819991301"/>
       <w:bookmarkStart w:id="84" w:name="الملاحق"/>
       <w:bookmarkEnd w:id="83"/>
       <w:r>
@@ -24101,7 +24101,7 @@
         <w:bidi w:val="1"/>
         <w:rPr/>
       </w:pPr>
-      <w:bookmarkStart w:id="85" w:name="__RefHeading___Toc2505_3553792858"/>
+      <w:bookmarkStart w:id="85" w:name="__RefHeading___Toc2505_2819991301"/>
       <w:bookmarkEnd w:id="85"/>
       <w:r>
         <w:rPr/>
@@ -25270,7 +25270,7 @@
         <w:bidi w:val="1"/>
         <w:rPr/>
       </w:pPr>
-      <w:bookmarkStart w:id="87" w:name="__RefHeading___Toc2507_3553792858"/>
+      <w:bookmarkStart w:id="87" w:name="__RefHeading___Toc2507_2819991301"/>
       <w:bookmarkEnd w:id="87"/>
       <w:r>
         <w:rPr/>
@@ -26388,7 +26388,7 @@
         <w:bidi w:val="1"/>
         <w:rPr/>
       </w:pPr>
-      <w:bookmarkStart w:id="88" w:name="__RefHeading___Toc2509_3553792858"/>
+      <w:bookmarkStart w:id="88" w:name="__RefHeading___Toc2509_2819991301"/>
       <w:bookmarkEnd w:id="88"/>
       <w:r>
         <w:rPr/>
@@ -29129,7 +29129,7 @@
         <w:bidi w:val="1"/>
         <w:rPr/>
       </w:pPr>
-      <w:bookmarkStart w:id="90" w:name="__RefHeading___Toc2511_3553792858"/>
+      <w:bookmarkStart w:id="90" w:name="__RefHeading___Toc2511_2819991301"/>
       <w:bookmarkEnd w:id="90"/>
       <w:r>
         <w:rPr/>

</xml_diff>

<commit_message>
User guide: final pass after peer re-check (withdrawn state, table wording, lopo badge, figures recut); measured warm-up times in guide and backend README
Co-Authored-By: Claude Fable 5.1 <noreply@anthropic.com>
Claude-Session: https://claude.ai/code/session_01Y5Ccgz17Pq2brpK5TTSYa7
</commit_message>
<xml_diff>
--- a/deliverables/05-user-guide/دليل-المستخدم-والواجهات.docx
+++ b/deliverables/05-user-guide/دليل-المستخدم-والواجهات.docx
@@ -378,7 +378,7 @@
             </w:rPr>
             <w:fldChar w:fldCharType="separate"/>
           </w:r>
-          <w:hyperlink w:anchor="__RefHeading___Toc2429_2819991301">
+          <w:hyperlink w:anchor="__RefHeading___Toc2429_1971269794">
             <w:r>
               <w:rPr>
                 <w:webHidden/>
@@ -424,7 +424,7 @@
             </w:tabs>
             <w:rPr/>
           </w:pPr>
-          <w:hyperlink w:anchor="__RefHeading___Toc2431_2819991301">
+          <w:hyperlink w:anchor="__RefHeading___Toc2431_1971269794">
             <w:r>
               <w:rPr>
                 <w:webHidden/>
@@ -470,7 +470,7 @@
             </w:tabs>
             <w:rPr/>
           </w:pPr>
-          <w:hyperlink w:anchor="__RefHeading___Toc2433_2819991301">
+          <w:hyperlink w:anchor="__RefHeading___Toc2433_1971269794">
             <w:r>
               <w:rPr>
                 <w:webHidden/>
@@ -516,7 +516,7 @@
             </w:tabs>
             <w:rPr/>
           </w:pPr>
-          <w:hyperlink w:anchor="__RefHeading___Toc2435_2819991301">
+          <w:hyperlink w:anchor="__RefHeading___Toc2435_1971269794">
             <w:r>
               <w:rPr>
                 <w:webHidden/>
@@ -562,7 +562,7 @@
             </w:tabs>
             <w:rPr/>
           </w:pPr>
-          <w:hyperlink w:anchor="__RefHeading___Toc2437_2819991301">
+          <w:hyperlink w:anchor="__RefHeading___Toc2437_1971269794">
             <w:r>
               <w:rPr>
                 <w:webHidden/>
@@ -623,7 +623,7 @@
             </w:tabs>
             <w:rPr/>
           </w:pPr>
-          <w:hyperlink w:anchor="__RefHeading___Toc2439_2819991301">
+          <w:hyperlink w:anchor="__RefHeading___Toc2439_1971269794">
             <w:r>
               <w:rPr>
                 <w:webHidden/>
@@ -669,7 +669,7 @@
             </w:tabs>
             <w:rPr/>
           </w:pPr>
-          <w:hyperlink w:anchor="__RefHeading___Toc2441_2819991301">
+          <w:hyperlink w:anchor="__RefHeading___Toc2441_1971269794">
             <w:r>
               <w:rPr>
                 <w:webHidden/>
@@ -715,7 +715,7 @@
             </w:tabs>
             <w:rPr/>
           </w:pPr>
-          <w:hyperlink w:anchor="__RefHeading___Toc2443_2819991301">
+          <w:hyperlink w:anchor="__RefHeading___Toc2443_1971269794">
             <w:r>
               <w:rPr>
                 <w:webHidden/>
@@ -761,7 +761,7 @@
             </w:tabs>
             <w:rPr/>
           </w:pPr>
-          <w:hyperlink w:anchor="__RefHeading___Toc2445_2819991301">
+          <w:hyperlink w:anchor="__RefHeading___Toc2445_1971269794">
             <w:r>
               <w:rPr>
                 <w:webHidden/>
@@ -822,7 +822,7 @@
             </w:tabs>
             <w:rPr/>
           </w:pPr>
-          <w:hyperlink w:anchor="__RefHeading___Toc2447_2819991301">
+          <w:hyperlink w:anchor="__RefHeading___Toc2447_1971269794">
             <w:r>
               <w:rPr>
                 <w:webHidden/>
@@ -868,7 +868,7 @@
             </w:tabs>
             <w:rPr/>
           </w:pPr>
-          <w:hyperlink w:anchor="__RefHeading___Toc2449_2819991301">
+          <w:hyperlink w:anchor="__RefHeading___Toc2449_1971269794">
             <w:r>
               <w:rPr>
                 <w:webHidden/>
@@ -914,7 +914,7 @@
             </w:tabs>
             <w:rPr/>
           </w:pPr>
-          <w:hyperlink w:anchor="__RefHeading___Toc2451_2819991301">
+          <w:hyperlink w:anchor="__RefHeading___Toc2451_1971269794">
             <w:r>
               <w:rPr>
                 <w:webHidden/>
@@ -960,7 +960,7 @@
             </w:tabs>
             <w:rPr/>
           </w:pPr>
-          <w:hyperlink w:anchor="__RefHeading___Toc2453_2819991301">
+          <w:hyperlink w:anchor="__RefHeading___Toc2453_1971269794">
             <w:r>
               <w:rPr>
                 <w:webHidden/>
@@ -1006,7 +1006,7 @@
             </w:tabs>
             <w:rPr/>
           </w:pPr>
-          <w:hyperlink w:anchor="__RefHeading___Toc2455_2819991301">
+          <w:hyperlink w:anchor="__RefHeading___Toc2455_1971269794">
             <w:r>
               <w:rPr>
                 <w:webHidden/>
@@ -1052,7 +1052,7 @@
             </w:tabs>
             <w:rPr/>
           </w:pPr>
-          <w:hyperlink w:anchor="__RefHeading___Toc2457_2819991301">
+          <w:hyperlink w:anchor="__RefHeading___Toc2457_1971269794">
             <w:r>
               <w:rPr>
                 <w:webHidden/>
@@ -1098,7 +1098,7 @@
             </w:tabs>
             <w:rPr/>
           </w:pPr>
-          <w:hyperlink w:anchor="__RefHeading___Toc2459_2819991301">
+          <w:hyperlink w:anchor="__RefHeading___Toc2459_1971269794">
             <w:r>
               <w:rPr>
                 <w:webHidden/>
@@ -1144,7 +1144,7 @@
             </w:tabs>
             <w:rPr/>
           </w:pPr>
-          <w:hyperlink w:anchor="__RefHeading___Toc2461_2819991301">
+          <w:hyperlink w:anchor="__RefHeading___Toc2461_1971269794">
             <w:r>
               <w:rPr>
                 <w:webHidden/>
@@ -1205,7 +1205,7 @@
             </w:tabs>
             <w:rPr/>
           </w:pPr>
-          <w:hyperlink w:anchor="__RefHeading___Toc2463_2819991301">
+          <w:hyperlink w:anchor="__RefHeading___Toc2463_1971269794">
             <w:r>
               <w:rPr>
                 <w:webHidden/>
@@ -1266,7 +1266,7 @@
             </w:tabs>
             <w:rPr/>
           </w:pPr>
-          <w:hyperlink w:anchor="__RefHeading___Toc2465_2819991301">
+          <w:hyperlink w:anchor="__RefHeading___Toc2465_1971269794">
             <w:r>
               <w:rPr>
                 <w:webHidden/>
@@ -1327,7 +1327,7 @@
             </w:tabs>
             <w:rPr/>
           </w:pPr>
-          <w:hyperlink w:anchor="__RefHeading___Toc2467_2819991301">
+          <w:hyperlink w:anchor="__RefHeading___Toc2467_1971269794">
             <w:r>
               <w:rPr>
                 <w:webHidden/>
@@ -1388,7 +1388,7 @@
             </w:tabs>
             <w:rPr/>
           </w:pPr>
-          <w:hyperlink w:anchor="__RefHeading___Toc2469_2819991301">
+          <w:hyperlink w:anchor="__RefHeading___Toc2469_1971269794">
             <w:r>
               <w:rPr>
                 <w:webHidden/>
@@ -1454,7 +1454,7 @@
             </w:tabs>
             <w:rPr/>
           </w:pPr>
-          <w:hyperlink w:anchor="__RefHeading___Toc2471_2819991301">
+          <w:hyperlink w:anchor="__RefHeading___Toc2471_1971269794">
             <w:r>
               <w:rPr>
                 <w:webHidden/>
@@ -1500,7 +1500,7 @@
             </w:tabs>
             <w:rPr/>
           </w:pPr>
-          <w:hyperlink w:anchor="__RefHeading___Toc2473_2819991301">
+          <w:hyperlink w:anchor="__RefHeading___Toc2473_1971269794">
             <w:r>
               <w:rPr>
                 <w:webHidden/>
@@ -1561,7 +1561,7 @@
             </w:tabs>
             <w:rPr/>
           </w:pPr>
-          <w:hyperlink w:anchor="__RefHeading___Toc2475_2819991301">
+          <w:hyperlink w:anchor="__RefHeading___Toc2475_1971269794">
             <w:r>
               <w:rPr>
                 <w:webHidden/>
@@ -1607,7 +1607,7 @@
             </w:tabs>
             <w:rPr/>
           </w:pPr>
-          <w:hyperlink w:anchor="__RefHeading___Toc2477_2819991301">
+          <w:hyperlink w:anchor="__RefHeading___Toc2477_1971269794">
             <w:r>
               <w:rPr>
                 <w:webHidden/>
@@ -1653,7 +1653,7 @@
             </w:tabs>
             <w:rPr/>
           </w:pPr>
-          <w:hyperlink w:anchor="__RefHeading___Toc2479_2819991301">
+          <w:hyperlink w:anchor="__RefHeading___Toc2479_1971269794">
             <w:r>
               <w:rPr>
                 <w:webHidden/>
@@ -1705,7 +1705,7 @@
             </w:tabs>
             <w:rPr/>
           </w:pPr>
-          <w:hyperlink w:anchor="__RefHeading___Toc2481_2819991301">
+          <w:hyperlink w:anchor="__RefHeading___Toc2481_1971269794">
             <w:r>
               <w:rPr>
                 <w:webHidden/>
@@ -1751,7 +1751,7 @@
             </w:tabs>
             <w:rPr/>
           </w:pPr>
-          <w:hyperlink w:anchor="__RefHeading___Toc2483_2819991301">
+          <w:hyperlink w:anchor="__RefHeading___Toc2483_1971269794">
             <w:r>
               <w:rPr>
                 <w:webHidden/>
@@ -1797,7 +1797,7 @@
             </w:tabs>
             <w:rPr/>
           </w:pPr>
-          <w:hyperlink w:anchor="__RefHeading___Toc2485_2819991301">
+          <w:hyperlink w:anchor="__RefHeading___Toc2485_1971269794">
             <w:r>
               <w:rPr>
                 <w:webHidden/>
@@ -1843,7 +1843,7 @@
             </w:tabs>
             <w:rPr/>
           </w:pPr>
-          <w:hyperlink w:anchor="__RefHeading___Toc2487_2819991301">
+          <w:hyperlink w:anchor="__RefHeading___Toc2487_1971269794">
             <w:r>
               <w:rPr>
                 <w:webHidden/>
@@ -1889,7 +1889,7 @@
             </w:tabs>
             <w:rPr/>
           </w:pPr>
-          <w:hyperlink w:anchor="__RefHeading___Toc2489_2819991301">
+          <w:hyperlink w:anchor="__RefHeading___Toc2489_1971269794">
             <w:r>
               <w:rPr>
                 <w:webHidden/>
@@ -1935,7 +1935,7 @@
             </w:tabs>
             <w:rPr/>
           </w:pPr>
-          <w:hyperlink w:anchor="__RefHeading___Toc2491_2819991301">
+          <w:hyperlink w:anchor="__RefHeading___Toc2491_1971269794">
             <w:r>
               <w:rPr>
                 <w:webHidden/>
@@ -1981,7 +1981,7 @@
             </w:tabs>
             <w:rPr/>
           </w:pPr>
-          <w:hyperlink w:anchor="__RefHeading___Toc2493_2819991301">
+          <w:hyperlink w:anchor="__RefHeading___Toc2493_1971269794">
             <w:r>
               <w:rPr>
                 <w:webHidden/>
@@ -2027,7 +2027,7 @@
             </w:tabs>
             <w:rPr/>
           </w:pPr>
-          <w:hyperlink w:anchor="__RefHeading___Toc2495_2819991301">
+          <w:hyperlink w:anchor="__RefHeading___Toc2495_1971269794">
             <w:r>
               <w:rPr>
                 <w:webHidden/>
@@ -2073,7 +2073,7 @@
             </w:tabs>
             <w:rPr/>
           </w:pPr>
-          <w:hyperlink w:anchor="__RefHeading___Toc2497_2819991301">
+          <w:hyperlink w:anchor="__RefHeading___Toc2497_1971269794">
             <w:r>
               <w:rPr>
                 <w:webHidden/>
@@ -2119,7 +2119,7 @@
             </w:tabs>
             <w:rPr/>
           </w:pPr>
-          <w:hyperlink w:anchor="__RefHeading___Toc2499_2819991301">
+          <w:hyperlink w:anchor="__RefHeading___Toc2499_1971269794">
             <w:r>
               <w:rPr>
                 <w:webHidden/>
@@ -2179,7 +2179,7 @@
             </w:tabs>
             <w:rPr/>
           </w:pPr>
-          <w:hyperlink w:anchor="__RefHeading___Toc2501_2819991301">
+          <w:hyperlink w:anchor="__RefHeading___Toc2501_1971269794">
             <w:r>
               <w:rPr>
                 <w:webHidden/>
@@ -2225,7 +2225,7 @@
             </w:tabs>
             <w:rPr/>
           </w:pPr>
-          <w:hyperlink w:anchor="__RefHeading___Toc2503_2819991301">
+          <w:hyperlink w:anchor="__RefHeading___Toc2503_1971269794">
             <w:r>
               <w:rPr>
                 <w:webHidden/>
@@ -2271,7 +2271,7 @@
             </w:tabs>
             <w:rPr/>
           </w:pPr>
-          <w:hyperlink w:anchor="__RefHeading___Toc2505_2819991301">
+          <w:hyperlink w:anchor="__RefHeading___Toc2505_1971269794">
             <w:r>
               <w:rPr>
                 <w:webHidden/>
@@ -2317,7 +2317,7 @@
             </w:tabs>
             <w:rPr/>
           </w:pPr>
-          <w:hyperlink w:anchor="__RefHeading___Toc2507_2819991301">
+          <w:hyperlink w:anchor="__RefHeading___Toc2507_1971269794">
             <w:r>
               <w:rPr>
                 <w:webHidden/>
@@ -2378,7 +2378,7 @@
             </w:tabs>
             <w:rPr/>
           </w:pPr>
-          <w:hyperlink w:anchor="__RefHeading___Toc2509_2819991301">
+          <w:hyperlink w:anchor="__RefHeading___Toc2509_1971269794">
             <w:r>
               <w:rPr>
                 <w:webHidden/>
@@ -2424,7 +2424,7 @@
             </w:tabs>
             <w:rPr/>
           </w:pPr>
-          <w:hyperlink w:anchor="__RefHeading___Toc2511_2819991301">
+          <w:hyperlink w:anchor="__RefHeading___Toc2511_1971269794">
             <w:r>
               <w:rPr>
                 <w:webHidden/>
@@ -2475,7 +2475,7 @@
         <w:bidi w:val="1"/>
         <w:rPr/>
       </w:pPr>
-      <w:bookmarkStart w:id="0" w:name="__RefHeading___Toc2429_2819991301"/>
+      <w:bookmarkStart w:id="0" w:name="__RefHeading___Toc2429_1971269794"/>
       <w:bookmarkStart w:id="1" w:name="مقدمة"/>
       <w:bookmarkEnd w:id="0"/>
       <w:r>
@@ -2501,7 +2501,7 @@
         <w:bidi w:val="1"/>
         <w:rPr/>
       </w:pPr>
-      <w:bookmarkStart w:id="2" w:name="__RefHeading___Toc2431_2819991301"/>
+      <w:bookmarkStart w:id="2" w:name="__RefHeading___Toc2431_1971269794"/>
       <w:bookmarkStart w:id="3" w:name="ما-هذا-النظام"/>
       <w:bookmarkEnd w:id="2"/>
       <w:r>
@@ -2760,7 +2760,7 @@
         <w:bidi w:val="1"/>
         <w:rPr/>
       </w:pPr>
-      <w:bookmarkStart w:id="4" w:name="__RefHeading___Toc2433_2819991301"/>
+      <w:bookmarkStart w:id="4" w:name="__RefHeading___Toc2433_1971269794"/>
       <w:bookmarkStart w:id="5" w:name="ما-الذي-يفعله-النظام-وما-الذي-لا-يفعله"/>
       <w:bookmarkEnd w:id="4"/>
       <w:r>
@@ -3482,7 +3482,7 @@
         <w:bidi w:val="1"/>
         <w:rPr/>
       </w:pPr>
-      <w:bookmarkStart w:id="6" w:name="__RefHeading___Toc2435_2819991301"/>
+      <w:bookmarkStart w:id="6" w:name="__RefHeading___Toc2435_1971269794"/>
       <w:bookmarkStart w:id="7" w:name="لمن-هذا-الدليل"/>
       <w:bookmarkEnd w:id="6"/>
       <w:r>
@@ -3747,7 +3747,7 @@
         <w:bidi w:val="1"/>
         <w:rPr/>
       </w:pPr>
-      <w:bookmarkStart w:id="8" w:name="__RefHeading___Toc2437_2819991301"/>
+      <w:bookmarkStart w:id="8" w:name="__RefHeading___Toc2437_1971269794"/>
       <w:bookmarkStart w:id="9" w:name="شريط-عرض-توضيحي-بلا-أمان-وصول"/>
       <w:bookmarkEnd w:id="8"/>
       <w:r>
@@ -3966,7 +3966,7 @@
         <w:bidi w:val="1"/>
         <w:rPr/>
       </w:pPr>
-      <w:bookmarkStart w:id="10" w:name="__RefHeading___Toc2439_2819991301"/>
+      <w:bookmarkStart w:id="10" w:name="__RefHeading___Toc2439_1971269794"/>
       <w:bookmarkStart w:id="11" w:name="المتطلبات"/>
       <w:bookmarkEnd w:id="10"/>
       <w:r>
@@ -4481,7 +4481,7 @@
         <w:bidi w:val="1"/>
         <w:rPr/>
       </w:pPr>
-      <w:bookmarkStart w:id="14" w:name="__RefHeading___Toc2441_2819991301"/>
+      <w:bookmarkStart w:id="14" w:name="__RefHeading___Toc2441_1971269794"/>
       <w:bookmarkStart w:id="15" w:name="البدء-السريع-لمشغل-النظام"/>
       <w:bookmarkEnd w:id="14"/>
       <w:r>
@@ -4550,7 +4550,7 @@
         <w:bidi w:val="1"/>
         <w:rPr/>
       </w:pPr>
-      <w:bookmarkStart w:id="16" w:name="__RefHeading___Toc2443_2819991301"/>
+      <w:bookmarkStart w:id="16" w:name="__RefHeading___Toc2443_1971269794"/>
       <w:bookmarkStart w:id="17" w:name="الخطوات-الأساسية"/>
       <w:bookmarkEnd w:id="16"/>
       <w:r>
@@ -5337,7 +5337,7 @@
       </w:r>
       <w:r>
         <w:rPr/>
-        <w:t>28</w:t>
+        <w:t>36</w:t>
       </w:r>
       <w:r>
         <w:rPr>
@@ -5349,7 +5349,47 @@
         <w:rPr>
           <w:rtl w:val="true"/>
         </w:rPr>
-        <w:t xml:space="preserve">ثانية كاملة، ويصبح اليوم </w:t>
+        <w:t xml:space="preserve">ثانية كاملة على جهاز العمل </w:t>
+      </w:r>
+      <w:r>
+        <w:rPr>
+          <w:rtl w:val="true"/>
+        </w:rPr>
+        <w:t>(</w:t>
+      </w:r>
+      <w:r>
+        <w:rPr>
+          <w:rtl w:val="true"/>
+        </w:rPr>
+        <w:t xml:space="preserve">منها نحو </w:t>
+      </w:r>
+      <w:r>
+        <w:rPr/>
+        <w:t>20</w:t>
+      </w:r>
+      <w:r>
+        <w:rPr>
+          <w:rtl w:val="true"/>
+        </w:rPr>
+        <w:t xml:space="preserve"> </w:t>
+      </w:r>
+      <w:r>
+        <w:rPr>
+          <w:rtl w:val="true"/>
+        </w:rPr>
+        <w:t>ثانية لتسخين محرك التوصية نفسه</w:t>
+      </w:r>
+      <w:r>
+        <w:rPr>
+          <w:rtl w:val="true"/>
+        </w:rPr>
+        <w:t>)</w:t>
+      </w:r>
+      <w:r>
+        <w:rPr>
+          <w:rtl w:val="true"/>
+        </w:rPr>
+        <w:t xml:space="preserve">، ويصبح اليوم </w:t>
       </w:r>
       <w:r>
         <w:rPr/>
@@ -5369,7 +5409,7 @@
       </w:r>
       <w:r>
         <w:rPr/>
-        <w:t>12</w:t>
+        <w:t>25</w:t>
       </w:r>
       <w:r>
         <w:rPr>
@@ -6647,7 +6687,7 @@
         <w:bidi w:val="1"/>
         <w:rPr/>
       </w:pPr>
-      <w:bookmarkStart w:id="18" w:name="__RefHeading___Toc2445_2819991301"/>
+      <w:bookmarkStart w:id="18" w:name="__RefHeading___Toc2445_1971269794"/>
       <w:bookmarkStart w:id="19" w:name="وضع-المحاكاة-بلا-خادم"/>
       <w:bookmarkEnd w:id="18"/>
       <w:r>
@@ -7180,7 +7220,7 @@
         <w:bidi w:val="1"/>
         <w:rPr/>
       </w:pPr>
-      <w:bookmarkStart w:id="20" w:name="__RefHeading___Toc2447_2819991301"/>
+      <w:bookmarkStart w:id="20" w:name="__RefHeading___Toc2447_1971269794"/>
       <w:bookmarkStart w:id="21" w:name="صور-الشاشة"/>
       <w:bookmarkEnd w:id="20"/>
       <w:r>
@@ -7361,7 +7401,7 @@
         <w:bidi w:val="1"/>
         <w:rPr/>
       </w:pPr>
-      <w:bookmarkStart w:id="22" w:name="__RefHeading___Toc2449_2819991301"/>
+      <w:bookmarkStart w:id="22" w:name="__RefHeading___Toc2449_1971269794"/>
       <w:bookmarkStart w:id="23" w:name="استكشاف-الأخطاء-الشائعة"/>
       <w:bookmarkEnd w:id="22"/>
       <w:r>
@@ -8895,7 +8935,7 @@
         <w:bidi w:val="1"/>
         <w:rPr/>
       </w:pPr>
-      <w:bookmarkStart w:id="26" w:name="__RefHeading___Toc2451_2819991301"/>
+      <w:bookmarkStart w:id="26" w:name="__RefHeading___Toc2451_1971269794"/>
       <w:bookmarkStart w:id="27" w:name="دليل-المتعلم"/>
       <w:bookmarkEnd w:id="26"/>
       <w:r>
@@ -8973,7 +9013,7 @@
         <w:bidi w:val="1"/>
         <w:rPr/>
       </w:pPr>
-      <w:bookmarkStart w:id="28" w:name="__RefHeading___Toc2453_2819991301"/>
+      <w:bookmarkStart w:id="28" w:name="__RefHeading___Toc2453_1971269794"/>
       <w:bookmarkStart w:id="29" w:name="الصفحة-الرئيسية"/>
       <w:bookmarkEnd w:id="28"/>
       <w:r>
@@ -9752,7 +9792,7 @@
         <w:bidi w:val="1"/>
         <w:rPr/>
       </w:pPr>
-      <w:bookmarkStart w:id="30" w:name="__RefHeading___Toc2455_2819991301"/>
+      <w:bookmarkStart w:id="30" w:name="__RefHeading___Toc2455_1971269794"/>
       <w:bookmarkStart w:id="31" w:name="شريط-الأيام-ومعنى-العلامات"/>
       <w:bookmarkEnd w:id="30"/>
       <w:r>
@@ -11156,7 +11196,7 @@
         <w:bidi w:val="1"/>
         <w:rPr/>
       </w:pPr>
-      <w:bookmarkStart w:id="32" w:name="__RefHeading___Toc2457_2819991301"/>
+      <w:bookmarkStart w:id="32" w:name="__RefHeading___Toc2457_1971269794"/>
       <w:bookmarkStart w:id="33" w:name="شريط-السياق"/>
       <w:bookmarkEnd w:id="32"/>
       <w:r>
@@ -11634,7 +11674,7 @@
         <w:bidi w:val="1"/>
         <w:rPr/>
       </w:pPr>
-      <w:bookmarkStart w:id="34" w:name="__RefHeading___Toc2459_2819991301"/>
+      <w:bookmarkStart w:id="34" w:name="__RefHeading___Toc2459_1971269794"/>
       <w:bookmarkStart w:id="35" w:name="قراءة-بطاقة-التوصية"/>
       <w:bookmarkEnd w:id="34"/>
       <w:r>
@@ -12504,7 +12544,7 @@
         <w:bidi w:val="1"/>
         <w:rPr/>
       </w:pPr>
-      <w:bookmarkStart w:id="36" w:name="__RefHeading___Toc2461_2819991301"/>
+      <w:bookmarkStart w:id="36" w:name="__RefHeading___Toc2461_1971269794"/>
       <w:bookmarkStart w:id="37" w:name="نافذة-لماذا"/>
       <w:bookmarkEnd w:id="36"/>
       <w:r>
@@ -13173,7 +13213,7 @@
         <w:bidi w:val="1"/>
         <w:rPr/>
       </w:pPr>
-      <w:bookmarkStart w:id="38" w:name="__RefHeading___Toc2463_2819991301"/>
+      <w:bookmarkStart w:id="38" w:name="__RefHeading___Toc2463_1971269794"/>
       <w:bookmarkStart w:id="39" w:name="شارة-تاريخ-النموذج"/>
       <w:bookmarkEnd w:id="38"/>
       <w:r>
@@ -13566,7 +13606,7 @@
         <w:bidi w:val="1"/>
         <w:rPr/>
       </w:pPr>
-      <w:bookmarkStart w:id="40" w:name="__RefHeading___Toc2465_2819991301"/>
+      <w:bookmarkStart w:id="40" w:name="__RefHeading___Toc2465_1971269794"/>
       <w:bookmarkStart w:id="41" w:name="حالة-قبل-أول-قطع"/>
       <w:bookmarkEnd w:id="40"/>
       <w:r>
@@ -13830,7 +13870,7 @@
         <w:bidi w:val="1"/>
         <w:rPr/>
       </w:pPr>
-      <w:bookmarkStart w:id="42" w:name="__RefHeading___Toc2467_2819991301"/>
+      <w:bookmarkStart w:id="42" w:name="__RefHeading___Toc2467_1971269794"/>
       <w:bookmarkStart w:id="43" w:name="حالة-بلا-نشاط-سابق"/>
       <w:bookmarkEnd w:id="42"/>
       <w:r>
@@ -13940,7 +13980,7 @@
         <w:bidi w:val="1"/>
         <w:rPr/>
       </w:pPr>
-      <w:bookmarkStart w:id="44" w:name="__RefHeading___Toc2469_2819991301"/>
+      <w:bookmarkStart w:id="44" w:name="__RefHeading___Toc2469_1971269794"/>
       <w:bookmarkStart w:id="45" w:name="نشاطي-في-آخر-28-يوما"/>
       <w:bookmarkEnd w:id="44"/>
       <w:r>
@@ -14281,7 +14321,7 @@
         <w:bidi w:val="1"/>
         <w:rPr/>
       </w:pPr>
-      <w:bookmarkStart w:id="46" w:name="__RefHeading___Toc2471_2819991301"/>
+      <w:bookmarkStart w:id="46" w:name="__RefHeading___Toc2471_1971269794"/>
       <w:bookmarkStart w:id="47" w:name="ما-لا-تعرضه-صفحة-المتعلم"/>
       <w:bookmarkEnd w:id="46"/>
       <w:r>
@@ -14489,7 +14529,7 @@
         <w:bidi w:val="1"/>
         <w:rPr/>
       </w:pPr>
-      <w:bookmarkStart w:id="48" w:name="__RefHeading___Toc2473_2819991301"/>
+      <w:bookmarkStart w:id="48" w:name="__RefHeading___Toc2473_1971269794"/>
       <w:bookmarkStart w:id="49" w:name="حالة-منسحب"/>
       <w:bookmarkEnd w:id="48"/>
       <w:r>
@@ -14720,7 +14760,7 @@
         <w:bidi w:val="1"/>
         <w:rPr/>
       </w:pPr>
-      <w:bookmarkStart w:id="52" w:name="__RefHeading___Toc2475_2819991301"/>
+      <w:bookmarkStart w:id="52" w:name="__RefHeading___Toc2475_1971269794"/>
       <w:bookmarkStart w:id="53" w:name="دليل-المدرس-أو-المشرف"/>
       <w:bookmarkEnd w:id="52"/>
       <w:r>
@@ -14781,7 +14821,7 @@
         <w:bidi w:val="1"/>
         <w:rPr/>
       </w:pPr>
-      <w:bookmarkStart w:id="54" w:name="__RefHeading___Toc2477_2819991301"/>
+      <w:bookmarkStart w:id="54" w:name="__RefHeading___Toc2477_1971269794"/>
       <w:bookmarkStart w:id="55" w:name="تنبيه-قبل-البدء"/>
       <w:bookmarkEnd w:id="54"/>
       <w:r>
@@ -15061,7 +15101,7 @@
         <w:bidi w:val="1"/>
         <w:rPr/>
       </w:pPr>
-      <w:bookmarkStart w:id="56" w:name="__RefHeading___Toc2479_2819991301"/>
+      <w:bookmarkStart w:id="56" w:name="__RefHeading___Toc2479_1971269794"/>
       <w:bookmarkStart w:id="57" w:name="تبدأ-اللوحة-من-اليوم-56"/>
       <w:bookmarkEnd w:id="56"/>
       <w:r>
@@ -15149,7 +15189,7 @@
         <w:bidi w:val="1"/>
         <w:rPr/>
       </w:pPr>
-      <w:bookmarkStart w:id="58" w:name="__RefHeading___Toc2481_2819991301"/>
+      <w:bookmarkStart w:id="58" w:name="__RefHeading___Toc2481_1971269794"/>
       <w:bookmarkStart w:id="59" w:name="لوحة-المؤشرات"/>
       <w:bookmarkEnd w:id="58"/>
       <w:r>
@@ -16430,7 +16470,7 @@
         <w:bidi w:val="1"/>
         <w:rPr/>
       </w:pPr>
-      <w:bookmarkStart w:id="60" w:name="__RefHeading___Toc2483_2819991301"/>
+      <w:bookmarkStart w:id="60" w:name="__RefHeading___Toc2483_1971269794"/>
       <w:bookmarkStart w:id="61" w:name="العناقيد-السلوكية"/>
       <w:bookmarkEnd w:id="60"/>
       <w:r>
@@ -17576,7 +17616,7 @@
         <w:bidi w:val="1"/>
         <w:rPr/>
       </w:pPr>
-      <w:bookmarkStart w:id="62" w:name="__RefHeading___Toc2485_2819991301"/>
+      <w:bookmarkStart w:id="62" w:name="__RefHeading___Toc2485_1971269794"/>
       <w:bookmarkStart w:id="63" w:name="توزيع-درجة-الخطر-النسبية"/>
       <w:bookmarkEnd w:id="62"/>
       <w:r>
@@ -18458,7 +18498,7 @@
         <w:bidi w:val="1"/>
         <w:rPr/>
       </w:pPr>
-      <w:bookmarkStart w:id="64" w:name="__RefHeading___Toc2487_2819991301"/>
+      <w:bookmarkStart w:id="64" w:name="__RefHeading___Toc2487_1971269794"/>
       <w:bookmarkStart w:id="65" w:name="ملامح-السلوك"/>
       <w:bookmarkEnd w:id="64"/>
       <w:r>
@@ -18644,13 +18684,7 @@
         <w:rPr>
           <w:rtl w:val="true"/>
         </w:rPr>
-        <w:t xml:space="preserve">وسيط </w:t>
-      </w:r>
-      <w:r>
-        <w:rPr>
-          <w:rtl w:val="true"/>
-        </w:rPr>
-        <w:t>-</w:t>
+        <w:t>وسيط −</w:t>
       </w:r>
       <w:r>
         <w:rPr/>
@@ -18991,7 +19025,7 @@
         <w:bidi w:val="1"/>
         <w:rPr/>
       </w:pPr>
-      <w:bookmarkStart w:id="66" w:name="__RefHeading___Toc2489_2819991301"/>
+      <w:bookmarkStart w:id="66" w:name="__RefHeading___Toc2489_1971269794"/>
       <w:bookmarkStart w:id="67" w:name="تغطية-التوصيات"/>
       <w:bookmarkEnd w:id="66"/>
       <w:r>
@@ -19197,7 +19231,7 @@
         <w:bidi w:val="1"/>
         <w:rPr/>
       </w:pPr>
-      <w:bookmarkStart w:id="68" w:name="__RefHeading___Toc2491_2819991301"/>
+      <w:bookmarkStart w:id="68" w:name="__RefHeading___Toc2491_1971269794"/>
       <w:bookmarkStart w:id="69" w:name="جدول-المتعلمين"/>
       <w:bookmarkEnd w:id="68"/>
       <w:r>
@@ -20728,7 +20762,7 @@
         <w:bidi w:val="1"/>
         <w:rPr/>
       </w:pPr>
-      <w:bookmarkStart w:id="70" w:name="__RefHeading___Toc2493_2819991301"/>
+      <w:bookmarkStart w:id="70" w:name="__RefHeading___Toc2493_1971269794"/>
       <w:bookmarkStart w:id="71" w:name="ملف-المتعلم"/>
       <w:bookmarkEnd w:id="70"/>
       <w:r>
@@ -21393,7 +21427,7 @@
         <w:bidi w:val="1"/>
         <w:rPr/>
       </w:pPr>
-      <w:bookmarkStart w:id="72" w:name="__RefHeading___Toc2495_2819991301"/>
+      <w:bookmarkStart w:id="72" w:name="__RefHeading___Toc2495_1971269794"/>
       <w:bookmarkStart w:id="73" w:name="القيود-الأخلاقية-والمنهجية"/>
       <w:bookmarkEnd w:id="72"/>
       <w:r>
@@ -21844,7 +21878,7 @@
         <w:bidi w:val="1"/>
         <w:rPr/>
       </w:pPr>
-      <w:bookmarkStart w:id="74" w:name="__RefHeading___Toc2497_2819991301"/>
+      <w:bookmarkStart w:id="74" w:name="__RefHeading___Toc2497_1971269794"/>
       <w:bookmarkStart w:id="75" w:name="ماذا-أفعل-كمدرس"/>
       <w:bookmarkEnd w:id="74"/>
       <w:r>
@@ -21963,7 +21997,7 @@
         <w:bidi w:val="1"/>
         <w:rPr/>
       </w:pPr>
-      <w:bookmarkStart w:id="76" w:name="__RefHeading___Toc2499_2819991301"/>
+      <w:bookmarkStart w:id="76" w:name="__RefHeading___Toc2499_1971269794"/>
       <w:bookmarkStart w:id="77" w:name="X745443570c429d909b26e3257e881b7ff04140e"/>
       <w:bookmarkEnd w:id="76"/>
       <w:r>
@@ -22437,7 +22471,7 @@
         <w:bidi w:val="1"/>
         <w:rPr/>
       </w:pPr>
-      <w:bookmarkStart w:id="80" w:name="__RefHeading___Toc2501_2819991301"/>
+      <w:bookmarkStart w:id="80" w:name="__RefHeading___Toc2501_1971269794"/>
       <w:bookmarkStart w:id="81" w:name="الأسئلة-الشائعة"/>
       <w:bookmarkEnd w:id="80"/>
       <w:r>
@@ -24075,7 +24109,7 @@
         <w:bidi w:val="1"/>
         <w:rPr/>
       </w:pPr>
-      <w:bookmarkStart w:id="83" w:name="__RefHeading___Toc2503_2819991301"/>
+      <w:bookmarkStart w:id="83" w:name="__RefHeading___Toc2503_1971269794"/>
       <w:bookmarkStart w:id="84" w:name="الملاحق"/>
       <w:bookmarkEnd w:id="83"/>
       <w:r>
@@ -24101,7 +24135,7 @@
         <w:bidi w:val="1"/>
         <w:rPr/>
       </w:pPr>
-      <w:bookmarkStart w:id="85" w:name="__RefHeading___Toc2505_2819991301"/>
+      <w:bookmarkStart w:id="85" w:name="__RefHeading___Toc2505_1971269794"/>
       <w:bookmarkEnd w:id="85"/>
       <w:r>
         <w:rPr/>
@@ -25270,7 +25304,7 @@
         <w:bidi w:val="1"/>
         <w:rPr/>
       </w:pPr>
-      <w:bookmarkStart w:id="87" w:name="__RefHeading___Toc2507_2819991301"/>
+      <w:bookmarkStart w:id="87" w:name="__RefHeading___Toc2507_1971269794"/>
       <w:bookmarkEnd w:id="87"/>
       <w:r>
         <w:rPr/>
@@ -26388,7 +26422,7 @@
         <w:bidi w:val="1"/>
         <w:rPr/>
       </w:pPr>
-      <w:bookmarkStart w:id="88" w:name="__RefHeading___Toc2509_2819991301"/>
+      <w:bookmarkStart w:id="88" w:name="__RefHeading___Toc2509_1971269794"/>
       <w:bookmarkEnd w:id="88"/>
       <w:r>
         <w:rPr/>
@@ -29129,7 +29163,7 @@
         <w:bidi w:val="1"/>
         <w:rPr/>
       </w:pPr>
-      <w:bookmarkStart w:id="90" w:name="__RefHeading___Toc2511_2819991301"/>
+      <w:bookmarkStart w:id="90" w:name="__RefHeading___Toc2511_1971269794"/>
       <w:bookmarkEnd w:id="90"/>
       <w:r>
         <w:rPr/>

</xml_diff>

<commit_message>
UI/e2e: D-73 screenshot-learner rule enforced in live script, offset param, Arabic hundreds in countAr, unified warm-up timings in README (52 tests)
Co-Authored-By: Claude Fable 5.1 <noreply@anthropic.com>
Claude-Session: https://claude.ai/code/session_01Y5Ccgz17Pq2brpK5TTSYa7
</commit_message>
<xml_diff>
--- a/deliverables/05-user-guide/دليل-المستخدم-والواجهات.docx
+++ b/deliverables/05-user-guide/دليل-المستخدم-والواجهات.docx
@@ -378,7 +378,7 @@
             </w:rPr>
             <w:fldChar w:fldCharType="separate"/>
           </w:r>
-          <w:hyperlink w:anchor="__RefHeading___Toc2429_1971269794">
+          <w:hyperlink w:anchor="__RefHeading___Toc2429_4114594835">
             <w:r>
               <w:rPr>
                 <w:webHidden/>
@@ -424,7 +424,7 @@
             </w:tabs>
             <w:rPr/>
           </w:pPr>
-          <w:hyperlink w:anchor="__RefHeading___Toc2431_1971269794">
+          <w:hyperlink w:anchor="__RefHeading___Toc2431_4114594835">
             <w:r>
               <w:rPr>
                 <w:webHidden/>
@@ -470,7 +470,7 @@
             </w:tabs>
             <w:rPr/>
           </w:pPr>
-          <w:hyperlink w:anchor="__RefHeading___Toc2433_1971269794">
+          <w:hyperlink w:anchor="__RefHeading___Toc2433_4114594835">
             <w:r>
               <w:rPr>
                 <w:webHidden/>
@@ -516,7 +516,7 @@
             </w:tabs>
             <w:rPr/>
           </w:pPr>
-          <w:hyperlink w:anchor="__RefHeading___Toc2435_1971269794">
+          <w:hyperlink w:anchor="__RefHeading___Toc2435_4114594835">
             <w:r>
               <w:rPr>
                 <w:webHidden/>
@@ -562,7 +562,7 @@
             </w:tabs>
             <w:rPr/>
           </w:pPr>
-          <w:hyperlink w:anchor="__RefHeading___Toc2437_1971269794">
+          <w:hyperlink w:anchor="__RefHeading___Toc2437_4114594835">
             <w:r>
               <w:rPr>
                 <w:webHidden/>
@@ -623,7 +623,7 @@
             </w:tabs>
             <w:rPr/>
           </w:pPr>
-          <w:hyperlink w:anchor="__RefHeading___Toc2439_1971269794">
+          <w:hyperlink w:anchor="__RefHeading___Toc2439_4114594835">
             <w:r>
               <w:rPr>
                 <w:webHidden/>
@@ -669,7 +669,7 @@
             </w:tabs>
             <w:rPr/>
           </w:pPr>
-          <w:hyperlink w:anchor="__RefHeading___Toc2441_1971269794">
+          <w:hyperlink w:anchor="__RefHeading___Toc2441_4114594835">
             <w:r>
               <w:rPr>
                 <w:webHidden/>
@@ -715,7 +715,7 @@
             </w:tabs>
             <w:rPr/>
           </w:pPr>
-          <w:hyperlink w:anchor="__RefHeading___Toc2443_1971269794">
+          <w:hyperlink w:anchor="__RefHeading___Toc2443_4114594835">
             <w:r>
               <w:rPr>
                 <w:webHidden/>
@@ -761,7 +761,7 @@
             </w:tabs>
             <w:rPr/>
           </w:pPr>
-          <w:hyperlink w:anchor="__RefHeading___Toc2445_1971269794">
+          <w:hyperlink w:anchor="__RefHeading___Toc2445_4114594835">
             <w:r>
               <w:rPr>
                 <w:webHidden/>
@@ -822,7 +822,7 @@
             </w:tabs>
             <w:rPr/>
           </w:pPr>
-          <w:hyperlink w:anchor="__RefHeading___Toc2447_1971269794">
+          <w:hyperlink w:anchor="__RefHeading___Toc2447_4114594835">
             <w:r>
               <w:rPr>
                 <w:webHidden/>
@@ -868,7 +868,7 @@
             </w:tabs>
             <w:rPr/>
           </w:pPr>
-          <w:hyperlink w:anchor="__RefHeading___Toc2449_1971269794">
+          <w:hyperlink w:anchor="__RefHeading___Toc2449_4114594835">
             <w:r>
               <w:rPr>
                 <w:webHidden/>
@@ -914,7 +914,7 @@
             </w:tabs>
             <w:rPr/>
           </w:pPr>
-          <w:hyperlink w:anchor="__RefHeading___Toc2451_1971269794">
+          <w:hyperlink w:anchor="__RefHeading___Toc2451_4114594835">
             <w:r>
               <w:rPr>
                 <w:webHidden/>
@@ -960,7 +960,7 @@
             </w:tabs>
             <w:rPr/>
           </w:pPr>
-          <w:hyperlink w:anchor="__RefHeading___Toc2453_1971269794">
+          <w:hyperlink w:anchor="__RefHeading___Toc2453_4114594835">
             <w:r>
               <w:rPr>
                 <w:webHidden/>
@@ -1006,7 +1006,7 @@
             </w:tabs>
             <w:rPr/>
           </w:pPr>
-          <w:hyperlink w:anchor="__RefHeading___Toc2455_1971269794">
+          <w:hyperlink w:anchor="__RefHeading___Toc2455_4114594835">
             <w:r>
               <w:rPr>
                 <w:webHidden/>
@@ -1052,7 +1052,7 @@
             </w:tabs>
             <w:rPr/>
           </w:pPr>
-          <w:hyperlink w:anchor="__RefHeading___Toc2457_1971269794">
+          <w:hyperlink w:anchor="__RefHeading___Toc2457_4114594835">
             <w:r>
               <w:rPr>
                 <w:webHidden/>
@@ -1098,7 +1098,7 @@
             </w:tabs>
             <w:rPr/>
           </w:pPr>
-          <w:hyperlink w:anchor="__RefHeading___Toc2459_1971269794">
+          <w:hyperlink w:anchor="__RefHeading___Toc2459_4114594835">
             <w:r>
               <w:rPr>
                 <w:webHidden/>
@@ -1144,7 +1144,7 @@
             </w:tabs>
             <w:rPr/>
           </w:pPr>
-          <w:hyperlink w:anchor="__RefHeading___Toc2461_1971269794">
+          <w:hyperlink w:anchor="__RefHeading___Toc2461_4114594835">
             <w:r>
               <w:rPr>
                 <w:webHidden/>
@@ -1205,7 +1205,7 @@
             </w:tabs>
             <w:rPr/>
           </w:pPr>
-          <w:hyperlink w:anchor="__RefHeading___Toc2463_1971269794">
+          <w:hyperlink w:anchor="__RefHeading___Toc2463_4114594835">
             <w:r>
               <w:rPr>
                 <w:webHidden/>
@@ -1266,7 +1266,7 @@
             </w:tabs>
             <w:rPr/>
           </w:pPr>
-          <w:hyperlink w:anchor="__RefHeading___Toc2465_1971269794">
+          <w:hyperlink w:anchor="__RefHeading___Toc2465_4114594835">
             <w:r>
               <w:rPr>
                 <w:webHidden/>
@@ -1327,7 +1327,7 @@
             </w:tabs>
             <w:rPr/>
           </w:pPr>
-          <w:hyperlink w:anchor="__RefHeading___Toc2467_1971269794">
+          <w:hyperlink w:anchor="__RefHeading___Toc2467_4114594835">
             <w:r>
               <w:rPr>
                 <w:webHidden/>
@@ -1388,7 +1388,7 @@
             </w:tabs>
             <w:rPr/>
           </w:pPr>
-          <w:hyperlink w:anchor="__RefHeading___Toc2469_1971269794">
+          <w:hyperlink w:anchor="__RefHeading___Toc2469_4114594835">
             <w:r>
               <w:rPr>
                 <w:webHidden/>
@@ -1454,7 +1454,7 @@
             </w:tabs>
             <w:rPr/>
           </w:pPr>
-          <w:hyperlink w:anchor="__RefHeading___Toc2471_1971269794">
+          <w:hyperlink w:anchor="__RefHeading___Toc2471_4114594835">
             <w:r>
               <w:rPr>
                 <w:webHidden/>
@@ -1500,7 +1500,7 @@
             </w:tabs>
             <w:rPr/>
           </w:pPr>
-          <w:hyperlink w:anchor="__RefHeading___Toc2473_1971269794">
+          <w:hyperlink w:anchor="__RefHeading___Toc2473_4114594835">
             <w:r>
               <w:rPr>
                 <w:webHidden/>
@@ -1561,7 +1561,7 @@
             </w:tabs>
             <w:rPr/>
           </w:pPr>
-          <w:hyperlink w:anchor="__RefHeading___Toc2475_1971269794">
+          <w:hyperlink w:anchor="__RefHeading___Toc2475_4114594835">
             <w:r>
               <w:rPr>
                 <w:webHidden/>
@@ -1607,7 +1607,7 @@
             </w:tabs>
             <w:rPr/>
           </w:pPr>
-          <w:hyperlink w:anchor="__RefHeading___Toc2477_1971269794">
+          <w:hyperlink w:anchor="__RefHeading___Toc2477_4114594835">
             <w:r>
               <w:rPr>
                 <w:webHidden/>
@@ -1653,7 +1653,7 @@
             </w:tabs>
             <w:rPr/>
           </w:pPr>
-          <w:hyperlink w:anchor="__RefHeading___Toc2479_1971269794">
+          <w:hyperlink w:anchor="__RefHeading___Toc2479_4114594835">
             <w:r>
               <w:rPr>
                 <w:webHidden/>
@@ -1705,7 +1705,7 @@
             </w:tabs>
             <w:rPr/>
           </w:pPr>
-          <w:hyperlink w:anchor="__RefHeading___Toc2481_1971269794">
+          <w:hyperlink w:anchor="__RefHeading___Toc2481_4114594835">
             <w:r>
               <w:rPr>
                 <w:webHidden/>
@@ -1751,7 +1751,7 @@
             </w:tabs>
             <w:rPr/>
           </w:pPr>
-          <w:hyperlink w:anchor="__RefHeading___Toc2483_1971269794">
+          <w:hyperlink w:anchor="__RefHeading___Toc2483_4114594835">
             <w:r>
               <w:rPr>
                 <w:webHidden/>
@@ -1797,7 +1797,7 @@
             </w:tabs>
             <w:rPr/>
           </w:pPr>
-          <w:hyperlink w:anchor="__RefHeading___Toc2485_1971269794">
+          <w:hyperlink w:anchor="__RefHeading___Toc2485_4114594835">
             <w:r>
               <w:rPr>
                 <w:webHidden/>
@@ -1843,7 +1843,7 @@
             </w:tabs>
             <w:rPr/>
           </w:pPr>
-          <w:hyperlink w:anchor="__RefHeading___Toc2487_1971269794">
+          <w:hyperlink w:anchor="__RefHeading___Toc2487_4114594835">
             <w:r>
               <w:rPr>
                 <w:webHidden/>
@@ -1889,7 +1889,7 @@
             </w:tabs>
             <w:rPr/>
           </w:pPr>
-          <w:hyperlink w:anchor="__RefHeading___Toc2489_1971269794">
+          <w:hyperlink w:anchor="__RefHeading___Toc2489_4114594835">
             <w:r>
               <w:rPr>
                 <w:webHidden/>
@@ -1935,7 +1935,7 @@
             </w:tabs>
             <w:rPr/>
           </w:pPr>
-          <w:hyperlink w:anchor="__RefHeading___Toc2491_1971269794">
+          <w:hyperlink w:anchor="__RefHeading___Toc2491_4114594835">
             <w:r>
               <w:rPr>
                 <w:webHidden/>
@@ -1981,7 +1981,7 @@
             </w:tabs>
             <w:rPr/>
           </w:pPr>
-          <w:hyperlink w:anchor="__RefHeading___Toc2493_1971269794">
+          <w:hyperlink w:anchor="__RefHeading___Toc2493_4114594835">
             <w:r>
               <w:rPr>
                 <w:webHidden/>
@@ -2027,7 +2027,7 @@
             </w:tabs>
             <w:rPr/>
           </w:pPr>
-          <w:hyperlink w:anchor="__RefHeading___Toc2495_1971269794">
+          <w:hyperlink w:anchor="__RefHeading___Toc2495_4114594835">
             <w:r>
               <w:rPr>
                 <w:webHidden/>
@@ -2073,7 +2073,7 @@
             </w:tabs>
             <w:rPr/>
           </w:pPr>
-          <w:hyperlink w:anchor="__RefHeading___Toc2497_1971269794">
+          <w:hyperlink w:anchor="__RefHeading___Toc2497_4114594835">
             <w:r>
               <w:rPr>
                 <w:webHidden/>
@@ -2119,7 +2119,7 @@
             </w:tabs>
             <w:rPr/>
           </w:pPr>
-          <w:hyperlink w:anchor="__RefHeading___Toc2499_1971269794">
+          <w:hyperlink w:anchor="__RefHeading___Toc2499_4114594835">
             <w:r>
               <w:rPr>
                 <w:webHidden/>
@@ -2179,7 +2179,7 @@
             </w:tabs>
             <w:rPr/>
           </w:pPr>
-          <w:hyperlink w:anchor="__RefHeading___Toc2501_1971269794">
+          <w:hyperlink w:anchor="__RefHeading___Toc2501_4114594835">
             <w:r>
               <w:rPr>
                 <w:webHidden/>
@@ -2225,7 +2225,7 @@
             </w:tabs>
             <w:rPr/>
           </w:pPr>
-          <w:hyperlink w:anchor="__RefHeading___Toc2503_1971269794">
+          <w:hyperlink w:anchor="__RefHeading___Toc2503_4114594835">
             <w:r>
               <w:rPr>
                 <w:webHidden/>
@@ -2271,7 +2271,7 @@
             </w:tabs>
             <w:rPr/>
           </w:pPr>
-          <w:hyperlink w:anchor="__RefHeading___Toc2505_1971269794">
+          <w:hyperlink w:anchor="__RefHeading___Toc2505_4114594835">
             <w:r>
               <w:rPr>
                 <w:webHidden/>
@@ -2317,7 +2317,7 @@
             </w:tabs>
             <w:rPr/>
           </w:pPr>
-          <w:hyperlink w:anchor="__RefHeading___Toc2507_1971269794">
+          <w:hyperlink w:anchor="__RefHeading___Toc2507_4114594835">
             <w:r>
               <w:rPr>
                 <w:webHidden/>
@@ -2365,7 +2365,7 @@
               <w:rPr>
                 <w:rStyle w:val="IndexLink"/>
               </w:rPr>
-              <w:t>33</w:t>
+              <w:t>34</w:t>
             </w:r>
           </w:hyperlink>
         </w:p>
@@ -2378,7 +2378,7 @@
             </w:tabs>
             <w:rPr/>
           </w:pPr>
-          <w:hyperlink w:anchor="__RefHeading___Toc2509_1971269794">
+          <w:hyperlink w:anchor="__RefHeading___Toc2509_4114594835">
             <w:r>
               <w:rPr>
                 <w:webHidden/>
@@ -2424,7 +2424,7 @@
             </w:tabs>
             <w:rPr/>
           </w:pPr>
-          <w:hyperlink w:anchor="__RefHeading___Toc2511_1971269794">
+          <w:hyperlink w:anchor="__RefHeading___Toc2511_4114594835">
             <w:r>
               <w:rPr>
                 <w:webHidden/>
@@ -2475,7 +2475,7 @@
         <w:bidi w:val="1"/>
         <w:rPr/>
       </w:pPr>
-      <w:bookmarkStart w:id="0" w:name="__RefHeading___Toc2429_1971269794"/>
+      <w:bookmarkStart w:id="0" w:name="__RefHeading___Toc2429_4114594835"/>
       <w:bookmarkStart w:id="1" w:name="مقدمة"/>
       <w:bookmarkEnd w:id="0"/>
       <w:r>
@@ -2501,7 +2501,7 @@
         <w:bidi w:val="1"/>
         <w:rPr/>
       </w:pPr>
-      <w:bookmarkStart w:id="2" w:name="__RefHeading___Toc2431_1971269794"/>
+      <w:bookmarkStart w:id="2" w:name="__RefHeading___Toc2431_4114594835"/>
       <w:bookmarkStart w:id="3" w:name="ما-هذا-النظام"/>
       <w:bookmarkEnd w:id="2"/>
       <w:r>
@@ -2760,7 +2760,7 @@
         <w:bidi w:val="1"/>
         <w:rPr/>
       </w:pPr>
-      <w:bookmarkStart w:id="4" w:name="__RefHeading___Toc2433_1971269794"/>
+      <w:bookmarkStart w:id="4" w:name="__RefHeading___Toc2433_4114594835"/>
       <w:bookmarkStart w:id="5" w:name="ما-الذي-يفعله-النظام-وما-الذي-لا-يفعله"/>
       <w:bookmarkEnd w:id="4"/>
       <w:r>
@@ -3482,7 +3482,7 @@
         <w:bidi w:val="1"/>
         <w:rPr/>
       </w:pPr>
-      <w:bookmarkStart w:id="6" w:name="__RefHeading___Toc2435_1971269794"/>
+      <w:bookmarkStart w:id="6" w:name="__RefHeading___Toc2435_4114594835"/>
       <w:bookmarkStart w:id="7" w:name="لمن-هذا-الدليل"/>
       <w:bookmarkEnd w:id="6"/>
       <w:r>
@@ -3747,7 +3747,7 @@
         <w:bidi w:val="1"/>
         <w:rPr/>
       </w:pPr>
-      <w:bookmarkStart w:id="8" w:name="__RefHeading___Toc2437_1971269794"/>
+      <w:bookmarkStart w:id="8" w:name="__RefHeading___Toc2437_4114594835"/>
       <w:bookmarkStart w:id="9" w:name="شريط-عرض-توضيحي-بلا-أمان-وصول"/>
       <w:bookmarkEnd w:id="8"/>
       <w:r>
@@ -3966,7 +3966,7 @@
         <w:bidi w:val="1"/>
         <w:rPr/>
       </w:pPr>
-      <w:bookmarkStart w:id="10" w:name="__RefHeading___Toc2439_1971269794"/>
+      <w:bookmarkStart w:id="10" w:name="__RefHeading___Toc2439_4114594835"/>
       <w:bookmarkStart w:id="11" w:name="المتطلبات"/>
       <w:bookmarkEnd w:id="10"/>
       <w:r>
@@ -4481,7 +4481,7 @@
         <w:bidi w:val="1"/>
         <w:rPr/>
       </w:pPr>
-      <w:bookmarkStart w:id="14" w:name="__RefHeading___Toc2441_1971269794"/>
+      <w:bookmarkStart w:id="14" w:name="__RefHeading___Toc2441_4114594835"/>
       <w:bookmarkStart w:id="15" w:name="البدء-السريع-لمشغل-النظام"/>
       <w:bookmarkEnd w:id="14"/>
       <w:r>
@@ -4550,7 +4550,7 @@
         <w:bidi w:val="1"/>
         <w:rPr/>
       </w:pPr>
-      <w:bookmarkStart w:id="16" w:name="__RefHeading___Toc2443_1971269794"/>
+      <w:bookmarkStart w:id="16" w:name="__RefHeading___Toc2443_4114594835"/>
       <w:bookmarkStart w:id="17" w:name="الخطوات-الأساسية"/>
       <w:bookmarkEnd w:id="16"/>
       <w:r>
@@ -6687,7 +6687,7 @@
         <w:bidi w:val="1"/>
         <w:rPr/>
       </w:pPr>
-      <w:bookmarkStart w:id="18" w:name="__RefHeading___Toc2445_1971269794"/>
+      <w:bookmarkStart w:id="18" w:name="__RefHeading___Toc2445_4114594835"/>
       <w:bookmarkStart w:id="19" w:name="وضع-المحاكاة-بلا-خادم"/>
       <w:bookmarkEnd w:id="18"/>
       <w:r>
@@ -7220,7 +7220,7 @@
         <w:bidi w:val="1"/>
         <w:rPr/>
       </w:pPr>
-      <w:bookmarkStart w:id="20" w:name="__RefHeading___Toc2447_1971269794"/>
+      <w:bookmarkStart w:id="20" w:name="__RefHeading___Toc2447_4114594835"/>
       <w:bookmarkStart w:id="21" w:name="صور-الشاشة"/>
       <w:bookmarkEnd w:id="20"/>
       <w:r>
@@ -7401,7 +7401,7 @@
         <w:bidi w:val="1"/>
         <w:rPr/>
       </w:pPr>
-      <w:bookmarkStart w:id="22" w:name="__RefHeading___Toc2449_1971269794"/>
+      <w:bookmarkStart w:id="22" w:name="__RefHeading___Toc2449_4114594835"/>
       <w:bookmarkStart w:id="23" w:name="استكشاف-الأخطاء-الشائعة"/>
       <w:bookmarkEnd w:id="22"/>
       <w:r>
@@ -8935,7 +8935,7 @@
         <w:bidi w:val="1"/>
         <w:rPr/>
       </w:pPr>
-      <w:bookmarkStart w:id="26" w:name="__RefHeading___Toc2451_1971269794"/>
+      <w:bookmarkStart w:id="26" w:name="__RefHeading___Toc2451_4114594835"/>
       <w:bookmarkStart w:id="27" w:name="دليل-المتعلم"/>
       <w:bookmarkEnd w:id="26"/>
       <w:r>
@@ -9013,7 +9013,7 @@
         <w:bidi w:val="1"/>
         <w:rPr/>
       </w:pPr>
-      <w:bookmarkStart w:id="28" w:name="__RefHeading___Toc2453_1971269794"/>
+      <w:bookmarkStart w:id="28" w:name="__RefHeading___Toc2453_4114594835"/>
       <w:bookmarkStart w:id="29" w:name="الصفحة-الرئيسية"/>
       <w:bookmarkEnd w:id="28"/>
       <w:r>
@@ -9792,7 +9792,7 @@
         <w:bidi w:val="1"/>
         <w:rPr/>
       </w:pPr>
-      <w:bookmarkStart w:id="30" w:name="__RefHeading___Toc2455_1971269794"/>
+      <w:bookmarkStart w:id="30" w:name="__RefHeading___Toc2455_4114594835"/>
       <w:bookmarkStart w:id="31" w:name="شريط-الأيام-ومعنى-العلامات"/>
       <w:bookmarkEnd w:id="30"/>
       <w:r>
@@ -10825,6 +10825,53 @@
               </w:rPr>
               <w:t>56</w:t>
             </w:r>
+            <w:r>
+              <w:rPr>
+                <w:kern w:val="0"/>
+                <w:rtl w:val="true"/>
+                <w:lang w:val="en-US" w:eastAsia="en-US" w:bidi="ar-SA"/>
+              </w:rPr>
+              <w:t xml:space="preserve"> </w:t>
+            </w:r>
+            <w:r>
+              <w:rPr>
+                <w:kern w:val="0"/>
+                <w:rtl w:val="true"/>
+                <w:lang w:val="en-US" w:eastAsia="en-US" w:bidi="ar-SA"/>
+              </w:rPr>
+              <w:t xml:space="preserve">في لوحة المدرّس </w:t>
+            </w:r>
+            <w:r>
+              <w:rPr>
+                <w:kern w:val="0"/>
+                <w:rtl w:val="true"/>
+                <w:lang w:val="en-US" w:eastAsia="en-US" w:bidi="ar-SA"/>
+              </w:rPr>
+              <w:t xml:space="preserve">· </w:t>
+            </w:r>
+            <w:r>
+              <w:rPr>
+                <w:kern w:val="0"/>
+                <w:lang w:val="en-US" w:eastAsia="en-US" w:bidi="ar-SA"/>
+              </w:rPr>
+              <w:t>t</w:t>
+            </w:r>
+            <w:r>
+              <w:rPr>
+                <w:kern w:val="0"/>
+                <w:rtl w:val="true"/>
+                <w:lang w:val="en-US" w:eastAsia="en-US" w:bidi="ar-SA"/>
+              </w:rPr>
+              <w:t xml:space="preserve"> </w:t>
+            </w:r>
+            <w:r>
+              <w:rPr>
+                <w:kern w:val="0"/>
+                <w:rtl w:val="true"/>
+                <w:lang w:val="en-US" w:eastAsia="en-US" w:bidi="ar-SA"/>
+              </w:rPr>
+              <w:t>داخل التوصية</w:t>
+            </w:r>
           </w:p>
         </w:tc>
         <w:tc>
@@ -10855,7 +10902,78 @@
                 <w:rtl w:val="true"/>
                 <w:lang w:val="en-US" w:eastAsia="en-US" w:bidi="ar-SA"/>
               </w:rPr>
-              <w:t>اليوم الذي تُحسب عنده العناقيد مرة واحدة، ويظهر في سطر العناقيد</w:t>
+              <w:t>في لوحة المدرّس</w:t>
+            </w:r>
+            <w:r>
+              <w:rPr>
+                <w:kern w:val="0"/>
+                <w:rtl w:val="true"/>
+                <w:lang w:val="en-US" w:eastAsia="en-US" w:bidi="ar-SA"/>
+              </w:rPr>
+              <w:t xml:space="preserve">: </w:t>
+            </w:r>
+            <w:r>
+              <w:rPr>
+                <w:kern w:val="0"/>
+                <w:rtl w:val="true"/>
+                <w:lang w:val="en-US" w:eastAsia="en-US" w:bidi="ar-SA"/>
+              </w:rPr>
+              <w:t>اليوم الذي تُحسب عنده العناقيد مرة واحدة ويُطبَّق على ما بعده</w:t>
+            </w:r>
+            <w:r>
+              <w:rPr>
+                <w:kern w:val="0"/>
+                <w:rtl w:val="true"/>
+                <w:lang w:val="en-US" w:eastAsia="en-US" w:bidi="ar-SA"/>
+              </w:rPr>
+              <w:t xml:space="preserve">. </w:t>
+            </w:r>
+            <w:r>
+              <w:rPr>
+                <w:kern w:val="0"/>
+                <w:rtl w:val="true"/>
+                <w:lang w:val="en-US" w:eastAsia="en-US" w:bidi="ar-SA"/>
+              </w:rPr>
+              <w:t>داخل التوصية</w:t>
+            </w:r>
+            <w:r>
+              <w:rPr>
+                <w:kern w:val="0"/>
+                <w:rtl w:val="true"/>
+                <w:lang w:val="en-US" w:eastAsia="en-US" w:bidi="ar-SA"/>
+              </w:rPr>
+              <w:t xml:space="preserve">: </w:t>
+            </w:r>
+            <w:r>
+              <w:rPr>
+                <w:kern w:val="0"/>
+                <w:rtl w:val="true"/>
+                <w:lang w:val="en-US" w:eastAsia="en-US" w:bidi="ar-SA"/>
+              </w:rPr>
+              <w:t xml:space="preserve">إعادة التقسيم عند اليوم </w:t>
+            </w:r>
+            <w:r>
+              <w:rPr>
+                <w:kern w:val="0"/>
+                <w:lang w:val="en-US" w:eastAsia="en-US" w:bidi="ar-SA"/>
+              </w:rPr>
+              <w:t>t</w:t>
+            </w:r>
+            <w:r>
+              <w:rPr>
+                <w:kern w:val="0"/>
+                <w:rtl w:val="true"/>
+                <w:lang w:val="en-US" w:eastAsia="en-US" w:bidi="ar-SA"/>
+              </w:rPr>
+              <w:t xml:space="preserve"> </w:t>
+            </w:r>
+            <w:r>
+              <w:rPr>
+                <w:kern w:val="0"/>
+                <w:rtl w:val="true"/>
+                <w:lang w:val="en-US" w:eastAsia="en-US" w:bidi="ar-SA"/>
+              </w:rPr>
+              <w:t>نفسه</w:t>
             </w:r>
           </w:p>
         </w:tc>
@@ -11196,7 +11314,7 @@
         <w:bidi w:val="1"/>
         <w:rPr/>
       </w:pPr>
-      <w:bookmarkStart w:id="32" w:name="__RefHeading___Toc2457_1971269794"/>
+      <w:bookmarkStart w:id="32" w:name="__RefHeading___Toc2457_4114594835"/>
       <w:bookmarkStart w:id="33" w:name="شريط-السياق"/>
       <w:bookmarkEnd w:id="32"/>
       <w:r>
@@ -11674,7 +11792,7 @@
         <w:bidi w:val="1"/>
         <w:rPr/>
       </w:pPr>
-      <w:bookmarkStart w:id="34" w:name="__RefHeading___Toc2459_1971269794"/>
+      <w:bookmarkStart w:id="34" w:name="__RefHeading___Toc2459_4114594835"/>
       <w:bookmarkStart w:id="35" w:name="قراءة-بطاقة-التوصية"/>
       <w:bookmarkEnd w:id="34"/>
       <w:r>
@@ -12544,7 +12662,7 @@
         <w:bidi w:val="1"/>
         <w:rPr/>
       </w:pPr>
-      <w:bookmarkStart w:id="36" w:name="__RefHeading___Toc2461_1971269794"/>
+      <w:bookmarkStart w:id="36" w:name="__RefHeading___Toc2461_4114594835"/>
       <w:bookmarkStart w:id="37" w:name="نافذة-لماذا"/>
       <w:bookmarkEnd w:id="36"/>
       <w:r>
@@ -13213,7 +13331,7 @@
         <w:bidi w:val="1"/>
         <w:rPr/>
       </w:pPr>
-      <w:bookmarkStart w:id="38" w:name="__RefHeading___Toc2463_1971269794"/>
+      <w:bookmarkStart w:id="38" w:name="__RefHeading___Toc2463_4114594835"/>
       <w:bookmarkStart w:id="39" w:name="شارة-تاريخ-النموذج"/>
       <w:bookmarkEnd w:id="38"/>
       <w:r>
@@ -13606,7 +13724,7 @@
         <w:bidi w:val="1"/>
         <w:rPr/>
       </w:pPr>
-      <w:bookmarkStart w:id="40" w:name="__RefHeading___Toc2465_1971269794"/>
+      <w:bookmarkStart w:id="40" w:name="__RefHeading___Toc2465_4114594835"/>
       <w:bookmarkStart w:id="41" w:name="حالة-قبل-أول-قطع"/>
       <w:bookmarkEnd w:id="40"/>
       <w:r>
@@ -13870,7 +13988,7 @@
         <w:bidi w:val="1"/>
         <w:rPr/>
       </w:pPr>
-      <w:bookmarkStart w:id="42" w:name="__RefHeading___Toc2467_1971269794"/>
+      <w:bookmarkStart w:id="42" w:name="__RefHeading___Toc2467_4114594835"/>
       <w:bookmarkStart w:id="43" w:name="حالة-بلا-نشاط-سابق"/>
       <w:bookmarkEnd w:id="42"/>
       <w:r>
@@ -13980,7 +14098,7 @@
         <w:bidi w:val="1"/>
         <w:rPr/>
       </w:pPr>
-      <w:bookmarkStart w:id="44" w:name="__RefHeading___Toc2469_1971269794"/>
+      <w:bookmarkStart w:id="44" w:name="__RefHeading___Toc2469_4114594835"/>
       <w:bookmarkStart w:id="45" w:name="نشاطي-في-آخر-28-يوما"/>
       <w:bookmarkEnd w:id="44"/>
       <w:r>
@@ -14321,7 +14439,7 @@
         <w:bidi w:val="1"/>
         <w:rPr/>
       </w:pPr>
-      <w:bookmarkStart w:id="46" w:name="__RefHeading___Toc2471_1971269794"/>
+      <w:bookmarkStart w:id="46" w:name="__RefHeading___Toc2471_4114594835"/>
       <w:bookmarkStart w:id="47" w:name="ما-لا-تعرضه-صفحة-المتعلم"/>
       <w:bookmarkEnd w:id="46"/>
       <w:r>
@@ -14529,7 +14647,7 @@
         <w:bidi w:val="1"/>
         <w:rPr/>
       </w:pPr>
-      <w:bookmarkStart w:id="48" w:name="__RefHeading___Toc2473_1971269794"/>
+      <w:bookmarkStart w:id="48" w:name="__RefHeading___Toc2473_4114594835"/>
       <w:bookmarkStart w:id="49" w:name="حالة-منسحب"/>
       <w:bookmarkEnd w:id="48"/>
       <w:r>
@@ -14760,7 +14878,7 @@
         <w:bidi w:val="1"/>
         <w:rPr/>
       </w:pPr>
-      <w:bookmarkStart w:id="52" w:name="__RefHeading___Toc2475_1971269794"/>
+      <w:bookmarkStart w:id="52" w:name="__RefHeading___Toc2475_4114594835"/>
       <w:bookmarkStart w:id="53" w:name="دليل-المدرس-أو-المشرف"/>
       <w:bookmarkEnd w:id="52"/>
       <w:r>
@@ -14821,7 +14939,7 @@
         <w:bidi w:val="1"/>
         <w:rPr/>
       </w:pPr>
-      <w:bookmarkStart w:id="54" w:name="__RefHeading___Toc2477_1971269794"/>
+      <w:bookmarkStart w:id="54" w:name="__RefHeading___Toc2477_4114594835"/>
       <w:bookmarkStart w:id="55" w:name="تنبيه-قبل-البدء"/>
       <w:bookmarkEnd w:id="54"/>
       <w:r>
@@ -15101,7 +15219,7 @@
         <w:bidi w:val="1"/>
         <w:rPr/>
       </w:pPr>
-      <w:bookmarkStart w:id="56" w:name="__RefHeading___Toc2479_1971269794"/>
+      <w:bookmarkStart w:id="56" w:name="__RefHeading___Toc2479_4114594835"/>
       <w:bookmarkStart w:id="57" w:name="تبدأ-اللوحة-من-اليوم-56"/>
       <w:bookmarkEnd w:id="56"/>
       <w:r>
@@ -15189,7 +15307,7 @@
         <w:bidi w:val="1"/>
         <w:rPr/>
       </w:pPr>
-      <w:bookmarkStart w:id="58" w:name="__RefHeading___Toc2481_1971269794"/>
+      <w:bookmarkStart w:id="58" w:name="__RefHeading___Toc2481_4114594835"/>
       <w:bookmarkStart w:id="59" w:name="لوحة-المؤشرات"/>
       <w:bookmarkEnd w:id="58"/>
       <w:r>
@@ -15576,7 +15694,7 @@
                 <w:rtl w:val="true"/>
                 <w:lang w:val="en-US" w:eastAsia="en-US" w:bidi="ar-SA"/>
               </w:rPr>
-              <w:t>مسجَّلاً لم ينسحب</w:t>
+              <w:t>مسجَّل لم ينسحب</w:t>
             </w:r>
             <w:r>
               <w:rPr>
@@ -15894,7 +16012,7 @@
                 <w:rtl w:val="true"/>
                 <w:lang w:val="en-US" w:eastAsia="en-US" w:bidi="ar-SA"/>
               </w:rPr>
-              <w:t>مورداً</w:t>
+              <w:t>مورد</w:t>
             </w:r>
           </w:p>
         </w:tc>
@@ -16061,7 +16179,7 @@
                 <w:rtl w:val="true"/>
                 <w:lang w:val="en-US" w:eastAsia="en-US" w:bidi="ar-SA"/>
               </w:rPr>
-              <w:t>مورداً</w:t>
+              <w:t>مورد</w:t>
             </w:r>
           </w:p>
         </w:tc>
@@ -16470,7 +16588,7 @@
         <w:bidi w:val="1"/>
         <w:rPr/>
       </w:pPr>
-      <w:bookmarkStart w:id="60" w:name="__RefHeading___Toc2483_1971269794"/>
+      <w:bookmarkStart w:id="60" w:name="__RefHeading___Toc2483_4114594835"/>
       <w:bookmarkStart w:id="61" w:name="العناقيد-السلوكية"/>
       <w:bookmarkEnd w:id="60"/>
       <w:r>
@@ -16547,15 +16665,71 @@
           <w:bCs/>
           <w:rtl w:val="true"/>
         </w:rPr>
+        <w:t>لقطة العناقيد في لوحة المدرّس</w:t>
+      </w:r>
+      <w:r>
+        <w:rPr>
+          <w:b/>
+          <w:bCs/>
+          <w:rtl w:val="true"/>
+        </w:rPr>
+        <w:t>:</w:t>
+      </w:r>
+      <w:r>
+        <w:rPr>
+          <w:rtl w:val="true"/>
+        </w:rPr>
+        <w:t xml:space="preserve"> </w:t>
+      </w:r>
+      <w:r>
+        <w:rPr>
+          <w:rtl w:val="true"/>
+        </w:rPr>
+        <w:t xml:space="preserve">السطر الأول يذكر </w:t>
+      </w:r>
+      <w:r>
+        <w:rPr>
+          <w:rtl w:val="true"/>
+        </w:rPr>
+        <w:t>«</w:t>
+      </w:r>
+      <w:r>
+        <w:rPr>
+          <w:rtl w:val="true"/>
+        </w:rPr>
         <w:t>لقطة العناقيد</w:t>
       </w:r>
       <w:r>
         <w:rPr>
-          <w:b/>
-          <w:bCs/>
-          <w:rtl w:val="true"/>
-        </w:rPr>
-        <w:t>:</w:t>
+          <w:rtl w:val="true"/>
+        </w:rPr>
+        <w:t xml:space="preserve">: </w:t>
+      </w:r>
+      <w:r>
+        <w:rPr>
+          <w:rtl w:val="true"/>
+        </w:rPr>
+        <w:t xml:space="preserve">اليوم </w:t>
+      </w:r>
+      <w:r>
+        <w:rPr/>
+        <w:t>56</w:t>
+      </w:r>
+      <w:r>
+        <w:rPr>
+          <w:rtl w:val="true"/>
+        </w:rPr>
+        <w:t>»</w:t>
+      </w:r>
+      <w:r>
+        <w:rPr>
+          <w:rtl w:val="true"/>
+        </w:rPr>
+        <w:t xml:space="preserve">، أي أن العناقيد تُحسب مرة عند اليوم </w:t>
+      </w:r>
+      <w:r>
+        <w:rPr/>
+        <w:t>56</w:t>
       </w:r>
       <w:r>
         <w:rPr>
@@ -16567,7 +16741,69 @@
         <w:rPr>
           <w:rtl w:val="true"/>
         </w:rPr>
-        <w:t xml:space="preserve">السطر الأول يذكر </w:t>
+        <w:t>وتُطبَّق على ما بعده</w:t>
+      </w:r>
+      <w:r>
+        <w:rPr>
+          <w:rtl w:val="true"/>
+        </w:rPr>
+        <w:t xml:space="preserve">. </w:t>
+      </w:r>
+      <w:r>
+        <w:rPr>
+          <w:rtl w:val="true"/>
+        </w:rPr>
+        <w:t>وهذا غير اليوم المختار</w:t>
+      </w:r>
+      <w:r>
+        <w:rPr>
+          <w:rtl w:val="true"/>
+        </w:rPr>
+        <w:t xml:space="preserve">. </w:t>
+      </w:r>
+      <w:r>
+        <w:rPr>
+          <w:rtl w:val="true"/>
+        </w:rPr>
+        <w:t xml:space="preserve">تبقى لقطة العناقيد ثابتة حين تغيّر اليوم </w:t>
+      </w:r>
+      <w:r>
+        <w:rPr/>
+        <w:t>t</w:t>
+      </w:r>
+      <w:r>
+        <w:rPr>
+          <w:rtl w:val="true"/>
+        </w:rPr>
+        <w:t xml:space="preserve">، لأن </w:t>
+      </w:r>
+      <w:r>
+        <w:rPr/>
+        <w:t>t</w:t>
+      </w:r>
+      <w:r>
+        <w:rPr>
+          <w:rtl w:val="true"/>
+        </w:rPr>
+        <w:t xml:space="preserve"> </w:t>
+      </w:r>
+      <w:r>
+        <w:rPr>
+          <w:rtl w:val="true"/>
+        </w:rPr>
+        <w:t>هو ما تُحسب عنده التوصيات والدرجات وحدها</w:t>
+      </w:r>
+      <w:r>
+        <w:rPr>
+          <w:rtl w:val="true"/>
+        </w:rPr>
+        <w:t xml:space="preserve">. </w:t>
+      </w:r>
+      <w:r>
+        <w:rPr>
+          <w:rtl w:val="true"/>
+        </w:rPr>
+        <w:t>أما داخل التوصية فـ</w:t>
       </w:r>
       <w:r>
         <w:rPr>
@@ -16585,33 +16821,17 @@
         <w:rPr>
           <w:rtl w:val="true"/>
         </w:rPr>
-        <w:t xml:space="preserve">: </w:t>
-      </w:r>
-      <w:r>
-        <w:rPr>
-          <w:rtl w:val="true"/>
-        </w:rPr>
-        <w:t xml:space="preserve">اليوم </w:t>
-      </w:r>
-      <w:r>
-        <w:rPr/>
-        <w:t>56</w:t>
-      </w:r>
-      <w:r>
-        <w:rPr>
-          <w:rtl w:val="true"/>
-        </w:rPr>
-        <w:t>»</w:t>
-      </w:r>
-      <w:r>
-        <w:rPr>
-          <w:rtl w:val="true"/>
-        </w:rPr>
-        <w:t xml:space="preserve">، أي أن العناقيد تُحسب مرة عند اليوم </w:t>
-      </w:r>
-      <w:r>
-        <w:rPr/>
-        <w:t>56</w:t>
+        <w:t xml:space="preserve">» </w:t>
+      </w:r>
+      <w:r>
+        <w:rPr>
+          <w:rtl w:val="true"/>
+        </w:rPr>
+        <w:t xml:space="preserve">تعني إعادة التقسيم عند اليوم </w:t>
+      </w:r>
+      <w:r>
+        <w:rPr/>
+        <w:t>t</w:t>
       </w:r>
       <w:r>
         <w:rPr>
@@ -16623,57 +16843,7 @@
         <w:rPr>
           <w:rtl w:val="true"/>
         </w:rPr>
-        <w:t>وتُطبَّق على ما بعده</w:t>
-      </w:r>
-      <w:r>
-        <w:rPr>
-          <w:rtl w:val="true"/>
-        </w:rPr>
-        <w:t xml:space="preserve">. </w:t>
-      </w:r>
-      <w:r>
-        <w:rPr>
-          <w:rtl w:val="true"/>
-        </w:rPr>
-        <w:t>وهذا غير اليوم المختار</w:t>
-      </w:r>
-      <w:r>
-        <w:rPr>
-          <w:rtl w:val="true"/>
-        </w:rPr>
-        <w:t xml:space="preserve">. </w:t>
-      </w:r>
-      <w:r>
-        <w:rPr>
-          <w:rtl w:val="true"/>
-        </w:rPr>
-        <w:t xml:space="preserve">تبقى لقطة العناقيد ثابتة حين تغيّر اليوم </w:t>
-      </w:r>
-      <w:r>
-        <w:rPr/>
-        <w:t>t</w:t>
-      </w:r>
-      <w:r>
-        <w:rPr>
-          <w:rtl w:val="true"/>
-        </w:rPr>
-        <w:t xml:space="preserve">، لأن </w:t>
-      </w:r>
-      <w:r>
-        <w:rPr/>
-        <w:t>t</w:t>
-      </w:r>
-      <w:r>
-        <w:rPr>
-          <w:rtl w:val="true"/>
-        </w:rPr>
-        <w:t xml:space="preserve"> </w:t>
-      </w:r>
-      <w:r>
-        <w:rPr>
-          <w:rtl w:val="true"/>
-        </w:rPr>
-        <w:t>هو ما تُحسب عنده التوصيات والدرجات وحدها</w:t>
+        <w:t>نفسه</w:t>
       </w:r>
       <w:r>
         <w:rPr>
@@ -17397,29 +17567,13 @@
         <w:rPr>
           <w:rtl w:val="true"/>
         </w:rPr>
-        <w:t xml:space="preserve">متعلماً عند لقطة العناقيد </w:t>
-      </w:r>
-      <w:r>
-        <w:rPr>
-          <w:rtl w:val="true"/>
-        </w:rPr>
-        <w:t>(</w:t>
-      </w:r>
-      <w:r>
-        <w:rPr>
-          <w:rtl w:val="true"/>
-        </w:rPr>
-        <w:t xml:space="preserve">اليوم </w:t>
-      </w:r>
-      <w:r>
-        <w:rPr/>
-        <w:t>56</w:t>
-      </w:r>
-      <w:r>
-        <w:rPr>
-          <w:rtl w:val="true"/>
-        </w:rPr>
-        <w:t xml:space="preserve">). </w:t>
+        <w:t>متعلم</w:t>
+      </w:r>
+      <w:r>
+        <w:rPr>
+          <w:rtl w:val="true"/>
+        </w:rPr>
+        <w:t xml:space="preserve">. </w:t>
       </w:r>
       <w:r>
         <w:rPr>
@@ -17518,7 +17672,119 @@
         <w:rPr>
           <w:rtl w:val="true"/>
         </w:rPr>
-        <w:t>متعلماً</w:t>
+        <w:t>متعلم</w:t>
+      </w:r>
+      <w:r>
+        <w:rPr>
+          <w:rtl w:val="true"/>
+        </w:rPr>
+        <w:t xml:space="preserve">. </w:t>
+      </w:r>
+      <w:r>
+        <w:rPr>
+          <w:rtl w:val="true"/>
+        </w:rPr>
+        <w:t xml:space="preserve">الرقمان </w:t>
+      </w:r>
+      <w:r>
+        <w:rPr/>
+        <w:t>661</w:t>
+      </w:r>
+      <w:r>
+        <w:rPr>
+          <w:rtl w:val="true"/>
+        </w:rPr>
+        <w:t xml:space="preserve"> </w:t>
+      </w:r>
+      <w:r>
+        <w:rPr>
+          <w:rtl w:val="true"/>
+        </w:rPr>
+        <w:t>و</w:t>
+      </w:r>
+      <w:r>
+        <w:rPr/>
+        <w:t>1,211</w:t>
+      </w:r>
+      <w:r>
+        <w:rPr>
+          <w:rtl w:val="true"/>
+        </w:rPr>
+        <w:t xml:space="preserve"> </w:t>
+      </w:r>
+      <w:r>
+        <w:rPr>
+          <w:rtl w:val="true"/>
+        </w:rPr>
+        <w:t xml:space="preserve">هما متعلمو فوج اليوم </w:t>
+      </w:r>
+      <w:r>
+        <w:rPr/>
+        <w:t>75</w:t>
+      </w:r>
+      <w:r>
+        <w:rPr>
+          <w:rtl w:val="true"/>
+        </w:rPr>
+        <w:t xml:space="preserve"> </w:t>
+      </w:r>
+      <w:r>
+        <w:rPr>
+          <w:rtl w:val="true"/>
+        </w:rPr>
+        <w:t xml:space="preserve">موزّعين على عنقودين، كما تُعرضهما لقطة العناقيد عند اليوم </w:t>
+      </w:r>
+      <w:r>
+        <w:rPr/>
+        <w:t>56</w:t>
+      </w:r>
+      <w:r>
+        <w:rPr>
+          <w:rtl w:val="true"/>
+        </w:rPr>
+        <w:t xml:space="preserve">. </w:t>
+      </w:r>
+      <w:r>
+        <w:rPr>
+          <w:rtl w:val="true"/>
+        </w:rPr>
+        <w:t xml:space="preserve">أما الحجمان عند اليوم </w:t>
+      </w:r>
+      <w:r>
+        <w:rPr/>
+        <w:t>56</w:t>
+      </w:r>
+      <w:r>
+        <w:rPr>
+          <w:rtl w:val="true"/>
+        </w:rPr>
+        <w:t xml:space="preserve"> </w:t>
+      </w:r>
+      <w:r>
+        <w:rPr>
+          <w:rtl w:val="true"/>
+        </w:rPr>
+        <w:t xml:space="preserve">نفسه فهما </w:t>
+      </w:r>
+      <w:r>
+        <w:rPr/>
+        <w:t>683</w:t>
+      </w:r>
+      <w:r>
+        <w:rPr>
+          <w:rtl w:val="true"/>
+        </w:rPr>
+        <w:t xml:space="preserve"> </w:t>
+      </w:r>
+      <w:r>
+        <w:rPr>
+          <w:rtl w:val="true"/>
+        </w:rPr>
+        <w:t>و</w:t>
+      </w:r>
+      <w:r>
+        <w:rPr/>
+        <w:t>1,232</w:t>
       </w:r>
       <w:r>
         <w:rPr>
@@ -17616,7 +17882,7 @@
         <w:bidi w:val="1"/>
         <w:rPr/>
       </w:pPr>
-      <w:bookmarkStart w:id="62" w:name="__RefHeading___Toc2485_1971269794"/>
+      <w:bookmarkStart w:id="62" w:name="__RefHeading___Toc2485_4114594835"/>
       <w:bookmarkStart w:id="63" w:name="توزيع-درجة-الخطر-النسبية"/>
       <w:bookmarkEnd w:id="62"/>
       <w:r>
@@ -17966,7 +18232,7 @@
           <wp:inline distT="0" distB="0" distL="0" distR="0">
             <wp:extent cx="5334000" cy="7223125"/>
             <wp:effectExtent l="0" t="0" r="0" b="0"/>
-            <wp:docPr id="13" name="Image7" descr="الشكل 6: لوحة المدرّس، الجزء الثاني: توزيع الدرجة النسبية وملامح السلوك وتغطية التوصيات. ملف المتعلم المعروض في الشكل 7 اختير على هذا الأساس نفسه، لا لأنه في حالة خطر."/>
+            <wp:docPr id="13" name="Image7" descr="الشكل 6: لوحة المدرّس، الجزء الثاني: توزيع الدرجة النسبية وملامح السلوك وتغطية التوصيات. ملف المتعلم المعروض في الشكل 7 اختير على الأساس المبيّن في تعليق الشكل 7، لا لأنه في حالة خطر. وأسفل الشكل بداية جدول المتعلمين بدرجات أعلى؛ والصفوف الكاملة في الشكل 7."/>
             <wp:cNvGraphicFramePr>
               <a:graphicFrameLocks xmlns:a="http://schemas.openxmlformats.org/drawingml/2006/main" noChangeAspect="1"/>
             </wp:cNvGraphicFramePr>
@@ -17974,7 +18240,7 @@
               <a:graphicData uri="http://schemas.openxmlformats.org/drawingml/2006/picture">
                 <pic:pic xmlns:pic="http://schemas.openxmlformats.org/drawingml/2006/picture">
                   <pic:nvPicPr>
-                    <pic:cNvPr id="13" name="Image7" descr="الشكل 6: لوحة المدرّس، الجزء الثاني: توزيع الدرجة النسبية وملامح السلوك وتغطية التوصيات. ملف المتعلم المعروض في الشكل 7 اختير على هذا الأساس نفسه، لا لأنه في حالة خطر."/>
+                    <pic:cNvPr id="13" name="Image7" descr="الشكل 6: لوحة المدرّس، الجزء الثاني: توزيع الدرجة النسبية وملامح السلوك وتغطية التوصيات. ملف المتعلم المعروض في الشكل 7 اختير على الأساس المبيّن في تعليق الشكل 7، لا لأنه في حالة خطر. وأسفل الشكل بداية جدول المتعلمين بدرجات أعلى؛ والصفوف الكاملة في الشكل 7."/>
                     <pic:cNvPicPr>
                       <a:picLocks noChangeAspect="1" noChangeArrowheads="1"/>
                     </pic:cNvPicPr>
@@ -18068,7 +18334,33 @@
         <w:rPr>
           <w:rtl w:val="true"/>
         </w:rPr>
-        <w:t>اختير على هذا الأساس نفسه، لا لأنه في حالة خطر</w:t>
+        <w:t xml:space="preserve">اختير على الأساس المبيّن في تعليق الشكل </w:t>
+      </w:r>
+      <w:r>
+        <w:rPr/>
+        <w:t>7</w:t>
+      </w:r>
+      <w:r>
+        <w:rPr>
+          <w:rtl w:val="true"/>
+        </w:rPr>
+        <w:t>، لا لأنه في حالة خطر</w:t>
+      </w:r>
+      <w:r>
+        <w:rPr>
+          <w:rtl w:val="true"/>
+        </w:rPr>
+        <w:t xml:space="preserve">. </w:t>
+      </w:r>
+      <w:r>
+        <w:rPr>
+          <w:rtl w:val="true"/>
+        </w:rPr>
+        <w:t xml:space="preserve">وأسفل الشكل بداية جدول المتعلمين بدرجات أعلى؛ والصفوف الكاملة في الشكل </w:t>
+      </w:r>
+      <w:r>
+        <w:rPr/>
+        <w:t>7</w:t>
       </w:r>
       <w:r>
         <w:rPr>
@@ -18498,7 +18790,7 @@
         <w:bidi w:val="1"/>
         <w:rPr/>
       </w:pPr>
-      <w:bookmarkStart w:id="64" w:name="__RefHeading___Toc2487_1971269794"/>
+      <w:bookmarkStart w:id="64" w:name="__RefHeading___Toc2487_4114594835"/>
       <w:bookmarkStart w:id="65" w:name="ملامح-السلوك"/>
       <w:bookmarkEnd w:id="64"/>
       <w:r>
@@ -19025,7 +19317,7 @@
         <w:bidi w:val="1"/>
         <w:rPr/>
       </w:pPr>
-      <w:bookmarkStart w:id="66" w:name="__RefHeading___Toc2489_1971269794"/>
+      <w:bookmarkStart w:id="66" w:name="__RefHeading___Toc2489_4114594835"/>
       <w:bookmarkStart w:id="67" w:name="تغطية-التوصيات"/>
       <w:bookmarkEnd w:id="66"/>
       <w:r>
@@ -19160,7 +19452,7 @@
         <w:rPr>
           <w:rtl w:val="true"/>
         </w:rPr>
-        <w:t xml:space="preserve">مورداً </w:t>
+        <w:t xml:space="preserve">مورد </w:t>
       </w:r>
       <w:r>
         <w:rPr>
@@ -19231,7 +19523,7 @@
         <w:bidi w:val="1"/>
         <w:rPr/>
       </w:pPr>
-      <w:bookmarkStart w:id="68" w:name="__RefHeading___Toc2491_1971269794"/>
+      <w:bookmarkStart w:id="68" w:name="__RefHeading___Toc2491_4114594835"/>
       <w:bookmarkStart w:id="69" w:name="جدول-المتعلمين"/>
       <w:bookmarkEnd w:id="68"/>
       <w:r>
@@ -19307,7 +19599,7 @@
         <w:rPr>
           <w:rtl w:val="true"/>
         </w:rPr>
-        <w:t xml:space="preserve">متعلماً </w:t>
+        <w:t xml:space="preserve">متعلم </w:t>
       </w:r>
       <w:r>
         <w:rPr>
@@ -20600,7 +20892,7 @@
           <wp:inline distT="0" distB="0" distL="0" distR="0">
             <wp:extent cx="5334000" cy="3333750"/>
             <wp:effectExtent l="0" t="0" r="0" b="0"/>
-            <wp:docPr id="14" name="Image8" descr="الشكل 7: ملف المتعلم والدرج الجانبي بجانب جدول المتعلمين. المتعلم FFF_2013J-29769 اختير على هذا الأساس: درجته 0.36 (العتبة 0.46) وهو الأقرب إلى وسيط الفوج وفق الواجهة البرمجية، لا لأنه في حالة خطر. والجدول مفروز بالتسجيل بلا مرشّح، وعمود الدرجة معروض كاملاً."/>
+            <wp:docPr id="14" name="Image8" descr="الشكل 7: ملف المتعلم والدرج الجانبي بجانب جدول المتعلمين. المتعلم FFF_2013J-29769 هو الأقرب إلى وسيط الفوج من بين صفوف الصفحة المعروضة (مفروزة بالتسجيل، بلا مرشّح، أول 100 صف) دون العتبة (درجته 0.36 والعتبة 0.46) وبخمسة أيام نشطة فأكثر، لا لأنه في حالة خطر. والجدول مفروز بالتسجيل بلا مرشّح، وعمود الدرجة معروض كاملاً."/>
             <wp:cNvGraphicFramePr>
               <a:graphicFrameLocks xmlns:a="http://schemas.openxmlformats.org/drawingml/2006/main" noChangeAspect="1"/>
             </wp:cNvGraphicFramePr>
@@ -20608,7 +20900,7 @@
               <a:graphicData uri="http://schemas.openxmlformats.org/drawingml/2006/picture">
                 <pic:pic xmlns:pic="http://schemas.openxmlformats.org/drawingml/2006/picture">
                   <pic:nvPicPr>
-                    <pic:cNvPr id="14" name="Image8" descr="الشكل 7: ملف المتعلم والدرج الجانبي بجانب جدول المتعلمين. المتعلم FFF_2013J-29769 اختير على هذا الأساس: درجته 0.36 (العتبة 0.46) وهو الأقرب إلى وسيط الفوج وفق الواجهة البرمجية، لا لأنه في حالة خطر. والجدول مفروز بالتسجيل بلا مرشّح، وعمود الدرجة معروض كاملاً."/>
+                    <pic:cNvPr id="14" name="Image8" descr="الشكل 7: ملف المتعلم والدرج الجانبي بجانب جدول المتعلمين. المتعلم FFF_2013J-29769 هو الأقرب إلى وسيط الفوج من بين صفوف الصفحة المعروضة (مفروزة بالتسجيل، بلا مرشّح، أول 100 صف) دون العتبة (درجته 0.36 والعتبة 0.46) وبخمسة أيام نشطة فأكثر، لا لأنه في حالة خطر. والجدول مفروز بالتسجيل بلا مرشّح، وعمود الدرجة معروض كاملاً."/>
                     <pic:cNvPicPr>
                       <a:picLocks noChangeAspect="1" noChangeArrowheads="1"/>
                     </pic:cNvPicPr>
@@ -20690,13 +20982,53 @@
         <w:rPr>
           <w:rtl w:val="true"/>
         </w:rPr>
-        <w:t>اختير على هذا الأساس</w:t>
-      </w:r>
-      <w:r>
-        <w:rPr>
-          <w:rtl w:val="true"/>
-        </w:rPr>
-        <w:t xml:space="preserve">: </w:t>
+        <w:t xml:space="preserve">هو الأقرب إلى وسيط الفوج من بين صفوف الصفحة المعروضة </w:t>
+      </w:r>
+      <w:r>
+        <w:rPr>
+          <w:rtl w:val="true"/>
+        </w:rPr>
+        <w:t>(</w:t>
+      </w:r>
+      <w:r>
+        <w:rPr>
+          <w:rtl w:val="true"/>
+        </w:rPr>
+        <w:t xml:space="preserve">مفروزة بالتسجيل، بلا مرشّح، أول </w:t>
+      </w:r>
+      <w:r>
+        <w:rPr/>
+        <w:t>100</w:t>
+      </w:r>
+      <w:r>
+        <w:rPr>
+          <w:rtl w:val="true"/>
+        </w:rPr>
+        <w:t xml:space="preserve"> </w:t>
+      </w:r>
+      <w:r>
+        <w:rPr>
+          <w:rtl w:val="true"/>
+        </w:rPr>
+        <w:t>صف</w:t>
+      </w:r>
+      <w:r>
+        <w:rPr>
+          <w:rtl w:val="true"/>
+        </w:rPr>
+        <w:t xml:space="preserve">) </w:t>
+      </w:r>
+      <w:r>
+        <w:rPr>
+          <w:rtl w:val="true"/>
+        </w:rPr>
+        <w:t xml:space="preserve">دون العتبة </w:t>
+      </w:r>
+      <w:r>
+        <w:rPr>
+          <w:rtl w:val="true"/>
+        </w:rPr>
+        <w:t>(</w:t>
       </w:r>
       <w:r>
         <w:rPr>
@@ -20712,13 +21044,13 @@
         <w:rPr>
           <w:rtl w:val="true"/>
         </w:rPr>
-        <w:t xml:space="preserve"> (</w:t>
-      </w:r>
-      <w:r>
-        <w:rPr>
-          <w:rtl w:val="true"/>
-        </w:rPr>
-        <w:t xml:space="preserve">العتبة </w:t>
+        <w:t xml:space="preserve"> </w:t>
+      </w:r>
+      <w:r>
+        <w:rPr>
+          <w:rtl w:val="true"/>
+        </w:rPr>
+        <w:t xml:space="preserve">والعتبة </w:t>
       </w:r>
       <w:r>
         <w:rPr/>
@@ -20734,7 +21066,7 @@
         <w:rPr>
           <w:rtl w:val="true"/>
         </w:rPr>
-        <w:t>وهو الأقرب إلى وسيط الفوج وفق الواجهة البرمجية، لا لأنه في حالة خطر</w:t>
+        <w:t>وبخمسة أيام نشطة فأكثر، لا لأنه في حالة خطر</w:t>
       </w:r>
       <w:r>
         <w:rPr>
@@ -20762,7 +21094,7 @@
         <w:bidi w:val="1"/>
         <w:rPr/>
       </w:pPr>
-      <w:bookmarkStart w:id="70" w:name="__RefHeading___Toc2493_1971269794"/>
+      <w:bookmarkStart w:id="70" w:name="__RefHeading___Toc2493_4114594835"/>
       <w:bookmarkStart w:id="71" w:name="ملف-المتعلم"/>
       <w:bookmarkEnd w:id="70"/>
       <w:r>
@@ -21427,7 +21759,7 @@
         <w:bidi w:val="1"/>
         <w:rPr/>
       </w:pPr>
-      <w:bookmarkStart w:id="72" w:name="__RefHeading___Toc2495_1971269794"/>
+      <w:bookmarkStart w:id="72" w:name="__RefHeading___Toc2495_4114594835"/>
       <w:bookmarkStart w:id="73" w:name="القيود-الأخلاقية-والمنهجية"/>
       <w:bookmarkEnd w:id="72"/>
       <w:r>
@@ -21878,7 +22210,7 @@
         <w:bidi w:val="1"/>
         <w:rPr/>
       </w:pPr>
-      <w:bookmarkStart w:id="74" w:name="__RefHeading___Toc2497_1971269794"/>
+      <w:bookmarkStart w:id="74" w:name="__RefHeading___Toc2497_4114594835"/>
       <w:bookmarkStart w:id="75" w:name="ماذا-أفعل-كمدرس"/>
       <w:bookmarkEnd w:id="74"/>
       <w:r>
@@ -21997,7 +22329,7 @@
         <w:bidi w:val="1"/>
         <w:rPr/>
       </w:pPr>
-      <w:bookmarkStart w:id="76" w:name="__RefHeading___Toc2499_1971269794"/>
+      <w:bookmarkStart w:id="76" w:name="__RefHeading___Toc2499_4114594835"/>
       <w:bookmarkStart w:id="77" w:name="X745443570c429d909b26e3257e881b7ff04140e"/>
       <w:bookmarkEnd w:id="76"/>
       <w:r>
@@ -22094,37 +22426,145 @@
         <w:rPr>
           <w:rtl w:val="true"/>
         </w:rPr>
-        <w:t>فقط، ولا ترى المستقبل</w:t>
-      </w:r>
-      <w:r>
-        <w:rPr>
-          <w:rtl w:val="true"/>
-        </w:rPr>
-        <w:t xml:space="preserve">. - </w:t>
-      </w:r>
-      <w:r>
-        <w:rPr>
-          <w:rtl w:val="true"/>
-        </w:rPr>
-        <w:t>أن كل توصية قابلة لإعادة الحساب من البيانات نفسها بالنموذج نفسه</w:t>
-      </w:r>
-      <w:r>
-        <w:rPr>
-          <w:rtl w:val="true"/>
-        </w:rPr>
-        <w:t xml:space="preserve">. - </w:t>
-      </w:r>
-      <w:r>
-        <w:rPr>
-          <w:rtl w:val="true"/>
-        </w:rPr>
-        <w:t>أن التفسير مطابق للحساب الذي أنتج الاقتراح</w:t>
-      </w:r>
-      <w:r>
-        <w:rPr>
-          <w:rtl w:val="true"/>
-        </w:rPr>
-        <w:t>.</w:t>
+        <w:t xml:space="preserve">فقط، ولا ترى المستقبل </w:t>
+      </w:r>
+      <w:r>
+        <w:rPr>
+          <w:rtl w:val="true"/>
+        </w:rPr>
+        <w:t>(</w:t>
+      </w:r>
+      <w:r>
+        <w:rPr>
+          <w:rtl w:val="true"/>
+        </w:rPr>
+        <w:t>الاختبار</w:t>
+      </w:r>
+      <w:r>
+        <w:rPr>
+          <w:rtl w:val="true"/>
+        </w:rPr>
+        <w:t xml:space="preserve">: </w:t>
+      </w:r>
+      <w:r>
+        <w:rPr>
+          <w:rStyle w:val="VerbatimChar"/>
+        </w:rPr>
+        <w:t>‎test_no_future_data_used‎</w:t>
+      </w:r>
+      <w:r>
+        <w:rPr>
+          <w:rtl w:val="true"/>
+        </w:rPr>
+        <w:t xml:space="preserve">). - </w:t>
+      </w:r>
+      <w:r>
+        <w:rPr>
+          <w:rtl w:val="true"/>
+        </w:rPr>
+        <w:t xml:space="preserve">أن الواجهة البرمجية تعيد ما يعيده محرك التوصية نفسه </w:t>
+      </w:r>
+      <w:r>
+        <w:rPr>
+          <w:rtl w:val="true"/>
+        </w:rPr>
+        <w:t>(</w:t>
+      </w:r>
+      <w:r>
+        <w:rPr>
+          <w:rtl w:val="true"/>
+        </w:rPr>
+        <w:t>الاختبار</w:t>
+      </w:r>
+      <w:r>
+        <w:rPr>
+          <w:rtl w:val="true"/>
+        </w:rPr>
+        <w:t xml:space="preserve">: </w:t>
+      </w:r>
+      <w:r>
+        <w:rPr>
+          <w:rStyle w:val="VerbatimChar"/>
+        </w:rPr>
+        <w:t>‎test_recommendation_matches_engine‎</w:t>
+      </w:r>
+      <w:r>
+        <w:rPr>
+          <w:rtl w:val="true"/>
+        </w:rPr>
+        <w:t xml:space="preserve">). - </w:t>
+      </w:r>
+      <w:r>
+        <w:rPr>
+          <w:rtl w:val="true"/>
+        </w:rPr>
+        <w:t xml:space="preserve">أن العناقيد المخزّنة مؤقتاً تطابق الحساب الحي </w:t>
+      </w:r>
+      <w:r>
+        <w:rPr>
+          <w:rtl w:val="true"/>
+        </w:rPr>
+        <w:t>(</w:t>
+      </w:r>
+      <w:r>
+        <w:rPr>
+          <w:rtl w:val="true"/>
+        </w:rPr>
+        <w:t>الاختبار</w:t>
+      </w:r>
+      <w:r>
+        <w:rPr>
+          <w:rtl w:val="true"/>
+        </w:rPr>
+        <w:t xml:space="preserve">: </w:t>
+      </w:r>
+      <w:r>
+        <w:rPr>
+          <w:rStyle w:val="VerbatimChar"/>
+        </w:rPr>
+        <w:t>‎test_cluster_cache_matches_live‎</w:t>
+      </w:r>
+      <w:r>
+        <w:rPr>
+          <w:rtl w:val="true"/>
+        </w:rPr>
+        <w:t xml:space="preserve">). - </w:t>
+      </w:r>
+      <w:r>
+        <w:rPr>
+          <w:rtl w:val="true"/>
+        </w:rPr>
+        <w:t xml:space="preserve">أن التفسير مطابق للحساب الذي أنتج الاقتراح، وأن عقده متسق </w:t>
+      </w:r>
+      <w:r>
+        <w:rPr>
+          <w:rtl w:val="true"/>
+        </w:rPr>
+        <w:t>(</w:t>
+      </w:r>
+      <w:r>
+        <w:rPr>
+          <w:rtl w:val="true"/>
+        </w:rPr>
+        <w:t>الاختبار</w:t>
+      </w:r>
+      <w:r>
+        <w:rPr>
+          <w:rtl w:val="true"/>
+        </w:rPr>
+        <w:t xml:space="preserve">: </w:t>
+      </w:r>
+      <w:r>
+        <w:rPr>
+          <w:rStyle w:val="VerbatimChar"/>
+        </w:rPr>
+        <w:t>‎test_explanation_contract_and_consistency‎</w:t>
+      </w:r>
+      <w:r>
+        <w:rPr>
+          <w:rtl w:val="true"/>
+        </w:rPr>
+        <w:t>).</w:t>
       </w:r>
     </w:p>
     <w:p>
@@ -22471,7 +22911,7 @@
         <w:bidi w:val="1"/>
         <w:rPr/>
       </w:pPr>
-      <w:bookmarkStart w:id="80" w:name="__RefHeading___Toc2501_1971269794"/>
+      <w:bookmarkStart w:id="80" w:name="__RefHeading___Toc2501_4114594835"/>
       <w:bookmarkStart w:id="81" w:name="الأسئلة-الشائعة"/>
       <w:bookmarkEnd w:id="80"/>
       <w:r>
@@ -22840,7 +23280,7 @@
         <w:rPr>
           <w:rtl w:val="true"/>
         </w:rPr>
-        <w:t xml:space="preserve">هي اليوم </w:t>
+        <w:t xml:space="preserve">في لوحة المدرّس هي اليوم </w:t>
       </w:r>
       <w:r>
         <w:rPr/>
@@ -22890,7 +23330,35 @@
         <w:rPr>
           <w:rtl w:val="true"/>
         </w:rPr>
-        <w:t>».</w:t>
+        <w:t xml:space="preserve">». </w:t>
+      </w:r>
+      <w:r>
+        <w:rPr>
+          <w:rtl w:val="true"/>
+        </w:rPr>
+        <w:t xml:space="preserve">وداخل التوصية تعني إعادة التقسيم عند اليوم </w:t>
+      </w:r>
+      <w:r>
+        <w:rPr/>
+        <w:t>t</w:t>
+      </w:r>
+      <w:r>
+        <w:rPr>
+          <w:rtl w:val="true"/>
+        </w:rPr>
+        <w:t xml:space="preserve"> </w:t>
+      </w:r>
+      <w:r>
+        <w:rPr>
+          <w:rtl w:val="true"/>
+        </w:rPr>
+        <w:t>نفسه</w:t>
+      </w:r>
+      <w:r>
+        <w:rPr>
+          <w:rtl w:val="true"/>
+        </w:rPr>
+        <w:t>.</w:t>
       </w:r>
     </w:p>
     <w:p>
@@ -24109,7 +24577,7 @@
         <w:bidi w:val="1"/>
         <w:rPr/>
       </w:pPr>
-      <w:bookmarkStart w:id="83" w:name="__RefHeading___Toc2503_1971269794"/>
+      <w:bookmarkStart w:id="83" w:name="__RefHeading___Toc2503_4114594835"/>
       <w:bookmarkStart w:id="84" w:name="الملاحق"/>
       <w:bookmarkEnd w:id="83"/>
       <w:r>
@@ -24135,7 +24603,7 @@
         <w:bidi w:val="1"/>
         <w:rPr/>
       </w:pPr>
-      <w:bookmarkStart w:id="85" w:name="__RefHeading___Toc2505_1971269794"/>
+      <w:bookmarkStart w:id="85" w:name="__RefHeading___Toc2505_4114594835"/>
       <w:bookmarkEnd w:id="85"/>
       <w:r>
         <w:rPr/>
@@ -25304,7 +25772,7 @@
         <w:bidi w:val="1"/>
         <w:rPr/>
       </w:pPr>
-      <w:bookmarkStart w:id="87" w:name="__RefHeading___Toc2507_1971269794"/>
+      <w:bookmarkStart w:id="87" w:name="__RefHeading___Toc2507_4114594835"/>
       <w:bookmarkEnd w:id="87"/>
       <w:r>
         <w:rPr/>
@@ -26422,7 +26890,7 @@
         <w:bidi w:val="1"/>
         <w:rPr/>
       </w:pPr>
-      <w:bookmarkStart w:id="88" w:name="__RefHeading___Toc2509_1971269794"/>
+      <w:bookmarkStart w:id="88" w:name="__RefHeading___Toc2509_4114594835"/>
       <w:bookmarkEnd w:id="88"/>
       <w:r>
         <w:rPr/>
@@ -26877,6 +27345,22 @@
                 <w:rtl w:val="true"/>
                 <w:lang w:val="en-US" w:eastAsia="en-US" w:bidi="ar-SA"/>
               </w:rPr>
+              <w:t>في لوحة المدرّس</w:t>
+            </w:r>
+            <w:r>
+              <w:rPr>
+                <w:kern w:val="0"/>
+                <w:rtl w:val="true"/>
+                <w:lang w:val="en-US" w:eastAsia="en-US" w:bidi="ar-SA"/>
+              </w:rPr>
+              <w:t xml:space="preserve">: </w:t>
+            </w:r>
+            <w:r>
+              <w:rPr>
+                <w:kern w:val="0"/>
+                <w:rtl w:val="true"/>
+                <w:lang w:val="en-US" w:eastAsia="en-US" w:bidi="ar-SA"/>
+              </w:rPr>
               <w:t xml:space="preserve">اليوم </w:t>
             </w:r>
             <w:r>
@@ -26901,6 +27385,45 @@
                 <w:lang w:val="en-US" w:eastAsia="en-US" w:bidi="ar-SA"/>
               </w:rPr>
               <w:t>الذي تُحسب عنده العناقيد مرة واحدة</w:t>
+            </w:r>
+            <w:r>
+              <w:rPr>
+                <w:kern w:val="0"/>
+                <w:rtl w:val="true"/>
+                <w:lang w:val="en-US" w:eastAsia="en-US" w:bidi="ar-SA"/>
+              </w:rPr>
+              <w:t xml:space="preserve">. </w:t>
+            </w:r>
+            <w:r>
+              <w:rPr>
+                <w:kern w:val="0"/>
+                <w:rtl w:val="true"/>
+                <w:lang w:val="en-US" w:eastAsia="en-US" w:bidi="ar-SA"/>
+              </w:rPr>
+              <w:t>داخل التوصية</w:t>
+            </w:r>
+            <w:r>
+              <w:rPr>
+                <w:kern w:val="0"/>
+                <w:rtl w:val="true"/>
+                <w:lang w:val="en-US" w:eastAsia="en-US" w:bidi="ar-SA"/>
+              </w:rPr>
+              <w:t xml:space="preserve">: </w:t>
+            </w:r>
+            <w:r>
+              <w:rPr>
+                <w:kern w:val="0"/>
+                <w:rtl w:val="true"/>
+                <w:lang w:val="en-US" w:eastAsia="en-US" w:bidi="ar-SA"/>
+              </w:rPr>
+              <w:t xml:space="preserve">إعادة التقسيم عند اليوم </w:t>
+            </w:r>
+            <w:r>
+              <w:rPr>
+                <w:kern w:val="0"/>
+                <w:lang w:val="en-US" w:eastAsia="en-US" w:bidi="ar-SA"/>
+              </w:rPr>
+              <w:t>t</w:t>
             </w:r>
           </w:p>
         </w:tc>
@@ -27740,15 +28263,7 @@
                 <w:rtl w:val="true"/>
                 <w:lang w:val="en-US" w:eastAsia="en-US" w:bidi="ar-SA"/>
               </w:rPr>
-              <w:t xml:space="preserve">مكوّن يرتّب الموارد حسب شيوعها بين المتعلمين ذوي النمط المشابه </w:t>
-            </w:r>
-            <w:r>
-              <w:rPr>
-                <w:kern w:val="0"/>
-                <w:rtl w:val="true"/>
-                <w:lang w:val="en-US" w:eastAsia="en-US" w:bidi="ar-SA"/>
-              </w:rPr>
-              <w:t>(</w:t>
+              <w:t xml:space="preserve">مكوّن يرتّب الموارد حسب شيوعها بين المتعلمين ذوي النمط المشابه؛ معرّفه الداخلي </w:t>
             </w:r>
             <w:r>
               <w:rPr>
@@ -27756,14 +28271,6 @@
                 <w:lang w:val="en-US" w:eastAsia="en-US" w:bidi="ar-SA"/>
               </w:rPr>
               <w:t>C7</w:t>
-            </w:r>
-            <w:r>
-              <w:rPr>
-                <w:kern w:val="0"/>
-                <w:rtl w:val="true"/>
-                <w:lang w:val="en-US" w:eastAsia="en-US" w:bidi="ar-SA"/>
-              </w:rPr>
-              <w:t>)</w:t>
             </w:r>
           </w:p>
         </w:tc>
@@ -28624,14 +29131,7 @@
                 <w:rtl w:val="true"/>
                 <w:lang w:val="en-US" w:eastAsia="en-US" w:bidi="ar-SA"/>
               </w:rPr>
-              <w:t xml:space="preserve">عتبة </w:t>
-            </w:r>
-            <w:r>
-              <w:rPr>
-                <w:kern w:val="0"/>
-                <w:lang w:val="en-US" w:eastAsia="en-US" w:bidi="ar-SA"/>
-              </w:rPr>
-              <w:t>Youden</w:t>
+              <w:t>العنقود</w:t>
             </w:r>
           </w:p>
         </w:tc>
@@ -28663,7 +29163,7 @@
                 <w:rtl w:val="true"/>
                 <w:lang w:val="en-US" w:eastAsia="en-US" w:bidi="ar-SA"/>
               </w:rPr>
-              <w:t>نقطة قطع من التطوير تعظّم مجموع الحساسية والنوعية</w:t>
+              <w:t>مجموعة متعلمين متشابهين في ملامح النشاط، ووصفها تصف النمط لا المتعلم</w:t>
             </w:r>
           </w:p>
         </w:tc>
@@ -28698,7 +29198,7 @@
                 <w:rtl w:val="true"/>
                 <w:lang w:val="en-US" w:eastAsia="en-US" w:bidi="ar-SA"/>
               </w:rPr>
-              <w:t>العنقود</w:t>
+              <w:t>اتساع التوصيات</w:t>
             </w:r>
           </w:p>
         </w:tc>
@@ -28730,7 +29230,54 @@
                 <w:rtl w:val="true"/>
                 <w:lang w:val="en-US" w:eastAsia="en-US" w:bidi="ar-SA"/>
               </w:rPr>
-              <w:t>مجموعة متعلمين متشابهين في ملامح النشاط، ووصفها تصف النمط لا المتعلم</w:t>
+              <w:t xml:space="preserve">عدد الموارد التي ظهرت في أفضل </w:t>
+            </w:r>
+            <w:r>
+              <w:rPr>
+                <w:kern w:val="0"/>
+                <w:lang w:val="en-US" w:eastAsia="en-US" w:bidi="ar-SA"/>
+              </w:rPr>
+              <w:t>10</w:t>
+            </w:r>
+            <w:r>
+              <w:rPr>
+                <w:kern w:val="0"/>
+                <w:rtl w:val="true"/>
+                <w:lang w:val="en-US" w:eastAsia="en-US" w:bidi="ar-SA"/>
+              </w:rPr>
+              <w:t xml:space="preserve"> </w:t>
+            </w:r>
+            <w:r>
+              <w:rPr>
+                <w:kern w:val="0"/>
+                <w:rtl w:val="true"/>
+                <w:lang w:val="en-US" w:eastAsia="en-US" w:bidi="ar-SA"/>
+              </w:rPr>
+              <w:t xml:space="preserve">لأي متعلم </w:t>
+            </w:r>
+            <w:r>
+              <w:rPr>
+                <w:kern w:val="0"/>
+                <w:rtl w:val="true"/>
+                <w:lang w:val="en-US" w:eastAsia="en-US" w:bidi="ar-SA"/>
+              </w:rPr>
+              <w:t>(</w:t>
+            </w:r>
+            <w:r>
+              <w:rPr>
+                <w:kern w:val="0"/>
+                <w:rtl w:val="true"/>
+                <w:lang w:val="en-US" w:eastAsia="en-US" w:bidi="ar-SA"/>
+              </w:rPr>
+              <w:t>وصفي</w:t>
+            </w:r>
+            <w:r>
+              <w:rPr>
+                <w:kern w:val="0"/>
+                <w:rtl w:val="true"/>
+                <w:lang w:val="en-US" w:eastAsia="en-US" w:bidi="ar-SA"/>
+              </w:rPr>
+              <w:t>)</w:t>
             </w:r>
           </w:p>
         </w:tc>
@@ -28765,7 +29312,7 @@
                 <w:rtl w:val="true"/>
                 <w:lang w:val="en-US" w:eastAsia="en-US" w:bidi="ar-SA"/>
               </w:rPr>
-              <w:t>اتساع التوصيات</w:t>
+              <w:t>الكتالوج</w:t>
             </w:r>
           </w:p>
         </w:tc>
@@ -28797,54 +29344,14 @@
                 <w:rtl w:val="true"/>
                 <w:lang w:val="en-US" w:eastAsia="en-US" w:bidi="ar-SA"/>
               </w:rPr>
-              <w:t xml:space="preserve">عدد الموارد التي ظهرت في أفضل </w:t>
-            </w:r>
-            <w:r>
-              <w:rPr>
-                <w:kern w:val="0"/>
-                <w:lang w:val="en-US" w:eastAsia="en-US" w:bidi="ar-SA"/>
-              </w:rPr>
-              <w:t>10</w:t>
-            </w:r>
-            <w:r>
-              <w:rPr>
-                <w:kern w:val="0"/>
-                <w:rtl w:val="true"/>
-                <w:lang w:val="en-US" w:eastAsia="en-US" w:bidi="ar-SA"/>
-              </w:rPr>
-              <w:t xml:space="preserve"> </w:t>
-            </w:r>
-            <w:r>
-              <w:rPr>
-                <w:kern w:val="0"/>
-                <w:rtl w:val="true"/>
-                <w:lang w:val="en-US" w:eastAsia="en-US" w:bidi="ar-SA"/>
-              </w:rPr>
-              <w:t xml:space="preserve">لأي متعلم </w:t>
-            </w:r>
-            <w:r>
-              <w:rPr>
-                <w:kern w:val="0"/>
-                <w:rtl w:val="true"/>
-                <w:lang w:val="en-US" w:eastAsia="en-US" w:bidi="ar-SA"/>
-              </w:rPr>
-              <w:t>(</w:t>
-            </w:r>
-            <w:r>
-              <w:rPr>
-                <w:kern w:val="0"/>
-                <w:rtl w:val="true"/>
-                <w:lang w:val="en-US" w:eastAsia="en-US" w:bidi="ar-SA"/>
-              </w:rPr>
-              <w:t>وصفي</w:t>
-            </w:r>
-            <w:r>
-              <w:rPr>
-                <w:kern w:val="0"/>
-                <w:rtl w:val="true"/>
-                <w:lang w:val="en-US" w:eastAsia="en-US" w:bidi="ar-SA"/>
-              </w:rPr>
-              <w:t>)</w:t>
+              <w:t xml:space="preserve">الموارد المتاحة للتوصية حتى اليوم </w:t>
+            </w:r>
+            <w:r>
+              <w:rPr>
+                <w:kern w:val="0"/>
+                <w:lang w:val="en-US" w:eastAsia="en-US" w:bidi="ar-SA"/>
+              </w:rPr>
+              <w:t>t</w:t>
             </w:r>
           </w:p>
         </w:tc>
@@ -28879,7 +29386,7 @@
                 <w:rtl w:val="true"/>
                 <w:lang w:val="en-US" w:eastAsia="en-US" w:bidi="ar-SA"/>
               </w:rPr>
-              <w:t>الكتالوج</w:t>
+              <w:t>الفوج</w:t>
             </w:r>
           </w:p>
         </w:tc>
@@ -28911,7 +29418,7 @@
                 <w:rtl w:val="true"/>
                 <w:lang w:val="en-US" w:eastAsia="en-US" w:bidi="ar-SA"/>
               </w:rPr>
-              <w:t xml:space="preserve">الموارد المتاحة للتوصية حتى اليوم </w:t>
+              <w:t xml:space="preserve">المتعلمون المسجَّلون حتى اليوم </w:t>
             </w:r>
             <w:r>
               <w:rPr>
@@ -28919,6 +29426,22 @@
                 <w:lang w:val="en-US" w:eastAsia="en-US" w:bidi="ar-SA"/>
               </w:rPr>
               <w:t>t</w:t>
+            </w:r>
+            <w:r>
+              <w:rPr>
+                <w:kern w:val="0"/>
+                <w:rtl w:val="true"/>
+                <w:lang w:val="en-US" w:eastAsia="en-US" w:bidi="ar-SA"/>
+              </w:rPr>
+              <w:t xml:space="preserve"> </w:t>
+            </w:r>
+            <w:r>
+              <w:rPr>
+                <w:kern w:val="0"/>
+                <w:rtl w:val="true"/>
+                <w:lang w:val="en-US" w:eastAsia="en-US" w:bidi="ar-SA"/>
+              </w:rPr>
+              <w:t>ولم ينسحبوا بعد</w:t>
             </w:r>
           </w:p>
         </w:tc>
@@ -28950,10 +29473,9 @@
             <w:r>
               <w:rPr>
                 <w:kern w:val="0"/>
-                <w:rtl w:val="true"/>
-                <w:lang w:val="en-US" w:eastAsia="en-US" w:bidi="ar-SA"/>
-              </w:rPr>
-              <w:t>الفوج</w:t>
+                <w:lang w:val="en-US" w:eastAsia="en-US" w:bidi="ar-SA"/>
+              </w:rPr>
+              <w:t>OULAD</w:t>
             </w:r>
           </w:p>
         </w:tc>
@@ -28985,30 +29507,7 @@
                 <w:rtl w:val="true"/>
                 <w:lang w:val="en-US" w:eastAsia="en-US" w:bidi="ar-SA"/>
               </w:rPr>
-              <w:t xml:space="preserve">المتعلمون المسجَّلون حتى اليوم </w:t>
-            </w:r>
-            <w:r>
-              <w:rPr>
-                <w:kern w:val="0"/>
-                <w:lang w:val="en-US" w:eastAsia="en-US" w:bidi="ar-SA"/>
-              </w:rPr>
-              <w:t>t</w:t>
-            </w:r>
-            <w:r>
-              <w:rPr>
-                <w:kern w:val="0"/>
-                <w:rtl w:val="true"/>
-                <w:lang w:val="en-US" w:eastAsia="en-US" w:bidi="ar-SA"/>
-              </w:rPr>
-              <w:t xml:space="preserve"> </w:t>
-            </w:r>
-            <w:r>
-              <w:rPr>
-                <w:kern w:val="0"/>
-                <w:rtl w:val="true"/>
-                <w:lang w:val="en-US" w:eastAsia="en-US" w:bidi="ar-SA"/>
-              </w:rPr>
-              <w:t>ولم ينسحبوا بعد</w:t>
+              <w:t>بيانات منصة الجامعة المفتوحة التاريخية</w:t>
             </w:r>
           </w:p>
         </w:tc>
@@ -29039,10 +29538,19 @@
             </w:pPr>
             <w:r>
               <w:rPr>
-                <w:kern w:val="0"/>
-                <w:lang w:val="en-US" w:eastAsia="en-US" w:bidi="ar-SA"/>
-              </w:rPr>
-              <w:t>OULAD</w:t>
+                <w:rStyle w:val="VerbatimChar"/>
+                <w:kern w:val="0"/>
+                <w:lang w:val="en-US" w:eastAsia="en-US" w:bidi="ar-SA"/>
+              </w:rPr>
+              <w:t>‎</w:t>
+            </w:r>
+            <w:r>
+              <w:rPr>
+                <w:rStyle w:val="VerbatimChar"/>
+                <w:kern w:val="0"/>
+                <w:lang w:val="en-US" w:eastAsia="en-US" w:bidi="ar-SA"/>
+              </w:rPr>
+              <w:t>id_site‎</w:t>
             </w:r>
           </w:p>
         </w:tc>
@@ -29074,81 +29582,6 @@
                 <w:rtl w:val="true"/>
                 <w:lang w:val="en-US" w:eastAsia="en-US" w:bidi="ar-SA"/>
               </w:rPr>
-              <w:t>بيانات منصة الجامعة المفتوحة التاريخية</w:t>
-            </w:r>
-          </w:p>
-        </w:tc>
-      </w:tr>
-      <w:tr>
-        <w:trPr/>
-        <w:tc>
-          <w:tcPr>
-            <w:tcW w:w="4393" w:type="dxa"/>
-            <w:tcBorders>
-              <w:top w:val="single" w:sz="4" w:space="0" w:color="808080"/>
-              <w:left w:val="single" w:sz="4" w:space="0" w:color="808080"/>
-              <w:bottom w:val="single" w:sz="4" w:space="0" w:color="808080"/>
-              <w:right w:val="single" w:sz="4" w:space="0" w:color="808080"/>
-            </w:tcBorders>
-          </w:tcPr>
-          <w:p>
-            <w:pPr>
-              <w:pStyle w:val="Compact"/>
-              <w:widowControl/>
-              <w:bidi w:val="1"/>
-              <w:spacing w:before="36" w:after="36"/>
-              <w:jc w:val="left"/>
-              <w:rPr>
-                <w:kern w:val="0"/>
-                <w:lang w:val="en-US" w:eastAsia="en-US" w:bidi="ar-SA"/>
-              </w:rPr>
-            </w:pPr>
-            <w:r>
-              <w:rPr>
-                <w:rStyle w:val="VerbatimChar"/>
-                <w:kern w:val="0"/>
-                <w:lang w:val="en-US" w:eastAsia="en-US" w:bidi="ar-SA"/>
-              </w:rPr>
-              <w:t>‎</w:t>
-            </w:r>
-            <w:r>
-              <w:rPr>
-                <w:rStyle w:val="VerbatimChar"/>
-                <w:kern w:val="0"/>
-                <w:lang w:val="en-US" w:eastAsia="en-US" w:bidi="ar-SA"/>
-              </w:rPr>
-              <w:t>id_site‎</w:t>
-            </w:r>
-          </w:p>
-        </w:tc>
-        <w:tc>
-          <w:tcPr>
-            <w:tcW w:w="4394" w:type="dxa"/>
-            <w:tcBorders>
-              <w:top w:val="single" w:sz="4" w:space="0" w:color="808080"/>
-              <w:left w:val="single" w:sz="4" w:space="0" w:color="808080"/>
-              <w:bottom w:val="single" w:sz="4" w:space="0" w:color="808080"/>
-              <w:right w:val="single" w:sz="4" w:space="0" w:color="808080"/>
-            </w:tcBorders>
-          </w:tcPr>
-          <w:p>
-            <w:pPr>
-              <w:pStyle w:val="Compact"/>
-              <w:widowControl/>
-              <w:bidi w:val="1"/>
-              <w:spacing w:before="36" w:after="36"/>
-              <w:jc w:val="left"/>
-              <w:rPr>
-                <w:kern w:val="0"/>
-                <w:lang w:val="en-US" w:eastAsia="en-US" w:bidi="ar-SA"/>
-              </w:rPr>
-            </w:pPr>
-            <w:r>
-              <w:rPr>
-                <w:kern w:val="0"/>
-                <w:rtl w:val="true"/>
-                <w:lang w:val="en-US" w:eastAsia="en-US" w:bidi="ar-SA"/>
-              </w:rPr>
               <w:t>معرّف المورد في البيانات</w:t>
             </w:r>
             <w:bookmarkStart w:id="89" w:name="مسرد-المصطلحات"/>
@@ -29163,7 +29596,7 @@
         <w:bidi w:val="1"/>
         <w:rPr/>
       </w:pPr>
-      <w:bookmarkStart w:id="90" w:name="__RefHeading___Toc2511_1971269794"/>
+      <w:bookmarkStart w:id="90" w:name="__RefHeading___Toc2511_4114594835"/>
       <w:bookmarkEnd w:id="90"/>
       <w:r>
         <w:rPr/>

</xml_diff>

<commit_message>
User guide: D-74 sentence on risk cut 28; reproduce_dev outputs (repro_diff, repro_meta, summary, freeze checklist); WIP about.html
Co-Authored-By: Claude Fable 5.1 <noreply@anthropic.com>
Claude-Session: https://claude.ai/code/session_01Y5Ccgz17Pq2brpK5TTSYa7
</commit_message>
<xml_diff>
--- a/deliverables/05-user-guide/دليل-المستخدم-والواجهات.docx
+++ b/deliverables/05-user-guide/دليل-المستخدم-والواجهات.docx
@@ -378,7 +378,7 @@
             </w:rPr>
             <w:fldChar w:fldCharType="separate"/>
           </w:r>
-          <w:hyperlink w:anchor="__RefHeading___Toc2429_1094282047">
+          <w:hyperlink w:anchor="__RefHeading___Toc2429_4080044552">
             <w:r>
               <w:rPr>
                 <w:webHidden/>
@@ -424,7 +424,7 @@
             </w:tabs>
             <w:rPr/>
           </w:pPr>
-          <w:hyperlink w:anchor="__RefHeading___Toc2431_1094282047">
+          <w:hyperlink w:anchor="__RefHeading___Toc2431_4080044552">
             <w:r>
               <w:rPr>
                 <w:webHidden/>
@@ -470,7 +470,7 @@
             </w:tabs>
             <w:rPr/>
           </w:pPr>
-          <w:hyperlink w:anchor="__RefHeading___Toc2433_1094282047">
+          <w:hyperlink w:anchor="__RefHeading___Toc2433_4080044552">
             <w:r>
               <w:rPr>
                 <w:webHidden/>
@@ -516,7 +516,7 @@
             </w:tabs>
             <w:rPr/>
           </w:pPr>
-          <w:hyperlink w:anchor="__RefHeading___Toc2435_1094282047">
+          <w:hyperlink w:anchor="__RefHeading___Toc2435_4080044552">
             <w:r>
               <w:rPr>
                 <w:webHidden/>
@@ -562,7 +562,7 @@
             </w:tabs>
             <w:rPr/>
           </w:pPr>
-          <w:hyperlink w:anchor="__RefHeading___Toc2437_1094282047">
+          <w:hyperlink w:anchor="__RefHeading___Toc2437_4080044552">
             <w:r>
               <w:rPr>
                 <w:webHidden/>
@@ -623,7 +623,7 @@
             </w:tabs>
             <w:rPr/>
           </w:pPr>
-          <w:hyperlink w:anchor="__RefHeading___Toc2439_1094282047">
+          <w:hyperlink w:anchor="__RefHeading___Toc2439_4080044552">
             <w:r>
               <w:rPr>
                 <w:webHidden/>
@@ -669,7 +669,7 @@
             </w:tabs>
             <w:rPr/>
           </w:pPr>
-          <w:hyperlink w:anchor="__RefHeading___Toc2441_1094282047">
+          <w:hyperlink w:anchor="__RefHeading___Toc2441_4080044552">
             <w:r>
               <w:rPr>
                 <w:webHidden/>
@@ -715,7 +715,7 @@
             </w:tabs>
             <w:rPr/>
           </w:pPr>
-          <w:hyperlink w:anchor="__RefHeading___Toc2443_1094282047">
+          <w:hyperlink w:anchor="__RefHeading___Toc2443_4080044552">
             <w:r>
               <w:rPr>
                 <w:webHidden/>
@@ -761,7 +761,7 @@
             </w:tabs>
             <w:rPr/>
           </w:pPr>
-          <w:hyperlink w:anchor="__RefHeading___Toc2445_1094282047">
+          <w:hyperlink w:anchor="__RefHeading___Toc2445_4080044552">
             <w:r>
               <w:rPr>
                 <w:webHidden/>
@@ -822,7 +822,7 @@
             </w:tabs>
             <w:rPr/>
           </w:pPr>
-          <w:hyperlink w:anchor="__RefHeading___Toc2447_1094282047">
+          <w:hyperlink w:anchor="__RefHeading___Toc2447_4080044552">
             <w:r>
               <w:rPr>
                 <w:webHidden/>
@@ -868,7 +868,7 @@
             </w:tabs>
             <w:rPr/>
           </w:pPr>
-          <w:hyperlink w:anchor="__RefHeading___Toc2449_1094282047">
+          <w:hyperlink w:anchor="__RefHeading___Toc2449_4080044552">
             <w:r>
               <w:rPr>
                 <w:webHidden/>
@@ -914,7 +914,7 @@
             </w:tabs>
             <w:rPr/>
           </w:pPr>
-          <w:hyperlink w:anchor="__RefHeading___Toc2451_1094282047">
+          <w:hyperlink w:anchor="__RefHeading___Toc2451_4080044552">
             <w:r>
               <w:rPr>
                 <w:webHidden/>
@@ -960,7 +960,7 @@
             </w:tabs>
             <w:rPr/>
           </w:pPr>
-          <w:hyperlink w:anchor="__RefHeading___Toc2453_1094282047">
+          <w:hyperlink w:anchor="__RefHeading___Toc2453_4080044552">
             <w:r>
               <w:rPr>
                 <w:webHidden/>
@@ -1006,7 +1006,7 @@
             </w:tabs>
             <w:rPr/>
           </w:pPr>
-          <w:hyperlink w:anchor="__RefHeading___Toc2455_1094282047">
+          <w:hyperlink w:anchor="__RefHeading___Toc2455_4080044552">
             <w:r>
               <w:rPr>
                 <w:webHidden/>
@@ -1052,7 +1052,7 @@
             </w:tabs>
             <w:rPr/>
           </w:pPr>
-          <w:hyperlink w:anchor="__RefHeading___Toc2457_1094282047">
+          <w:hyperlink w:anchor="__RefHeading___Toc2457_4080044552">
             <w:r>
               <w:rPr>
                 <w:webHidden/>
@@ -1098,7 +1098,7 @@
             </w:tabs>
             <w:rPr/>
           </w:pPr>
-          <w:hyperlink w:anchor="__RefHeading___Toc2459_1094282047">
+          <w:hyperlink w:anchor="__RefHeading___Toc2459_4080044552">
             <w:r>
               <w:rPr>
                 <w:webHidden/>
@@ -1144,7 +1144,7 @@
             </w:tabs>
             <w:rPr/>
           </w:pPr>
-          <w:hyperlink w:anchor="__RefHeading___Toc2461_1094282047">
+          <w:hyperlink w:anchor="__RefHeading___Toc2461_4080044552">
             <w:r>
               <w:rPr>
                 <w:webHidden/>
@@ -1205,7 +1205,7 @@
             </w:tabs>
             <w:rPr/>
           </w:pPr>
-          <w:hyperlink w:anchor="__RefHeading___Toc2463_1094282047">
+          <w:hyperlink w:anchor="__RefHeading___Toc2463_4080044552">
             <w:r>
               <w:rPr>
                 <w:webHidden/>
@@ -1266,7 +1266,7 @@
             </w:tabs>
             <w:rPr/>
           </w:pPr>
-          <w:hyperlink w:anchor="__RefHeading___Toc2465_1094282047">
+          <w:hyperlink w:anchor="__RefHeading___Toc2465_4080044552">
             <w:r>
               <w:rPr>
                 <w:webHidden/>
@@ -1327,7 +1327,7 @@
             </w:tabs>
             <w:rPr/>
           </w:pPr>
-          <w:hyperlink w:anchor="__RefHeading___Toc2467_1094282047">
+          <w:hyperlink w:anchor="__RefHeading___Toc2467_4080044552">
             <w:r>
               <w:rPr>
                 <w:webHidden/>
@@ -1388,7 +1388,7 @@
             </w:tabs>
             <w:rPr/>
           </w:pPr>
-          <w:hyperlink w:anchor="__RefHeading___Toc2469_1094282047">
+          <w:hyperlink w:anchor="__RefHeading___Toc2469_4080044552">
             <w:r>
               <w:rPr>
                 <w:webHidden/>
@@ -1454,7 +1454,7 @@
             </w:tabs>
             <w:rPr/>
           </w:pPr>
-          <w:hyperlink w:anchor="__RefHeading___Toc2471_1094282047">
+          <w:hyperlink w:anchor="__RefHeading___Toc2471_4080044552">
             <w:r>
               <w:rPr>
                 <w:webHidden/>
@@ -1500,7 +1500,7 @@
             </w:tabs>
             <w:rPr/>
           </w:pPr>
-          <w:hyperlink w:anchor="__RefHeading___Toc2473_1094282047">
+          <w:hyperlink w:anchor="__RefHeading___Toc2473_4080044552">
             <w:r>
               <w:rPr>
                 <w:webHidden/>
@@ -1561,7 +1561,7 @@
             </w:tabs>
             <w:rPr/>
           </w:pPr>
-          <w:hyperlink w:anchor="__RefHeading___Toc2475_1094282047">
+          <w:hyperlink w:anchor="__RefHeading___Toc2475_4080044552">
             <w:r>
               <w:rPr>
                 <w:webHidden/>
@@ -1607,7 +1607,7 @@
             </w:tabs>
             <w:rPr/>
           </w:pPr>
-          <w:hyperlink w:anchor="__RefHeading___Toc2477_1094282047">
+          <w:hyperlink w:anchor="__RefHeading___Toc2477_4080044552">
             <w:r>
               <w:rPr>
                 <w:webHidden/>
@@ -1653,7 +1653,7 @@
             </w:tabs>
             <w:rPr/>
           </w:pPr>
-          <w:hyperlink w:anchor="__RefHeading___Toc2479_1094282047">
+          <w:hyperlink w:anchor="__RefHeading___Toc2479_4080044552">
             <w:r>
               <w:rPr>
                 <w:webHidden/>
@@ -1705,7 +1705,7 @@
             </w:tabs>
             <w:rPr/>
           </w:pPr>
-          <w:hyperlink w:anchor="__RefHeading___Toc2481_1094282047">
+          <w:hyperlink w:anchor="__RefHeading___Toc2481_4080044552">
             <w:r>
               <w:rPr>
                 <w:webHidden/>
@@ -1751,7 +1751,7 @@
             </w:tabs>
             <w:rPr/>
           </w:pPr>
-          <w:hyperlink w:anchor="__RefHeading___Toc2483_1094282047">
+          <w:hyperlink w:anchor="__RefHeading___Toc2483_4080044552">
             <w:r>
               <w:rPr>
                 <w:webHidden/>
@@ -1797,7 +1797,7 @@
             </w:tabs>
             <w:rPr/>
           </w:pPr>
-          <w:hyperlink w:anchor="__RefHeading___Toc2485_1094282047">
+          <w:hyperlink w:anchor="__RefHeading___Toc2485_4080044552">
             <w:r>
               <w:rPr>
                 <w:webHidden/>
@@ -1843,7 +1843,7 @@
             </w:tabs>
             <w:rPr/>
           </w:pPr>
-          <w:hyperlink w:anchor="__RefHeading___Toc2487_1094282047">
+          <w:hyperlink w:anchor="__RefHeading___Toc2487_4080044552">
             <w:r>
               <w:rPr>
                 <w:webHidden/>
@@ -1889,7 +1889,7 @@
             </w:tabs>
             <w:rPr/>
           </w:pPr>
-          <w:hyperlink w:anchor="__RefHeading___Toc2489_1094282047">
+          <w:hyperlink w:anchor="__RefHeading___Toc2489_4080044552">
             <w:r>
               <w:rPr>
                 <w:webHidden/>
@@ -1935,7 +1935,7 @@
             </w:tabs>
             <w:rPr/>
           </w:pPr>
-          <w:hyperlink w:anchor="__RefHeading___Toc2491_1094282047">
+          <w:hyperlink w:anchor="__RefHeading___Toc2491_4080044552">
             <w:r>
               <w:rPr>
                 <w:webHidden/>
@@ -1981,7 +1981,7 @@
             </w:tabs>
             <w:rPr/>
           </w:pPr>
-          <w:hyperlink w:anchor="__RefHeading___Toc2493_1094282047">
+          <w:hyperlink w:anchor="__RefHeading___Toc2493_4080044552">
             <w:r>
               <w:rPr>
                 <w:webHidden/>
@@ -2027,7 +2027,7 @@
             </w:tabs>
             <w:rPr/>
           </w:pPr>
-          <w:hyperlink w:anchor="__RefHeading___Toc2495_1094282047">
+          <w:hyperlink w:anchor="__RefHeading___Toc2495_4080044552">
             <w:r>
               <w:rPr>
                 <w:webHidden/>
@@ -2073,7 +2073,7 @@
             </w:tabs>
             <w:rPr/>
           </w:pPr>
-          <w:hyperlink w:anchor="__RefHeading___Toc2497_1094282047">
+          <w:hyperlink w:anchor="__RefHeading___Toc2497_4080044552">
             <w:r>
               <w:rPr>
                 <w:webHidden/>
@@ -2119,7 +2119,7 @@
             </w:tabs>
             <w:rPr/>
           </w:pPr>
-          <w:hyperlink w:anchor="__RefHeading___Toc2499_1094282047">
+          <w:hyperlink w:anchor="__RefHeading___Toc2499_4080044552">
             <w:r>
               <w:rPr>
                 <w:webHidden/>
@@ -2179,7 +2179,7 @@
             </w:tabs>
             <w:rPr/>
           </w:pPr>
-          <w:hyperlink w:anchor="__RefHeading___Toc2501_1094282047">
+          <w:hyperlink w:anchor="__RefHeading___Toc2501_4080044552">
             <w:r>
               <w:rPr>
                 <w:webHidden/>
@@ -2225,7 +2225,7 @@
             </w:tabs>
             <w:rPr/>
           </w:pPr>
-          <w:hyperlink w:anchor="__RefHeading___Toc2503_1094282047">
+          <w:hyperlink w:anchor="__RefHeading___Toc2503_4080044552">
             <w:r>
               <w:rPr>
                 <w:webHidden/>
@@ -2271,7 +2271,7 @@
             </w:tabs>
             <w:rPr/>
           </w:pPr>
-          <w:hyperlink w:anchor="__RefHeading___Toc2505_1094282047">
+          <w:hyperlink w:anchor="__RefHeading___Toc2505_4080044552">
             <w:r>
               <w:rPr>
                 <w:webHidden/>
@@ -2317,7 +2317,7 @@
             </w:tabs>
             <w:rPr/>
           </w:pPr>
-          <w:hyperlink w:anchor="__RefHeading___Toc2507_1094282047">
+          <w:hyperlink w:anchor="__RefHeading___Toc2507_4080044552">
             <w:r>
               <w:rPr>
                 <w:webHidden/>
@@ -2378,7 +2378,7 @@
             </w:tabs>
             <w:rPr/>
           </w:pPr>
-          <w:hyperlink w:anchor="__RefHeading___Toc2509_1094282047">
+          <w:hyperlink w:anchor="__RefHeading___Toc2509_4080044552">
             <w:r>
               <w:rPr>
                 <w:webHidden/>
@@ -2424,7 +2424,7 @@
             </w:tabs>
             <w:rPr/>
           </w:pPr>
-          <w:hyperlink w:anchor="__RefHeading___Toc2511_1094282047">
+          <w:hyperlink w:anchor="__RefHeading___Toc2511_4080044552">
             <w:r>
               <w:rPr>
                 <w:webHidden/>
@@ -2475,7 +2475,7 @@
         <w:bidi w:val="1"/>
         <w:rPr/>
       </w:pPr>
-      <w:bookmarkStart w:id="0" w:name="__RefHeading___Toc2429_1094282047"/>
+      <w:bookmarkStart w:id="0" w:name="__RefHeading___Toc2429_4080044552"/>
       <w:bookmarkStart w:id="1" w:name="مقدمة"/>
       <w:bookmarkEnd w:id="0"/>
       <w:r>
@@ -2501,7 +2501,7 @@
         <w:bidi w:val="1"/>
         <w:rPr/>
       </w:pPr>
-      <w:bookmarkStart w:id="2" w:name="__RefHeading___Toc2431_1094282047"/>
+      <w:bookmarkStart w:id="2" w:name="__RefHeading___Toc2431_4080044552"/>
       <w:bookmarkStart w:id="3" w:name="ما-هذا-النظام"/>
       <w:bookmarkEnd w:id="2"/>
       <w:r>
@@ -2760,7 +2760,7 @@
         <w:bidi w:val="1"/>
         <w:rPr/>
       </w:pPr>
-      <w:bookmarkStart w:id="4" w:name="__RefHeading___Toc2433_1094282047"/>
+      <w:bookmarkStart w:id="4" w:name="__RefHeading___Toc2433_4080044552"/>
       <w:bookmarkStart w:id="5" w:name="ما-الذي-يفعله-النظام-وما-الذي-لا-يفعله"/>
       <w:bookmarkEnd w:id="4"/>
       <w:r>
@@ -3482,7 +3482,7 @@
         <w:bidi w:val="1"/>
         <w:rPr/>
       </w:pPr>
-      <w:bookmarkStart w:id="6" w:name="__RefHeading___Toc2435_1094282047"/>
+      <w:bookmarkStart w:id="6" w:name="__RefHeading___Toc2435_4080044552"/>
       <w:bookmarkStart w:id="7" w:name="لمن-هذا-الدليل"/>
       <w:bookmarkEnd w:id="6"/>
       <w:r>
@@ -3747,7 +3747,7 @@
         <w:bidi w:val="1"/>
         <w:rPr/>
       </w:pPr>
-      <w:bookmarkStart w:id="8" w:name="__RefHeading___Toc2437_1094282047"/>
+      <w:bookmarkStart w:id="8" w:name="__RefHeading___Toc2437_4080044552"/>
       <w:bookmarkStart w:id="9" w:name="شريط-عرض-توضيحي-بلا-أمان-وصول"/>
       <w:bookmarkEnd w:id="8"/>
       <w:r>
@@ -3966,7 +3966,7 @@
         <w:bidi w:val="1"/>
         <w:rPr/>
       </w:pPr>
-      <w:bookmarkStart w:id="10" w:name="__RefHeading___Toc2439_1094282047"/>
+      <w:bookmarkStart w:id="10" w:name="__RefHeading___Toc2439_4080044552"/>
       <w:bookmarkStart w:id="11" w:name="المتطلبات"/>
       <w:bookmarkEnd w:id="10"/>
       <w:r>
@@ -4481,7 +4481,7 @@
         <w:bidi w:val="1"/>
         <w:rPr/>
       </w:pPr>
-      <w:bookmarkStart w:id="14" w:name="__RefHeading___Toc2441_1094282047"/>
+      <w:bookmarkStart w:id="14" w:name="__RefHeading___Toc2441_4080044552"/>
       <w:bookmarkStart w:id="15" w:name="البدء-السريع-لمشغل-النظام"/>
       <w:bookmarkEnd w:id="14"/>
       <w:r>
@@ -4550,7 +4550,7 @@
         <w:bidi w:val="1"/>
         <w:rPr/>
       </w:pPr>
-      <w:bookmarkStart w:id="16" w:name="__RefHeading___Toc2443_1094282047"/>
+      <w:bookmarkStart w:id="16" w:name="__RefHeading___Toc2443_4080044552"/>
       <w:bookmarkStart w:id="17" w:name="الخطوات-الأساسية"/>
       <w:bookmarkEnd w:id="16"/>
       <w:r>
@@ -6687,7 +6687,7 @@
         <w:bidi w:val="1"/>
         <w:rPr/>
       </w:pPr>
-      <w:bookmarkStart w:id="18" w:name="__RefHeading___Toc2445_1094282047"/>
+      <w:bookmarkStart w:id="18" w:name="__RefHeading___Toc2445_4080044552"/>
       <w:bookmarkStart w:id="19" w:name="وضع-المحاكاة-بلا-خادم"/>
       <w:bookmarkEnd w:id="18"/>
       <w:r>
@@ -7220,7 +7220,7 @@
         <w:bidi w:val="1"/>
         <w:rPr/>
       </w:pPr>
-      <w:bookmarkStart w:id="20" w:name="__RefHeading___Toc2447_1094282047"/>
+      <w:bookmarkStart w:id="20" w:name="__RefHeading___Toc2447_4080044552"/>
       <w:bookmarkStart w:id="21" w:name="صور-الشاشة"/>
       <w:bookmarkEnd w:id="20"/>
       <w:r>
@@ -7401,7 +7401,7 @@
         <w:bidi w:val="1"/>
         <w:rPr/>
       </w:pPr>
-      <w:bookmarkStart w:id="22" w:name="__RefHeading___Toc2449_1094282047"/>
+      <w:bookmarkStart w:id="22" w:name="__RefHeading___Toc2449_4080044552"/>
       <w:bookmarkStart w:id="23" w:name="استكشاف-الأخطاء-الشائعة"/>
       <w:bookmarkEnd w:id="22"/>
       <w:r>
@@ -8935,7 +8935,7 @@
         <w:bidi w:val="1"/>
         <w:rPr/>
       </w:pPr>
-      <w:bookmarkStart w:id="26" w:name="__RefHeading___Toc2451_1094282047"/>
+      <w:bookmarkStart w:id="26" w:name="__RefHeading___Toc2451_4080044552"/>
       <w:bookmarkStart w:id="27" w:name="دليل-المتعلم"/>
       <w:bookmarkEnd w:id="26"/>
       <w:r>
@@ -9013,7 +9013,7 @@
         <w:bidi w:val="1"/>
         <w:rPr/>
       </w:pPr>
-      <w:bookmarkStart w:id="28" w:name="__RefHeading___Toc2453_1094282047"/>
+      <w:bookmarkStart w:id="28" w:name="__RefHeading___Toc2453_4080044552"/>
       <w:bookmarkStart w:id="29" w:name="الصفحة-الرئيسية"/>
       <w:bookmarkEnd w:id="28"/>
       <w:r>
@@ -9792,7 +9792,7 @@
         <w:bidi w:val="1"/>
         <w:rPr/>
       </w:pPr>
-      <w:bookmarkStart w:id="30" w:name="__RefHeading___Toc2455_1094282047"/>
+      <w:bookmarkStart w:id="30" w:name="__RefHeading___Toc2455_4080044552"/>
       <w:bookmarkStart w:id="31" w:name="شريط-الأيام-ومعنى-العلامات"/>
       <w:bookmarkEnd w:id="30"/>
       <w:r>
@@ -10759,6 +10759,106 @@
               </w:rPr>
               <w:t>اليوم الذي تُحسب عنده ملامح السلوك لدرجة الخطر النسبية</w:t>
             </w:r>
+            <w:r>
+              <w:rPr>
+                <w:kern w:val="0"/>
+                <w:rtl w:val="true"/>
+                <w:lang w:val="en-US" w:eastAsia="en-US" w:bidi="ar-SA"/>
+              </w:rPr>
+              <w:t xml:space="preserve">. </w:t>
+            </w:r>
+            <w:r>
+              <w:rPr>
+                <w:kern w:val="0"/>
+                <w:rtl w:val="true"/>
+                <w:lang w:val="en-US" w:eastAsia="en-US" w:bidi="ar-SA"/>
+              </w:rPr>
+              <w:t xml:space="preserve">قطع الخطر </w:t>
+            </w:r>
+            <w:r>
+              <w:rPr>
+                <w:kern w:val="0"/>
+                <w:lang w:val="en-US" w:eastAsia="en-US" w:bidi="ar-SA"/>
+              </w:rPr>
+              <w:t>28</w:t>
+            </w:r>
+            <w:r>
+              <w:rPr>
+                <w:kern w:val="0"/>
+                <w:rtl w:val="true"/>
+                <w:lang w:val="en-US" w:eastAsia="en-US" w:bidi="ar-SA"/>
+              </w:rPr>
+              <w:t xml:space="preserve"> </w:t>
+            </w:r>
+            <w:r>
+              <w:rPr>
+                <w:kern w:val="0"/>
+                <w:rtl w:val="true"/>
+                <w:lang w:val="en-US" w:eastAsia="en-US" w:bidi="ar-SA"/>
+              </w:rPr>
+              <w:t xml:space="preserve">معرَّف ومبني، ولا يُعرض لأن اللوحة تبدأ من أول لقطة عناقيد </w:t>
+            </w:r>
+            <w:r>
+              <w:rPr>
+                <w:kern w:val="0"/>
+                <w:rtl w:val="true"/>
+                <w:lang w:val="en-US" w:eastAsia="en-US" w:bidi="ar-SA"/>
+              </w:rPr>
+              <w:t>(</w:t>
+            </w:r>
+            <w:r>
+              <w:rPr>
+                <w:kern w:val="0"/>
+                <w:lang w:val="en-US" w:eastAsia="en-US" w:bidi="ar-SA"/>
+              </w:rPr>
+              <w:t>56</w:t>
+            </w:r>
+            <w:r>
+              <w:rPr>
+                <w:kern w:val="0"/>
+                <w:rtl w:val="true"/>
+                <w:lang w:val="en-US" w:eastAsia="en-US" w:bidi="ar-SA"/>
+              </w:rPr>
+              <w:t xml:space="preserve">). </w:t>
+            </w:r>
+            <w:r>
+              <w:rPr>
+                <w:kern w:val="0"/>
+                <w:rtl w:val="true"/>
+                <w:lang w:val="en-US" w:eastAsia="en-US" w:bidi="ar-SA"/>
+              </w:rPr>
+              <w:t xml:space="preserve">فالقطوع المعروضة </w:t>
+            </w:r>
+            <w:r>
+              <w:rPr>
+                <w:kern w:val="0"/>
+                <w:lang w:val="en-US" w:eastAsia="en-US" w:bidi="ar-SA"/>
+              </w:rPr>
+              <w:t>56</w:t>
+            </w:r>
+            <w:r>
+              <w:rPr>
+                <w:kern w:val="0"/>
+                <w:rtl w:val="true"/>
+                <w:lang w:val="en-US" w:eastAsia="en-US" w:bidi="ar-SA"/>
+              </w:rPr>
+              <w:t xml:space="preserve"> </w:t>
+            </w:r>
+            <w:r>
+              <w:rPr>
+                <w:kern w:val="0"/>
+                <w:rtl w:val="true"/>
+                <w:lang w:val="en-US" w:eastAsia="en-US" w:bidi="ar-SA"/>
+              </w:rPr>
+              <w:t>و</w:t>
+            </w:r>
+            <w:r>
+              <w:rPr>
+                <w:kern w:val="0"/>
+                <w:lang w:val="en-US" w:eastAsia="en-US" w:bidi="ar-SA"/>
+              </w:rPr>
+              <w:t>112</w:t>
+            </w:r>
           </w:p>
         </w:tc>
       </w:tr>
@@ -11314,7 +11414,7 @@
         <w:bidi w:val="1"/>
         <w:rPr/>
       </w:pPr>
-      <w:bookmarkStart w:id="32" w:name="__RefHeading___Toc2457_1094282047"/>
+      <w:bookmarkStart w:id="32" w:name="__RefHeading___Toc2457_4080044552"/>
       <w:bookmarkStart w:id="33" w:name="شريط-السياق"/>
       <w:bookmarkEnd w:id="32"/>
       <w:r>
@@ -11792,7 +11892,7 @@
         <w:bidi w:val="1"/>
         <w:rPr/>
       </w:pPr>
-      <w:bookmarkStart w:id="34" w:name="__RefHeading___Toc2459_1094282047"/>
+      <w:bookmarkStart w:id="34" w:name="__RefHeading___Toc2459_4080044552"/>
       <w:bookmarkStart w:id="35" w:name="قراءة-بطاقة-التوصية"/>
       <w:bookmarkEnd w:id="34"/>
       <w:r>
@@ -12662,7 +12762,7 @@
         <w:bidi w:val="1"/>
         <w:rPr/>
       </w:pPr>
-      <w:bookmarkStart w:id="36" w:name="__RefHeading___Toc2461_1094282047"/>
+      <w:bookmarkStart w:id="36" w:name="__RefHeading___Toc2461_4080044552"/>
       <w:bookmarkStart w:id="37" w:name="نافذة-لماذا"/>
       <w:bookmarkEnd w:id="36"/>
       <w:r>
@@ -13331,7 +13431,7 @@
         <w:bidi w:val="1"/>
         <w:rPr/>
       </w:pPr>
-      <w:bookmarkStart w:id="38" w:name="__RefHeading___Toc2463_1094282047"/>
+      <w:bookmarkStart w:id="38" w:name="__RefHeading___Toc2463_4080044552"/>
       <w:bookmarkStart w:id="39" w:name="شارة-تاريخ-النموذج"/>
       <w:bookmarkEnd w:id="38"/>
       <w:r>
@@ -13724,7 +13824,7 @@
         <w:bidi w:val="1"/>
         <w:rPr/>
       </w:pPr>
-      <w:bookmarkStart w:id="40" w:name="__RefHeading___Toc2465_1094282047"/>
+      <w:bookmarkStart w:id="40" w:name="__RefHeading___Toc2465_4080044552"/>
       <w:bookmarkStart w:id="41" w:name="حالة-قبل-أول-قطع"/>
       <w:bookmarkEnd w:id="40"/>
       <w:r>
@@ -13988,7 +14088,7 @@
         <w:bidi w:val="1"/>
         <w:rPr/>
       </w:pPr>
-      <w:bookmarkStart w:id="42" w:name="__RefHeading___Toc2467_1094282047"/>
+      <w:bookmarkStart w:id="42" w:name="__RefHeading___Toc2467_4080044552"/>
       <w:bookmarkStart w:id="43" w:name="حالة-بلا-نشاط-سابق"/>
       <w:bookmarkEnd w:id="42"/>
       <w:r>
@@ -14098,7 +14198,7 @@
         <w:bidi w:val="1"/>
         <w:rPr/>
       </w:pPr>
-      <w:bookmarkStart w:id="44" w:name="__RefHeading___Toc2469_1094282047"/>
+      <w:bookmarkStart w:id="44" w:name="__RefHeading___Toc2469_4080044552"/>
       <w:bookmarkStart w:id="45" w:name="نشاطي-في-آخر-28-يوما"/>
       <w:bookmarkEnd w:id="44"/>
       <w:r>
@@ -14439,7 +14539,7 @@
         <w:bidi w:val="1"/>
         <w:rPr/>
       </w:pPr>
-      <w:bookmarkStart w:id="46" w:name="__RefHeading___Toc2471_1094282047"/>
+      <w:bookmarkStart w:id="46" w:name="__RefHeading___Toc2471_4080044552"/>
       <w:bookmarkStart w:id="47" w:name="ما-لا-تعرضه-صفحة-المتعلم"/>
       <w:bookmarkEnd w:id="46"/>
       <w:r>
@@ -14647,7 +14747,7 @@
         <w:bidi w:val="1"/>
         <w:rPr/>
       </w:pPr>
-      <w:bookmarkStart w:id="48" w:name="__RefHeading___Toc2473_1094282047"/>
+      <w:bookmarkStart w:id="48" w:name="__RefHeading___Toc2473_4080044552"/>
       <w:bookmarkStart w:id="49" w:name="حالة-منسحب"/>
       <w:bookmarkEnd w:id="48"/>
       <w:r>
@@ -14878,7 +14978,7 @@
         <w:bidi w:val="1"/>
         <w:rPr/>
       </w:pPr>
-      <w:bookmarkStart w:id="52" w:name="__RefHeading___Toc2475_1094282047"/>
+      <w:bookmarkStart w:id="52" w:name="__RefHeading___Toc2475_4080044552"/>
       <w:bookmarkStart w:id="53" w:name="دليل-المدرس-أو-المشرف"/>
       <w:bookmarkEnd w:id="52"/>
       <w:r>
@@ -14939,7 +15039,7 @@
         <w:bidi w:val="1"/>
         <w:rPr/>
       </w:pPr>
-      <w:bookmarkStart w:id="54" w:name="__RefHeading___Toc2477_1094282047"/>
+      <w:bookmarkStart w:id="54" w:name="__RefHeading___Toc2477_4080044552"/>
       <w:bookmarkStart w:id="55" w:name="تنبيه-قبل-البدء"/>
       <w:bookmarkEnd w:id="54"/>
       <w:r>
@@ -15219,7 +15319,7 @@
         <w:bidi w:val="1"/>
         <w:rPr/>
       </w:pPr>
-      <w:bookmarkStart w:id="56" w:name="__RefHeading___Toc2479_1094282047"/>
+      <w:bookmarkStart w:id="56" w:name="__RefHeading___Toc2479_4080044552"/>
       <w:bookmarkStart w:id="57" w:name="تبدأ-اللوحة-من-اليوم-56"/>
       <w:bookmarkEnd w:id="56"/>
       <w:r>
@@ -15307,7 +15407,7 @@
         <w:bidi w:val="1"/>
         <w:rPr/>
       </w:pPr>
-      <w:bookmarkStart w:id="58" w:name="__RefHeading___Toc2481_1094282047"/>
+      <w:bookmarkStart w:id="58" w:name="__RefHeading___Toc2481_4080044552"/>
       <w:bookmarkStart w:id="59" w:name="لوحة-المؤشرات"/>
       <w:bookmarkEnd w:id="58"/>
       <w:r>
@@ -16588,7 +16688,7 @@
         <w:bidi w:val="1"/>
         <w:rPr/>
       </w:pPr>
-      <w:bookmarkStart w:id="60" w:name="__RefHeading___Toc2483_1094282047"/>
+      <w:bookmarkStart w:id="60" w:name="__RefHeading___Toc2483_4080044552"/>
       <w:bookmarkStart w:id="61" w:name="العناقيد-السلوكية"/>
       <w:bookmarkEnd w:id="60"/>
       <w:r>
@@ -17882,7 +17982,7 @@
         <w:bidi w:val="1"/>
         <w:rPr/>
       </w:pPr>
-      <w:bookmarkStart w:id="62" w:name="__RefHeading___Toc2485_1094282047"/>
+      <w:bookmarkStart w:id="62" w:name="__RefHeading___Toc2485_4080044552"/>
       <w:bookmarkStart w:id="63" w:name="توزيع-درجة-الخطر-النسبية"/>
       <w:bookmarkEnd w:id="62"/>
       <w:r>
@@ -18790,7 +18890,7 @@
         <w:bidi w:val="1"/>
         <w:rPr/>
       </w:pPr>
-      <w:bookmarkStart w:id="64" w:name="__RefHeading___Toc2487_1094282047"/>
+      <w:bookmarkStart w:id="64" w:name="__RefHeading___Toc2487_4080044552"/>
       <w:bookmarkStart w:id="65" w:name="ملامح-السلوك"/>
       <w:bookmarkEnd w:id="64"/>
       <w:r>
@@ -19317,7 +19417,7 @@
         <w:bidi w:val="1"/>
         <w:rPr/>
       </w:pPr>
-      <w:bookmarkStart w:id="66" w:name="__RefHeading___Toc2489_1094282047"/>
+      <w:bookmarkStart w:id="66" w:name="__RefHeading___Toc2489_4080044552"/>
       <w:bookmarkStart w:id="67" w:name="تغطية-التوصيات"/>
       <w:bookmarkEnd w:id="66"/>
       <w:r>
@@ -19523,7 +19623,7 @@
         <w:bidi w:val="1"/>
         <w:rPr/>
       </w:pPr>
-      <w:bookmarkStart w:id="68" w:name="__RefHeading___Toc2491_1094282047"/>
+      <w:bookmarkStart w:id="68" w:name="__RefHeading___Toc2491_4080044552"/>
       <w:bookmarkStart w:id="69" w:name="جدول-المتعلمين"/>
       <w:bookmarkEnd w:id="68"/>
       <w:r>
@@ -21094,7 +21194,7 @@
         <w:bidi w:val="1"/>
         <w:rPr/>
       </w:pPr>
-      <w:bookmarkStart w:id="70" w:name="__RefHeading___Toc2493_1094282047"/>
+      <w:bookmarkStart w:id="70" w:name="__RefHeading___Toc2493_4080044552"/>
       <w:bookmarkStart w:id="71" w:name="ملف-المتعلم"/>
       <w:bookmarkEnd w:id="70"/>
       <w:r>
@@ -21759,7 +21859,7 @@
         <w:bidi w:val="1"/>
         <w:rPr/>
       </w:pPr>
-      <w:bookmarkStart w:id="72" w:name="__RefHeading___Toc2495_1094282047"/>
+      <w:bookmarkStart w:id="72" w:name="__RefHeading___Toc2495_4080044552"/>
       <w:bookmarkStart w:id="73" w:name="القيود-الأخلاقية-والمنهجية"/>
       <w:bookmarkEnd w:id="72"/>
       <w:r>
@@ -22210,7 +22310,7 @@
         <w:bidi w:val="1"/>
         <w:rPr/>
       </w:pPr>
-      <w:bookmarkStart w:id="74" w:name="__RefHeading___Toc2497_1094282047"/>
+      <w:bookmarkStart w:id="74" w:name="__RefHeading___Toc2497_4080044552"/>
       <w:bookmarkStart w:id="75" w:name="ماذا-أفعل-كمدرس"/>
       <w:bookmarkEnd w:id="74"/>
       <w:r>
@@ -22329,7 +22429,7 @@
         <w:bidi w:val="1"/>
         <w:rPr/>
       </w:pPr>
-      <w:bookmarkStart w:id="76" w:name="__RefHeading___Toc2499_1094282047"/>
+      <w:bookmarkStart w:id="76" w:name="__RefHeading___Toc2499_4080044552"/>
       <w:bookmarkStart w:id="77" w:name="X745443570c429d909b26e3257e881b7ff04140e"/>
       <w:bookmarkEnd w:id="76"/>
       <w:r>
@@ -22911,7 +23011,7 @@
         <w:bidi w:val="1"/>
         <w:rPr/>
       </w:pPr>
-      <w:bookmarkStart w:id="80" w:name="__RefHeading___Toc2501_1094282047"/>
+      <w:bookmarkStart w:id="80" w:name="__RefHeading___Toc2501_4080044552"/>
       <w:bookmarkStart w:id="81" w:name="الأسئلة-الشائعة"/>
       <w:bookmarkEnd w:id="80"/>
       <w:r>
@@ -24577,7 +24677,7 @@
         <w:bidi w:val="1"/>
         <w:rPr/>
       </w:pPr>
-      <w:bookmarkStart w:id="83" w:name="__RefHeading___Toc2503_1094282047"/>
+      <w:bookmarkStart w:id="83" w:name="__RefHeading___Toc2503_4080044552"/>
       <w:bookmarkStart w:id="84" w:name="الملاحق"/>
       <w:bookmarkEnd w:id="83"/>
       <w:r>
@@ -24603,7 +24703,7 @@
         <w:bidi w:val="1"/>
         <w:rPr/>
       </w:pPr>
-      <w:bookmarkStart w:id="85" w:name="__RefHeading___Toc2505_1094282047"/>
+      <w:bookmarkStart w:id="85" w:name="__RefHeading___Toc2505_4080044552"/>
       <w:bookmarkEnd w:id="85"/>
       <w:r>
         <w:rPr/>
@@ -25772,7 +25872,7 @@
         <w:bidi w:val="1"/>
         <w:rPr/>
       </w:pPr>
-      <w:bookmarkStart w:id="87" w:name="__RefHeading___Toc2507_1094282047"/>
+      <w:bookmarkStart w:id="87" w:name="__RefHeading___Toc2507_4080044552"/>
       <w:bookmarkEnd w:id="87"/>
       <w:r>
         <w:rPr/>
@@ -26890,7 +26990,7 @@
         <w:bidi w:val="1"/>
         <w:rPr/>
       </w:pPr>
-      <w:bookmarkStart w:id="88" w:name="__RefHeading___Toc2509_1094282047"/>
+      <w:bookmarkStart w:id="88" w:name="__RefHeading___Toc2509_4080044552"/>
       <w:bookmarkEnd w:id="88"/>
       <w:r>
         <w:rPr/>
@@ -29596,7 +29696,7 @@
         <w:bidi w:val="1"/>
         <w:rPr/>
       </w:pPr>
-      <w:bookmarkStart w:id="90" w:name="__RefHeading___Toc2511_1094282047"/>
+      <w:bookmarkStart w:id="90" w:name="__RefHeading___Toc2511_4080044552"/>
       <w:bookmarkEnd w:id="90"/>
       <w:r>
         <w:rPr/>

</xml_diff>